<commit_message>
update: naskah skripsi, logo GSE, panduan, proposal, referensi
</commit_message>
<xml_diff>
--- a/naskah/Naskah Skripsi - Raiya Yusuf Priatmojo - 22518244004.docx
+++ b/naskah/Naskah Skripsi - Raiya Yusuf Priatmojo - 22518244004.docx
@@ -60,7 +60,21 @@
           <w:b/>
           <w:bCs/>
         </w:rPr>
-        <w:t>NO SEBAGAI MEDIA</w:t>
+        <w:t xml:space="preserve">NO SEBAGAI MEDIA PEMBELAJARAN </w:t>
+      </w:r>
+      <w:r>
+        <w:rPr>
+          <w:b/>
+          <w:bCs/>
+        </w:rPr>
+        <w:br/>
+      </w:r>
+      <w:r>
+        <w:rPr>
+          <w:b/>
+          <w:bCs/>
+        </w:rPr>
+        <w:t>SENSOR DAN AKTUATOR</w:t>
       </w:r>
       <w:r>
         <w:rPr>
@@ -74,36 +88,14 @@
           <w:b/>
           <w:bCs/>
         </w:rPr>
-        <w:t xml:space="preserve">PEMBELAJARAN </w:t>
-      </w:r>
-      <w:r>
-        <w:rPr>
-          <w:b/>
-          <w:bCs/>
-        </w:rPr>
-        <w:br/>
-      </w:r>
-      <w:r>
-        <w:rPr>
-          <w:b/>
-          <w:bCs/>
-        </w:rPr>
-        <w:t>SENSOR DAN AKTUATOR</w:t>
-      </w:r>
-      <w:r>
-        <w:rPr>
-          <w:b/>
-          <w:bCs/>
-        </w:rPr>
-        <w:t xml:space="preserve"> </w:t>
-      </w:r>
-      <w:r>
-        <w:rPr>
-          <w:b/>
-          <w:bCs/>
-        </w:rPr>
         <w:t>DI CV GLOBAL SOLUSI EDUKASI</w:t>
       </w:r>
+    </w:p>
+    <w:p>
+      <w:pPr>
+        <w:spacing w:line="240" w:lineRule="auto"/>
+        <w:jc w:val="center"/>
+      </w:pPr>
     </w:p>
     <w:p>
       <w:pPr>
@@ -114,16 +106,6 @@
           <w:bCs/>
         </w:rPr>
       </w:pPr>
-    </w:p>
-    <w:p>
-      <w:pPr>
-        <w:spacing w:line="240" w:lineRule="auto"/>
-        <w:jc w:val="center"/>
-        <w:rPr>
-          <w:b/>
-          <w:bCs/>
-        </w:rPr>
-      </w:pPr>
       <w:r>
         <w:rPr>
           <w:b/>
@@ -135,10 +117,7 @@
     <w:p>
       <w:pPr>
         <w:spacing w:line="240" w:lineRule="auto"/>
-        <w:rPr>
-          <w:b/>
-          <w:bCs/>
-        </w:rPr>
+        <w:jc w:val="center"/>
       </w:pPr>
     </w:p>
     <w:p>
@@ -148,8 +127,6 @@
       </w:pPr>
       <w:r>
         <w:rPr>
-          <w:b/>
-          <w:bCs/>
           <w:noProof/>
         </w:rPr>
         <w:drawing>
@@ -245,18 +222,7 @@
       <w:pPr>
         <w:spacing w:line="240" w:lineRule="auto"/>
         <w:jc w:val="center"/>
-        <w:rPr>
-          <w:b/>
-          <w:bCs/>
-        </w:rPr>
-      </w:pPr>
-      <w:r>
-        <w:rPr>
-          <w:b/>
-          <w:bCs/>
-        </w:rPr>
-        <w:t>Oleh:</w:t>
-      </w:r>
+      </w:pPr>
     </w:p>
     <w:p>
       <w:pPr>
@@ -272,8 +238,54 @@
           <w:b/>
           <w:bCs/>
         </w:rPr>
+        <w:t>Oleh:</w:t>
+      </w:r>
+      <w:r>
+        <w:rPr>
+          <w:b/>
+          <w:bCs/>
+        </w:rPr>
+        <w:br/>
+      </w:r>
+      <w:r>
+        <w:rPr>
+          <w:b/>
+          <w:bCs/>
+        </w:rPr>
         <w:t>Raiya Yusuf Priatmojo</w:t>
       </w:r>
+      <w:r>
+        <w:rPr>
+          <w:b/>
+          <w:bCs/>
+        </w:rPr>
+        <w:br/>
+      </w:r>
+      <w:r>
+        <w:rPr>
+          <w:b/>
+          <w:bCs/>
+        </w:rPr>
+        <w:t>NIM 22518244004</w:t>
+      </w:r>
+    </w:p>
+    <w:p>
+      <w:pPr>
+        <w:spacing w:line="240" w:lineRule="auto"/>
+        <w:jc w:val="center"/>
+      </w:pPr>
+    </w:p>
+    <w:p>
+      <w:pPr>
+        <w:spacing w:line="240" w:lineRule="auto"/>
+        <w:jc w:val="center"/>
+      </w:pPr>
+    </w:p>
+    <w:p>
+      <w:pPr>
+        <w:spacing w:line="240" w:lineRule="auto"/>
+        <w:jc w:val="center"/>
+      </w:pPr>
     </w:p>
     <w:p>
       <w:pPr>
@@ -289,47 +301,15 @@
           <w:b/>
           <w:bCs/>
         </w:rPr>
-        <w:t>NIM 22518244004</w:t>
-      </w:r>
-    </w:p>
-    <w:p>
-      <w:pPr>
-        <w:spacing w:line="240" w:lineRule="auto"/>
-        <w:jc w:val="center"/>
-      </w:pPr>
-    </w:p>
-    <w:p>
-      <w:pPr>
-        <w:spacing w:line="240" w:lineRule="auto"/>
-        <w:jc w:val="center"/>
-      </w:pPr>
-    </w:p>
-    <w:p>
-      <w:pPr>
-        <w:spacing w:line="240" w:lineRule="auto"/>
-        <w:jc w:val="center"/>
+        <w:t>FAKULTAS TEKNIK</w:t>
+      </w:r>
+      <w:r>
         <w:rPr>
           <w:b/>
           <w:bCs/>
         </w:rPr>
-      </w:pPr>
-      <w:r>
-        <w:rPr>
-          <w:b/>
-          <w:bCs/>
-        </w:rPr>
-        <w:t>FAKULTAS TEKNIK</w:t>
-      </w:r>
-    </w:p>
-    <w:p>
-      <w:pPr>
-        <w:spacing w:line="240" w:lineRule="auto"/>
-        <w:jc w:val="center"/>
-        <w:rPr>
-          <w:b/>
-          <w:bCs/>
-        </w:rPr>
-      </w:pPr>
+        <w:br/>
+      </w:r>
       <w:r>
         <w:rPr>
           <w:b/>
@@ -337,16 +317,13 @@
         </w:rPr>
         <w:t>UNIVERSITAS NEGERI YOGYAKARTA</w:t>
       </w:r>
-    </w:p>
-    <w:p>
-      <w:pPr>
-        <w:spacing w:line="240" w:lineRule="auto"/>
-        <w:jc w:val="center"/>
+      <w:r>
         <w:rPr>
           <w:b/>
           <w:bCs/>
         </w:rPr>
-      </w:pPr>
+        <w:br/>
+      </w:r>
       <w:r>
         <w:rPr>
           <w:b/>
@@ -354,9 +331,6 @@
         </w:rPr>
         <w:t>2026</w:t>
       </w:r>
-      <w:r>
-        <w:br w:type="page"/>
-      </w:r>
     </w:p>
     <w:p>
       <w:pPr>
@@ -374,7 +348,6 @@
     <w:p>
       <w:pPr>
         <w:pStyle w:val="Heading2"/>
-        <w:spacing w:line="480" w:lineRule="auto"/>
       </w:pPr>
       <w:r>
         <w:t>Latar Belakang</w:t>
@@ -382,9 +355,7 @@
     </w:p>
     <w:p>
       <w:pPr>
-        <w:spacing w:line="480" w:lineRule="auto"/>
-        <w:ind w:left="720" w:firstLine="720"/>
-        <w:jc w:val="both"/>
+        <w:ind w:firstLine="720"/>
       </w:pPr>
       <w:r>
         <w:t>Perkembangan teknologi di bidang otomasi dan sensor terus meningkat seiring dengan tuntutan Revolusi Industri 4.0. Revolusi Industri 4.0 membawa perubahan fundamental dalam berbagai sektor kehidupan, termasuk dunia industri dan pendidikan. Paradigma produksi modern telah bergeser dari sistem otomasi yang terisolasi menuju ekosistem yang saling terhubung secara digital (Galar &amp; Kumar, 2024). Perubahan ini menuntut adanya sumber daya manusia yang tidak hanya menguasai teori, tetapi juga memiliki keterampilan praktis yang relevan dengan kebutuhan industri. Kebutuhan tenaga kerja yang kompeten di bidang ini mendorong lembaga pendidikan, baik formal maupun non-formal, untuk menyiapkan media pembelajaran yang praktis dan relevan. Media pembelajaran yang tepat tidak hanya membantu peserta didik memahami konsep, tetapi juga meningkatkan motivasi dan keterlibatan mereka dalam proses belajar (Arsyad, 2013).</w:t>
@@ -392,9 +363,7 @@
     </w:p>
     <w:p>
       <w:pPr>
-        <w:spacing w:line="480" w:lineRule="auto"/>
-        <w:ind w:left="720" w:firstLine="720"/>
-        <w:jc w:val="both"/>
+        <w:ind w:firstLine="720"/>
       </w:pPr>
       <w:r>
         <w:t xml:space="preserve">Pendidikan vokasi dan lembaga pelatihan teknologi seperti CV Global Solusi Edukasi (GSE) berperan penting dalam menjembatani kesenjangan antara teori dan praktik di lapangan (Miranda et al., 2022). Pendidikan vokasi memiliki karakteristik yang unik karena berorientasi pada pembentukan kompetensi kerja, penguasaan keterampilan teknis, dan kesiapan lulusan </w:t>
@@ -406,9 +375,7 @@
     </w:p>
     <w:p>
       <w:pPr>
-        <w:spacing w:line="480" w:lineRule="auto"/>
-        <w:ind w:left="720" w:firstLine="720"/>
-        <w:jc w:val="both"/>
+        <w:ind w:firstLine="720"/>
       </w:pPr>
       <w:r>
         <w:t>GSE adalah lembaga pelatihan teknologi yang bergerak di bidang robotika, Internet of Things (IoT), coding, dan visual design. GSE melayani siswa jenjang menengah (SMP-SMA) melalui berbagai program kelas, seperti Robotik uKit, Coding Scratch, Coding Python, Robot Inovasi, dan IoT. Setiap kelas dirancang untuk membekali siswa dengan keterampilan teknis yang aplikatif, terutama di bidang sensor dan sistem kendali. Kelas Robot Inovasi, misalnya, menjadi fondasi awal bagi siswa untuk mempelajari sensor-sensor dasar sebelum melanjutkan ke kelas IoT yang lebih kompleks. Kelas ini tergolong baru di GSE sehingga masih dalam tahap pengembangan, baik dari segi materi maupun media pembelajaran yang digunakan. Materi yang diajarkan di kelas Robot Inovasi meliputi pengenalan sensor-sensor dasar seperti sensor cahaya (LDR), sensor jarak (ultrasonik), sensor suhu (DHT11), sensor gerak (PIR), serta aktuator seperti LED, buzzer, LCD, dan servo.</w:t>
@@ -416,23 +383,19 @@
     </w:p>
     <w:p>
       <w:pPr>
-        <w:spacing w:line="480" w:lineRule="auto"/>
-        <w:ind w:left="720"/>
-        <w:jc w:val="both"/>
-      </w:pPr>
-      <w:r>
-        <w:t xml:space="preserve">Berdasarkan pengamatan di lapangan, pelaksanaan praktikum di kelas Robot Inovasi masih menghadapi beberapa kendala. Durasi kelas yang terbatas, yaitu </w:t>
+        <w:ind w:firstLine="720"/>
+      </w:pPr>
+      <w:r>
+        <w:t xml:space="preserve">Berdasarkan pengamatan di lapangan, pelaksanaan praktikum di kelas Robot Inovasi masih menghadapi beberapa kendala. Durasi kelas yang </w:t>
       </w:r>
       <w:r>
         <w:lastRenderedPageBreak/>
-        <w:t>60-90 menit per pertemuan, harus digunakan untuk persiapan, penyampaian materi, dan praktik. Persiapan praktikum memakan waktu sekitar 15-20 menit karena mentor harus mengambil komponen satu per satu dari rak penyimpanan. Kondisi ini mengurangi waktu efektif siswa untuk bereksplorasi dan memahami konsep sensor secara mendalam. Selain itu, penyusunan komponen yang tidak rapi berpotensi menyebabkan siswa salah dalam merangkai rangkaian. Kesalahan dalam merangkai tidak hanya merugikan siswa secara individu, tetapi juga dapat merusak komponen yang digunakan (Wicaksono, 2016).</w:t>
-      </w:r>
-    </w:p>
-    <w:p>
-      <w:pPr>
-        <w:spacing w:line="480" w:lineRule="auto"/>
-        <w:ind w:left="720" w:firstLine="720"/>
-        <w:jc w:val="both"/>
+        <w:t>terbatas, yaitu 60-90 menit per pertemuan, harus digunakan untuk persiapan, penyampaian materi, dan praktik. Persiapan praktikum memakan waktu sekitar 15-20 menit karena mentor harus mengambil komponen satu per satu dari rak penyimpanan. Kondisi ini mengurangi waktu efektif siswa untuk bereksplorasi dan memahami konsep sensor secara mendalam. Selain itu, penyusunan komponen yang tidak rapi berpotensi menyebabkan siswa salah dalam merangkai rangkaian. Kesalahan dalam merangkai tidak hanya merugikan siswa secara individu, tetapi juga dapat merusak komponen yang digunakan (Wicaksono, 2016).</w:t>
+      </w:r>
+    </w:p>
+    <w:p>
+      <w:pPr>
+        <w:ind w:firstLine="720"/>
       </w:pPr>
       <w:r>
         <w:t xml:space="preserve">Media pembelajaran yang tersedia saat ini masih berupa komponen terpisah dan dalam pelaksanaan praktikum siswa harus merangkai terlebih dahulu komponen yang akan digunakan. Kekurangan dari media yang sudah ada yaitu masih banyak terjadi kesalahan dalam merangkai sensor yang akan digunakan praktikum. Kesalahan dalam merangkai dapat merusak komponen praktikum, sehingga dapat menyebabkan pemborosan dalam penggunaan komponen praktikum (Wicaksono, 2016). Selain itu, perlu banyak waktu untuk merangkai komponen sebelum melaksanakan pengamatan praktikum. Apabila terjadi kesalahan dalam merangkainya, akan lebih banyak waktu yang dibutuhkan untuk mencari kesalahan dan merangkai kembali. Pengulangan perakitan mengakibatkan peserta didik cenderung mengalami kebosanan, hal </w:t>
@@ -444,9 +407,7 @@
     </w:p>
     <w:p>
       <w:pPr>
-        <w:spacing w:line="480" w:lineRule="auto"/>
-        <w:ind w:left="720" w:firstLine="720"/>
-        <w:jc w:val="both"/>
+        <w:ind w:firstLine="720"/>
       </w:pPr>
       <w:r>
         <w:t>Idealnya, praktikum di kelas Robot Inovasi dapat berjalan efisien, dengan persiapan yang singkat sehingga siswa dapat langsung fokus pada kegiatan belajar. Namun, kondisi saat ini masih menunjukkan adanya kesenjangan antara harapan dan kenyataan. Belum tersedianya media pembelajaran berupa trainer kit yang praktis dan siap pakai menyebabkan proses praktikum kurang optimal. Diperlukan solusi berupa media pembelajaran yang dapat mempercepat persiapan, mempermudah siswa dalam merangkai, serta meningkatkan efektivitas pembelajaran. Media pembelajaran praktikum berupa trainer kit merupakan salah satu potensi yang dapat digunakan peserta didik untuk mengenal lebih dalam tentang teknologi kontrol dan pemrograman sensor (Nur &amp; Suprianto, 2016).</w:t>
@@ -454,23 +415,19 @@
     </w:p>
     <w:p>
       <w:pPr>
-        <w:spacing w:line="480" w:lineRule="auto"/>
-        <w:ind w:left="720" w:firstLine="720"/>
-        <w:jc w:val="both"/>
-      </w:pPr>
-      <w:r>
-        <w:t xml:space="preserve">Salah satu solusi yang ditawarkan adalah pengembangan trainer kit multi sensor berbasis Arduino Uno. Trainer kit ini dirancang dengan konsep plug-and-play, sehingga siswa dapat langsung menghubungkan sensor tanpa harus merangkai dari awal. Media ini dilengkapi dengan modul ajar dan labsheet sebagai panduan praktikum. Dengan desain yang praktis, trainer kit ini diharapkan dapat mengatasi kendala persiapan, mengurangi risiko kesalahan perangkaian, dan meningkatkan pemahaman siswa terhadap konsep sensor dan aktuator (Usman &amp; Pratiwi, 2022). Penelitian sebelumnya </w:t>
+        <w:ind w:firstLine="720"/>
+      </w:pPr>
+      <w:r>
+        <w:t xml:space="preserve">Salah satu solusi yang ditawarkan adalah pengembangan trainer kit multi sensor berbasis Arduino Uno. Trainer kit ini dirancang dengan konsep plug-and-play, sehingga siswa dapat langsung menghubungkan sensor tanpa harus merangkai dari awal. Media ini dilengkapi dengan modul dan labsheet sebagai panduan praktikum. Dengan desain yang praktis, trainer kit ini diharapkan dapat mengatasi kendala persiapan, mengurangi risiko kesalahan perangkaian, dan meningkatkan pemahaman siswa terhadap konsep sensor dan aktuator (Usman &amp; Pratiwi, 2022). Penelitian sebelumnya menunjukkan </w:t>
       </w:r>
       <w:r>
         <w:lastRenderedPageBreak/>
-        <w:t>menunjukkan bahwa penggunaan trainer kit dalam pembelajaran praktikum mampu meningkatkan pemahaman, motivasi, serta keterampilan praktikum peserta didik (AlFaris et al., 2026).</w:t>
-      </w:r>
-    </w:p>
-    <w:p>
-      <w:pPr>
-        <w:spacing w:line="480" w:lineRule="auto"/>
-        <w:ind w:left="720" w:firstLine="720"/>
-        <w:jc w:val="both"/>
+        <w:t>bahwa penggunaan trainer kit dalam pembelajaran praktikum mampu meningkatkan pemahaman, motivasi, serta keterampilan praktikum peserta didik (AlFaris et al., 2026).</w:t>
+      </w:r>
+    </w:p>
+    <w:p>
+      <w:pPr>
+        <w:ind w:firstLine="720"/>
       </w:pPr>
       <w:r>
         <w:t>Arduino Uno dipilih sebagai mikrokontroler dalam pengembangan trainer kit ini karena beberapa alasan. Pertama, Arduino Uno merupakan mikrokontroler yang ramah bagi pemula, mudah dipahami, dan banyak digunakan dalam pembelajaran dasar elektronika dan pemrograman (Usman &amp; Pratiwi, 2022). Kedua, Arduino Uno memiliki komunitas pengguna yang besar sehingga ketersediaan referensi dan library pendukung sangat melimpah. Ketiga, Arduino Uno memiliki harga yang terjangkau dan mudah didapatkan di pasaran. Keempat, Arduino Uno memiliki jumlah pin I/O yang cukup untuk mengakomodasi berbagai sensor dan aktuator yang akan digunakan dalam trainer kit ini. Dengan pertimbangan-pertimbangan tersebut, Arduino Uno dinilai sesuai sebagai kontroler utama dalam pengembangan trainer kit multi sensor untuk pembelajaran sensor dan aktuator.</w:t>
@@ -478,27 +435,93 @@
     </w:p>
     <w:p>
       <w:pPr>
-        <w:spacing w:line="480" w:lineRule="auto"/>
-        <w:ind w:left="720" w:firstLine="720"/>
-        <w:jc w:val="both"/>
-      </w:pPr>
-      <w:r>
-        <w:t>Berdasarkan permasalahan yang telah diuraikan, penelitian ini mengangkat judul "Pengembangan Trainer Kit Multi Sensor Berbasis Arduino Uno sebagai Media Pembelajaran Sensor dan Aktuator untuk Peserta Didik Jenjang Menengah di CV Global Solusi Edukasi".</w:t>
+        <w:ind w:firstLine="720"/>
+      </w:pPr>
+      <w:r>
+        <w:t>Berdasarkan permasalahan yang telah diuraikan, yaitu keterbatasan media pembelajaran yang praktis dan siap pakai di kelas Robot Inovasi CV Global Solusi Edukasipenelitian ini mengangkat judul "Pengembangan Trainer Kit Multi Sensor Berbasis Arduino Uno sebagai Media Pembelajaran Sensor dan Aktuator untuk Peserta Didik Jenjang Menengah di CV Global Solusi Edukasi".</w:t>
       </w:r>
     </w:p>
     <w:p>
       <w:pPr>
         <w:pStyle w:val="Heading2"/>
-        <w:spacing w:line="480" w:lineRule="auto"/>
-      </w:pPr>
-      <w:r>
+      </w:pPr>
+      <w:r>
+        <w:lastRenderedPageBreak/>
         <w:t>Identifikasi Masalah</w:t>
       </w:r>
     </w:p>
     <w:p>
       <w:pPr>
+        <w:ind w:firstLine="720"/>
+      </w:pPr>
+      <w:r>
+        <w:t>Berdasarkan latar belakang masalah yang telah diuraikan, dapat diidentifikasi beberapa permasalahan sebagai berikut:</w:t>
+      </w:r>
+    </w:p>
+    <w:p>
+      <w:pPr>
+        <w:pStyle w:val="ListParagraph"/>
+        <w:numPr>
+          <w:ilvl w:val="0"/>
+          <w:numId w:val="27"/>
+        </w:numPr>
+      </w:pPr>
+      <w:r>
+        <w:t>Media pembelajaran sensor dan aktuator yang tersedia di kelas Robot Inovasi CV Global Solusi Edukasi masih berupa komponen terpisah, sehingga siswa harus memasang komponen satu per satu ke breadboard sebelum melakukan wiring rangkaian praktikum.</w:t>
+      </w:r>
+    </w:p>
+    <w:p>
+      <w:pPr>
+        <w:pStyle w:val="ListParagraph"/>
+        <w:numPr>
+          <w:ilvl w:val="0"/>
+          <w:numId w:val="27"/>
+        </w:numPr>
+      </w:pPr>
+      <w:r>
+        <w:t>Berdasarkan pengamatan yang dilakukan peneliti sebagai mentor di kelas Robot Inovasi, persiapan praktikum memakan waktu sekitar 15-20 menit dari total durasi kelas 60-90 menit, sehingga mengurangi waktu efektif siswa untuk bereksplorasi dan memahami konsep sensor secara mendalam.</w:t>
+      </w:r>
+    </w:p>
+    <w:p>
+      <w:pPr>
+        <w:pStyle w:val="ListParagraph"/>
+        <w:numPr>
+          <w:ilvl w:val="0"/>
+          <w:numId w:val="27"/>
+        </w:numPr>
+      </w:pPr>
+      <w:r>
+        <w:t>Penyusunan komponen yang tidak rapi berpotensi menyebabkan siswa salah dalam merangkai rangkaian, yang tidak hanya merugikan siswa secara individu tetapi juga dapat merusak komponen yang digunakan.</w:t>
+      </w:r>
+    </w:p>
+    <w:p>
+      <w:pPr>
+        <w:pStyle w:val="ListParagraph"/>
+        <w:numPr>
+          <w:ilvl w:val="0"/>
+          <w:numId w:val="27"/>
+        </w:numPr>
+      </w:pPr>
+      <w:r>
+        <w:t>Belum tersedianya trainer kit multi sensor berbasis Arduino Uno yang praktis dan siap pakai, di mana komponen sensor dan aktuator telah terpasang permanen pada board sehingga siswa hanya perlu melakukan wiring tanpa harus memasang komponen satu per satu.</w:t>
+      </w:r>
+    </w:p>
+    <w:p>
+      <w:pPr>
+        <w:pStyle w:val="ListParagraph"/>
+        <w:numPr>
+          <w:ilvl w:val="0"/>
+          <w:numId w:val="27"/>
+        </w:numPr>
+      </w:pPr>
+      <w:r>
+        <w:lastRenderedPageBreak/>
+        <w:t>Belum tersedianya modul dan labsheet yang terstruktur sebagai panduan praktikum sensor dan aktuator di kelas Robot Inovasi CV Global Solusi Edukasi.</w:t>
+      </w:r>
+    </w:p>
+    <w:p>
+      <w:pPr>
         <w:pStyle w:val="Heading2"/>
-        <w:spacing w:line="480" w:lineRule="auto"/>
       </w:pPr>
       <w:r>
         <w:t>Batasan Masalah</w:t>
@@ -506,44 +529,1028 @@
     </w:p>
     <w:p>
       <w:pPr>
+        <w:ind w:firstLine="720"/>
+      </w:pPr>
+      <w:r>
+        <w:t xml:space="preserve">Berdasarkan identifikasi masalah yang telah diuraikan, penelitian ini dibatasi pada pengembangan media pembelajaran berupa trainer kit multi sensor berbasis Arduino Uno untuk kelas Robot Inovasi di CV Global Solusi Edukasi. Trainer kit ini dirancang dengan konsep plug-and-play, yaitu komponen sensor dan aktuator telah terpasang permanen pada board sehingga siswa hanya perlu melakukan wiring rangkaian praktikum tanpa harus memasang komponen satu per satu. Sensor yang digunakan meliputi LDR, Push Button, Ultrasonik </w:t>
+      </w:r>
+      <w:r>
+        <w:t>(</w:t>
+      </w:r>
+      <w:r>
+        <w:t>HC-SR04</w:t>
+      </w:r>
+      <w:r>
+        <w:t>)</w:t>
+      </w:r>
+      <w:r>
+        <w:t>, IR Obstacle, DHT22, PIR</w:t>
+      </w:r>
+      <w:r>
+        <w:t xml:space="preserve"> (HC-SR501)</w:t>
+      </w:r>
+      <w:r>
+        <w:t xml:space="preserve">, MQ-6, Rain Drop, Flame </w:t>
+      </w:r>
+      <w:r>
+        <w:t>Detector (KY-026)</w:t>
+      </w:r>
+      <w:r>
+        <w:t>, dan RFID</w:t>
+      </w:r>
+      <w:r>
+        <w:t xml:space="preserve"> (</w:t>
+      </w:r>
+      <w:r>
+        <w:t>RC522</w:t>
+      </w:r>
+      <w:r>
+        <w:t>)</w:t>
+      </w:r>
+      <w:r>
+        <w:t>. Adapun output yang digunakan meliputi LED, RGB LED, Buzzer, LCD</w:t>
+      </w:r>
+      <w:r>
+        <w:t xml:space="preserve"> </w:t>
+      </w:r>
+      <w:r>
+        <w:t>I2C</w:t>
+      </w:r>
+      <w:r>
+        <w:t xml:space="preserve"> 16x2</w:t>
+      </w:r>
+      <w:r>
+        <w:t>, dan Servo. Trainer kit ini dilengkapi dengan modul dan labsheet sebagai panduan praktikum. Validasi produk dilakukan oleh ahli media dan ahli materi, sedangkan uji coba skala terbatas dilakukan kepada peserta didik jenjang menengah (SMP-SMA) di CV Global Solusi Edukasi untuk mengetahui tingkat kepraktisannya.</w:t>
+      </w:r>
+    </w:p>
+    <w:p>
+      <w:pPr>
+        <w:ind w:firstLine="720"/>
+      </w:pPr>
+      <w:r>
+        <w:t xml:space="preserve">Media pembelajaran ini berfungsi untuk merepresentasikan cara kerja dan karakteristik sensor serta aktuator pada kelas Robot Inovasi CV Global </w:t>
+      </w:r>
+      <w:r>
+        <w:lastRenderedPageBreak/>
+        <w:t>Solusi Edukasi. Adapun tujuan utama penelitian ini adalah mengevaluasi unjuk fungsionalitas dan tingkat kelayakan produk sebelum diimplementasikan kepada peserta didik.</w:t>
+      </w:r>
+    </w:p>
+    <w:p>
+      <w:pPr>
         <w:pStyle w:val="Heading2"/>
-        <w:spacing w:line="480" w:lineRule="auto"/>
+      </w:pPr>
+      <w:r>
+        <w:t>Rumusan Masalah</w:t>
+      </w:r>
+    </w:p>
+    <w:p>
+      <w:pPr>
+        <w:ind w:firstLine="720"/>
+      </w:pPr>
+      <w:r>
+        <w:t>Merujuk pada latar belakang dan batasan masalah yang telah diuraikan, rumusan masalah dalam penelitian ini adalah sebagai berikut:</w:t>
+      </w:r>
+    </w:p>
+    <w:p>
+      <w:pPr>
+        <w:pStyle w:val="ListParagraph"/>
+        <w:numPr>
+          <w:ilvl w:val="0"/>
+          <w:numId w:val="28"/>
+        </w:numPr>
+      </w:pPr>
+      <w:r>
+        <w:t>Bagaimana rancang bangun trainer kit multi sensor berbasis Arduino Uno sebagai media pembelajaran sensor dan aktuator di kelas Robot Inovasi CV Global Solusi Edukasi?</w:t>
+      </w:r>
+    </w:p>
+    <w:p>
+      <w:pPr>
+        <w:pStyle w:val="ListParagraph"/>
+        <w:numPr>
+          <w:ilvl w:val="0"/>
+          <w:numId w:val="28"/>
+        </w:numPr>
+      </w:pPr>
+      <w:r>
+        <w:t>Bagaimana tingkat kelayakan trainer kit multi sensor berbasis Arduino Uno menurut penilaian ahli media dan ahli materi?</w:t>
+      </w:r>
+    </w:p>
+    <w:p>
+      <w:pPr>
+        <w:pStyle w:val="ListParagraph"/>
+        <w:numPr>
+          <w:ilvl w:val="0"/>
+          <w:numId w:val="28"/>
+        </w:numPr>
+      </w:pPr>
+      <w:r>
+        <w:t>Bagaimana tingkat kepraktisan trainer kit multi sensor berbasis Arduino Uno berdasarkan respons peserta didik jenjang menengah (SMP-SMA) di CV Global Solusi Edukasi?</w:t>
+      </w:r>
+    </w:p>
+    <w:p>
+      <w:pPr>
+        <w:pStyle w:val="Heading2"/>
+      </w:pPr>
+      <w:r>
+        <w:t>Tujuan Penelitian</w:t>
+      </w:r>
+    </w:p>
+    <w:p>
+      <w:pPr>
+        <w:ind w:firstLine="720"/>
+      </w:pPr>
+      <w:r>
+        <w:t>Sejalan dengan rumusan masalah yang telah dipaparkan, tujuan penelitian ini adalah sebagai berikut:</w:t>
+      </w:r>
+    </w:p>
+    <w:p>
+      <w:pPr>
+        <w:pStyle w:val="ListParagraph"/>
+        <w:numPr>
+          <w:ilvl w:val="0"/>
+          <w:numId w:val="29"/>
+        </w:numPr>
+      </w:pPr>
+      <w:r>
+        <w:t>Menghasilkan trainer kit multi sensor berbasis Arduino Uno sebagai media pembelajaran sensor dan aktuator di kelas Robot Inovasi CV Global Solusi Edukasi.</w:t>
+      </w:r>
+    </w:p>
+    <w:p>
+      <w:pPr>
+        <w:pStyle w:val="ListParagraph"/>
+        <w:numPr>
+          <w:ilvl w:val="0"/>
+          <w:numId w:val="29"/>
+        </w:numPr>
       </w:pPr>
       <w:r>
         <w:lastRenderedPageBreak/>
-        <w:t>Rumusan Masalah</w:t>
+        <w:t>Mengetahui tingkat kelayakan trainer kit multi sensor berbasis Arduino Uno menurut penilaian ahli media dan ahli materi.</w:t>
+      </w:r>
+    </w:p>
+    <w:p>
+      <w:pPr>
+        <w:pStyle w:val="ListParagraph"/>
+        <w:numPr>
+          <w:ilvl w:val="0"/>
+          <w:numId w:val="29"/>
+        </w:numPr>
+      </w:pPr>
+      <w:r>
+        <w:t>Mengetahui tingkat kepraktisan trainer kit multi sensor berbasis Arduino Uno berdasarkan respons peserta didik jenjang menengah (SMP-SMA) di CV Global Solusi Edukasi.</w:t>
       </w:r>
     </w:p>
     <w:p>
       <w:pPr>
         <w:pStyle w:val="Heading2"/>
-        <w:spacing w:line="480" w:lineRule="auto"/>
-      </w:pPr>
-      <w:r>
-        <w:t>Tujuan Penelitian</w:t>
+      </w:pPr>
+      <w:r>
+        <w:t>Manfaat Penelitian</w:t>
+      </w:r>
+    </w:p>
+    <w:p>
+      <w:pPr>
+        <w:ind w:firstLine="720"/>
+      </w:pPr>
+      <w:r>
+        <w:t>Hasil penelitian ini diharapkan dapat memberikan manfaat bagi berbagai pihak, yaitu:</w:t>
+      </w:r>
+    </w:p>
+    <w:p>
+      <w:pPr>
+        <w:pStyle w:val="ListParagraph"/>
+        <w:numPr>
+          <w:ilvl w:val="0"/>
+          <w:numId w:val="30"/>
+        </w:numPr>
+      </w:pPr>
+      <w:r>
+        <w:t>Bagi CV Global Solusi Edukasi</w:t>
+      </w:r>
+    </w:p>
+    <w:p>
+      <w:pPr>
+        <w:pStyle w:val="ListParagraph"/>
+        <w:ind w:left="1080"/>
+      </w:pPr>
+      <w:r>
+        <w:t>Penelitian ini diharapkan dapat menyediakan media pembelajaran berupa trainer kit multi sensor berbasis Arduino Uno yang praktis dan siap pakai untuk kelas Robot Inovasi. Selain itu, produk ini dapat menjadi aset media pembelajaran yang dapat digunakan secara berkelanjutan, sehingga kualitas pembelajaran sensor dan aktuator di GSE dapat meningkat.</w:t>
+      </w:r>
+    </w:p>
+    <w:p>
+      <w:pPr>
+        <w:pStyle w:val="ListParagraph"/>
+        <w:numPr>
+          <w:ilvl w:val="0"/>
+          <w:numId w:val="30"/>
+        </w:numPr>
+      </w:pPr>
+      <w:r>
+        <w:t>Bagi Peserta Didik</w:t>
+      </w:r>
+    </w:p>
+    <w:p>
+      <w:pPr>
+        <w:pStyle w:val="ListParagraph"/>
+        <w:ind w:left="1080"/>
+      </w:pPr>
+      <w:r>
+        <w:t>Membantu peserta didik dalam memahami konsep sensor dan aktuator secara lebih terstruktur melalui kegiatan praktikum yang efisien. Penggunaan trainer kit ini juga memberikan pengalaman belajar yang lebih aplikatif dan menyenangkan, sehingga dapat meningkatkan motivasi dan pemahaman peserta didik terhadap materi sensor dan aktuator.</w:t>
+      </w:r>
+    </w:p>
+    <w:p>
+      <w:pPr>
+        <w:pStyle w:val="ListParagraph"/>
+        <w:numPr>
+          <w:ilvl w:val="0"/>
+          <w:numId w:val="30"/>
+        </w:numPr>
+      </w:pPr>
+      <w:r>
+        <w:t>Bagi Peneliti</w:t>
+      </w:r>
+    </w:p>
+    <w:p>
+      <w:pPr>
+        <w:pStyle w:val="ListParagraph"/>
+        <w:ind w:left="1080"/>
+      </w:pPr>
+      <w:r>
+        <w:lastRenderedPageBreak/>
+        <w:t>Menjadi sarana bagi peneliti untuk menerapkan ilmu yang telah diperoleh selama perkuliahan, khususnya dalam bidang pengembangan media pembelajaran berbasis mikrokontroler. Penelitian ini juga memberikan pengalaman langsung dalam merancang, membuat, dan menguji kelayakan produk media pembelajaran.</w:t>
+      </w:r>
+    </w:p>
+    <w:p>
+      <w:pPr>
+        <w:pStyle w:val="ListParagraph"/>
+        <w:numPr>
+          <w:ilvl w:val="0"/>
+          <w:numId w:val="30"/>
+        </w:numPr>
+      </w:pPr>
+      <w:r>
+        <w:t>Bagi Program Studi Pendidikan Teknik Mekatronika</w:t>
+      </w:r>
+    </w:p>
+    <w:p>
+      <w:pPr>
+        <w:pStyle w:val="ListParagraph"/>
+        <w:ind w:left="1080"/>
+      </w:pPr>
+      <w:r>
+        <w:t>Diharapkan dapat memperkaya literatur akademis dan menjadi referensi bagi mahasiswa maupun peneliti selanjutnya yang tertarik untuk mengembangkan media pembelajaran sejenis, khususnya pada bidang sensor dan aktuator.</w:t>
       </w:r>
     </w:p>
     <w:p>
       <w:pPr>
         <w:pStyle w:val="Heading2"/>
-        <w:spacing w:line="480" w:lineRule="auto"/>
-      </w:pPr>
-      <w:r>
-        <w:t>Manfaat Penelitian</w:t>
-      </w:r>
-    </w:p>
-    <w:p>
-      <w:pPr>
-        <w:pStyle w:val="Heading2"/>
-        <w:spacing w:line="480" w:lineRule="auto"/>
-      </w:pPr>
-      <w:r>
-        <w:t>Asumsi Pengembangan</w:t>
-      </w:r>
-    </w:p>
-    <w:p>
-      <w:pPr>
-        <w:spacing w:line="480" w:lineRule="auto"/>
+      </w:pPr>
+      <w:r>
+        <w:t>Spesifikasi Produk</w:t>
+      </w:r>
+    </w:p>
+    <w:p>
+      <w:pPr>
+        <w:ind w:firstLine="720"/>
+      </w:pPr>
+      <w:r>
+        <w:t>Produk yang dikembangkan dalam penelitian ini berupa trainer kit multi sensor berbasis Arduino Uno yang dilengkapi dengan modul</w:t>
+      </w:r>
+      <w:r>
+        <w:t xml:space="preserve"> </w:t>
+      </w:r>
+      <w:r>
+        <w:t>dan labsheet sebagai panduan praktikum. Spesifikasi produk trainer kit multi sensor dapat dilihat pada tabel berikut:</w:t>
+      </w:r>
+    </w:p>
+    <w:tbl>
+      <w:tblPr>
+        <w:tblStyle w:val="TableGrid"/>
+        <w:tblW w:w="0" w:type="auto"/>
+        <w:tblInd w:w="720" w:type="dxa"/>
+        <w:tblLook w:val="04A0" w:firstRow="1" w:lastRow="0" w:firstColumn="1" w:lastColumn="0" w:noHBand="0" w:noVBand="1"/>
+      </w:tblPr>
+      <w:tblGrid>
+        <w:gridCol w:w="522"/>
+        <w:gridCol w:w="3402"/>
+        <w:gridCol w:w="3843"/>
+      </w:tblGrid>
+      <w:tr>
+        <w:tc>
+          <w:tcPr>
+            <w:tcW w:w="522" w:type="dxa"/>
+            <w:shd w:val="clear" w:color="auto" w:fill="C1E4F5" w:themeFill="accent1" w:themeFillTint="33"/>
+            <w:vAlign w:val="center"/>
+          </w:tcPr>
+          <w:p>
+            <w:pPr>
+              <w:spacing w:line="276" w:lineRule="auto"/>
+              <w:ind w:left="0"/>
+              <w:jc w:val="center"/>
+              <w:rPr>
+                <w:b/>
+                <w:bCs/>
+              </w:rPr>
+            </w:pPr>
+            <w:r>
+              <w:rPr>
+                <w:b/>
+                <w:bCs/>
+              </w:rPr>
+              <w:t>No</w:t>
+            </w:r>
+          </w:p>
+        </w:tc>
+        <w:tc>
+          <w:tcPr>
+            <w:tcW w:w="3402" w:type="dxa"/>
+            <w:shd w:val="clear" w:color="auto" w:fill="C1E4F5" w:themeFill="accent1" w:themeFillTint="33"/>
+            <w:vAlign w:val="center"/>
+          </w:tcPr>
+          <w:p>
+            <w:pPr>
+              <w:spacing w:line="276" w:lineRule="auto"/>
+              <w:ind w:left="0"/>
+              <w:jc w:val="center"/>
+              <w:rPr>
+                <w:b/>
+                <w:bCs/>
+              </w:rPr>
+            </w:pPr>
+            <w:r>
+              <w:rPr>
+                <w:b/>
+                <w:bCs/>
+              </w:rPr>
+              <w:t>Kriteria</w:t>
+            </w:r>
+          </w:p>
+        </w:tc>
+        <w:tc>
+          <w:tcPr>
+            <w:tcW w:w="3843" w:type="dxa"/>
+            <w:shd w:val="clear" w:color="auto" w:fill="C1E4F5" w:themeFill="accent1" w:themeFillTint="33"/>
+            <w:vAlign w:val="center"/>
+          </w:tcPr>
+          <w:p>
+            <w:pPr>
+              <w:spacing w:line="276" w:lineRule="auto"/>
+              <w:ind w:left="0"/>
+              <w:jc w:val="center"/>
+              <w:rPr>
+                <w:b/>
+                <w:bCs/>
+              </w:rPr>
+            </w:pPr>
+            <w:r>
+              <w:rPr>
+                <w:b/>
+                <w:bCs/>
+              </w:rPr>
+              <w:t>Keterangan</w:t>
+            </w:r>
+          </w:p>
+        </w:tc>
+      </w:tr>
+      <w:tr>
+        <w:trPr>
+          <w:trHeight w:val="20"/>
+        </w:trPr>
+        <w:tc>
+          <w:tcPr>
+            <w:tcW w:w="522" w:type="dxa"/>
+            <w:vAlign w:val="center"/>
+          </w:tcPr>
+          <w:p>
+            <w:pPr>
+              <w:spacing w:line="276" w:lineRule="auto"/>
+              <w:ind w:left="0"/>
+              <w:jc w:val="center"/>
+            </w:pPr>
+            <w:r>
+              <w:t>1.</w:t>
+            </w:r>
+          </w:p>
+        </w:tc>
+        <w:tc>
+          <w:tcPr>
+            <w:tcW w:w="3402" w:type="dxa"/>
+            <w:vAlign w:val="center"/>
+          </w:tcPr>
+          <w:p>
+            <w:pPr>
+              <w:spacing w:line="276" w:lineRule="auto"/>
+              <w:ind w:left="0"/>
+              <w:jc w:val="left"/>
+            </w:pPr>
+            <w:r>
+              <w:t>Dimensi</w:t>
+            </w:r>
+          </w:p>
+        </w:tc>
+        <w:tc>
+          <w:tcPr>
+            <w:tcW w:w="3843" w:type="dxa"/>
+            <w:vAlign w:val="center"/>
+          </w:tcPr>
+          <w:p>
+            <w:pPr>
+              <w:spacing w:line="276" w:lineRule="auto"/>
+              <w:ind w:left="0"/>
+              <w:jc w:val="left"/>
+            </w:pPr>
+            <w:r>
+              <w:t>29 cm x 20,5 cm x 9 cm</w:t>
+            </w:r>
+          </w:p>
+        </w:tc>
+      </w:tr>
+      <w:tr>
+        <w:trPr>
+          <w:trHeight w:val="20"/>
+        </w:trPr>
+        <w:tc>
+          <w:tcPr>
+            <w:tcW w:w="522" w:type="dxa"/>
+            <w:vAlign w:val="center"/>
+          </w:tcPr>
+          <w:p>
+            <w:pPr>
+              <w:spacing w:line="276" w:lineRule="auto"/>
+              <w:ind w:left="0"/>
+              <w:jc w:val="center"/>
+            </w:pPr>
+            <w:r>
+              <w:t>2.</w:t>
+            </w:r>
+          </w:p>
+        </w:tc>
+        <w:tc>
+          <w:tcPr>
+            <w:tcW w:w="3402" w:type="dxa"/>
+            <w:vAlign w:val="center"/>
+          </w:tcPr>
+          <w:p>
+            <w:pPr>
+              <w:spacing w:line="276" w:lineRule="auto"/>
+              <w:ind w:left="0"/>
+              <w:jc w:val="left"/>
+            </w:pPr>
+            <w:r>
+              <w:t>Casing</w:t>
+            </w:r>
+          </w:p>
+        </w:tc>
+        <w:tc>
+          <w:tcPr>
+            <w:tcW w:w="3843" w:type="dxa"/>
+            <w:vAlign w:val="center"/>
+          </w:tcPr>
+          <w:p>
+            <w:pPr>
+              <w:spacing w:line="276" w:lineRule="auto"/>
+              <w:ind w:left="0"/>
+              <w:jc w:val="left"/>
+            </w:pPr>
+            <w:r>
+              <w:t>Hardcase</w:t>
+            </w:r>
+            <w:r>
+              <w:t xml:space="preserve"> Alumin</w:t>
+            </w:r>
+            <w:r>
+              <w:t>i</w:t>
+            </w:r>
+            <w:r>
+              <w:t>um</w:t>
+            </w:r>
+          </w:p>
+        </w:tc>
+      </w:tr>
+      <w:tr>
+        <w:trPr>
+          <w:trHeight w:val="20"/>
+        </w:trPr>
+        <w:tc>
+          <w:tcPr>
+            <w:tcW w:w="522" w:type="dxa"/>
+            <w:vAlign w:val="center"/>
+          </w:tcPr>
+          <w:p>
+            <w:pPr>
+              <w:spacing w:line="276" w:lineRule="auto"/>
+              <w:ind w:left="0"/>
+              <w:jc w:val="center"/>
+            </w:pPr>
+            <w:r>
+              <w:t>3.</w:t>
+            </w:r>
+          </w:p>
+        </w:tc>
+        <w:tc>
+          <w:tcPr>
+            <w:tcW w:w="3402" w:type="dxa"/>
+            <w:vAlign w:val="center"/>
+          </w:tcPr>
+          <w:p>
+            <w:pPr>
+              <w:spacing w:line="276" w:lineRule="auto"/>
+              <w:ind w:left="0"/>
+              <w:jc w:val="left"/>
+            </w:pPr>
+            <w:r>
+              <w:t>Base</w:t>
+            </w:r>
+          </w:p>
+        </w:tc>
+        <w:tc>
+          <w:tcPr>
+            <w:tcW w:w="3843" w:type="dxa"/>
+            <w:vAlign w:val="center"/>
+          </w:tcPr>
+          <w:p>
+            <w:pPr>
+              <w:spacing w:line="276" w:lineRule="auto"/>
+              <w:ind w:left="0"/>
+              <w:jc w:val="left"/>
+            </w:pPr>
+            <w:r>
+              <w:t>Akrilik</w:t>
+            </w:r>
+          </w:p>
+        </w:tc>
+      </w:tr>
+      <w:tr>
+        <w:trPr>
+          <w:trHeight w:val="20"/>
+        </w:trPr>
+        <w:tc>
+          <w:tcPr>
+            <w:tcW w:w="522" w:type="dxa"/>
+            <w:vAlign w:val="center"/>
+          </w:tcPr>
+          <w:p>
+            <w:pPr>
+              <w:spacing w:line="276" w:lineRule="auto"/>
+              <w:ind w:left="0"/>
+              <w:jc w:val="center"/>
+            </w:pPr>
+            <w:r>
+              <w:t>4.</w:t>
+            </w:r>
+          </w:p>
+        </w:tc>
+        <w:tc>
+          <w:tcPr>
+            <w:tcW w:w="3402" w:type="dxa"/>
+            <w:vAlign w:val="center"/>
+          </w:tcPr>
+          <w:p>
+            <w:pPr>
+              <w:spacing w:line="276" w:lineRule="auto"/>
+              <w:ind w:left="0"/>
+              <w:jc w:val="left"/>
+            </w:pPr>
+            <w:r>
+              <w:t>Microcontroller</w:t>
+            </w:r>
+          </w:p>
+        </w:tc>
+        <w:tc>
+          <w:tcPr>
+            <w:tcW w:w="3843" w:type="dxa"/>
+            <w:vAlign w:val="center"/>
+          </w:tcPr>
+          <w:p>
+            <w:pPr>
+              <w:spacing w:line="276" w:lineRule="auto"/>
+              <w:ind w:left="0"/>
+              <w:jc w:val="left"/>
+            </w:pPr>
+            <w:r>
+              <w:t>Arduino Uno R3</w:t>
+            </w:r>
+          </w:p>
+        </w:tc>
+      </w:tr>
+      <w:tr>
+        <w:trPr>
+          <w:trHeight w:val="20"/>
+        </w:trPr>
+        <w:tc>
+          <w:tcPr>
+            <w:tcW w:w="522" w:type="dxa"/>
+            <w:vAlign w:val="center"/>
+          </w:tcPr>
+          <w:p>
+            <w:pPr>
+              <w:spacing w:line="276" w:lineRule="auto"/>
+              <w:ind w:left="0"/>
+              <w:jc w:val="center"/>
+            </w:pPr>
+            <w:r>
+              <w:t>5.</w:t>
+            </w:r>
+          </w:p>
+        </w:tc>
+        <w:tc>
+          <w:tcPr>
+            <w:tcW w:w="3402" w:type="dxa"/>
+            <w:vAlign w:val="center"/>
+          </w:tcPr>
+          <w:p>
+            <w:pPr>
+              <w:spacing w:line="276" w:lineRule="auto"/>
+              <w:ind w:left="0"/>
+              <w:jc w:val="left"/>
+            </w:pPr>
+            <w:r>
+              <w:t>Sensor</w:t>
+            </w:r>
+          </w:p>
+        </w:tc>
+        <w:tc>
+          <w:tcPr>
+            <w:tcW w:w="3843" w:type="dxa"/>
+            <w:vAlign w:val="bottom"/>
+          </w:tcPr>
+          <w:p>
+            <w:pPr>
+              <w:spacing w:line="276" w:lineRule="auto"/>
+              <w:ind w:left="0"/>
+              <w:jc w:val="left"/>
+            </w:pPr>
+            <w:r>
+              <w:t>1. LDR</w:t>
+            </w:r>
+          </w:p>
+          <w:p>
+            <w:pPr>
+              <w:spacing w:line="276" w:lineRule="auto"/>
+              <w:ind w:left="0"/>
+              <w:jc w:val="left"/>
+            </w:pPr>
+            <w:r>
+              <w:t>2. Push Button</w:t>
+            </w:r>
+          </w:p>
+          <w:p>
+            <w:pPr>
+              <w:spacing w:line="276" w:lineRule="auto"/>
+              <w:ind w:left="0"/>
+              <w:jc w:val="left"/>
+            </w:pPr>
+            <w:r>
+              <w:t>3. Ultrasoni</w:t>
+            </w:r>
+            <w:r>
+              <w:t>c</w:t>
+            </w:r>
+            <w:r>
+              <w:t xml:space="preserve"> </w:t>
+            </w:r>
+            <w:r>
+              <w:t>(</w:t>
+            </w:r>
+            <w:r>
+              <w:t>HC-SR04</w:t>
+            </w:r>
+            <w:r>
+              <w:t>)</w:t>
+            </w:r>
+          </w:p>
+          <w:p>
+            <w:pPr>
+              <w:spacing w:line="276" w:lineRule="auto"/>
+              <w:ind w:left="0"/>
+              <w:jc w:val="left"/>
+            </w:pPr>
+            <w:r>
+              <w:t>4. IR Obstacle</w:t>
+            </w:r>
+            <w:r>
+              <w:t xml:space="preserve"> Avoidance</w:t>
+            </w:r>
+          </w:p>
+          <w:p>
+            <w:pPr>
+              <w:spacing w:line="276" w:lineRule="auto"/>
+              <w:ind w:left="0"/>
+              <w:jc w:val="left"/>
+            </w:pPr>
+            <w:r>
+              <w:lastRenderedPageBreak/>
+              <w:t>5. DHT22</w:t>
+            </w:r>
+          </w:p>
+          <w:p>
+            <w:pPr>
+              <w:spacing w:line="276" w:lineRule="auto"/>
+              <w:ind w:left="0"/>
+              <w:jc w:val="left"/>
+            </w:pPr>
+            <w:r>
+              <w:t>6. PIR</w:t>
+            </w:r>
+            <w:r>
+              <w:t xml:space="preserve"> (HC-SR501)</w:t>
+            </w:r>
+          </w:p>
+          <w:p>
+            <w:pPr>
+              <w:spacing w:line="276" w:lineRule="auto"/>
+              <w:ind w:left="0"/>
+              <w:jc w:val="left"/>
+            </w:pPr>
+            <w:r>
+              <w:t>7. MQ-6</w:t>
+            </w:r>
+          </w:p>
+          <w:p>
+            <w:pPr>
+              <w:spacing w:line="276" w:lineRule="auto"/>
+              <w:ind w:left="0"/>
+              <w:jc w:val="left"/>
+            </w:pPr>
+            <w:r>
+              <w:t>8. Rain Drop</w:t>
+            </w:r>
+          </w:p>
+          <w:p>
+            <w:pPr>
+              <w:spacing w:line="276" w:lineRule="auto"/>
+              <w:ind w:left="0"/>
+              <w:jc w:val="left"/>
+            </w:pPr>
+            <w:r>
+              <w:t xml:space="preserve">9. Flame </w:t>
+            </w:r>
+            <w:r>
+              <w:t>Detector</w:t>
+            </w:r>
+            <w:r>
+              <w:t xml:space="preserve"> </w:t>
+            </w:r>
+            <w:r>
+              <w:t>(</w:t>
+            </w:r>
+            <w:r>
+              <w:t>KY-026</w:t>
+            </w:r>
+            <w:r>
+              <w:t>)</w:t>
+            </w:r>
+          </w:p>
+          <w:p>
+            <w:pPr>
+              <w:spacing w:line="276" w:lineRule="auto"/>
+              <w:ind w:left="0"/>
+              <w:jc w:val="left"/>
+            </w:pPr>
+            <w:r>
+              <w:t>10. RFID</w:t>
+            </w:r>
+            <w:r>
+              <w:t xml:space="preserve"> (</w:t>
+            </w:r>
+            <w:r>
+              <w:t>RC522</w:t>
+            </w:r>
+            <w:r>
+              <w:t>)</w:t>
+            </w:r>
+          </w:p>
+        </w:tc>
+      </w:tr>
+      <w:tr>
+        <w:trPr>
+          <w:trHeight w:val="20"/>
+        </w:trPr>
+        <w:tc>
+          <w:tcPr>
+            <w:tcW w:w="522" w:type="dxa"/>
+            <w:vAlign w:val="center"/>
+          </w:tcPr>
+          <w:p>
+            <w:pPr>
+              <w:spacing w:line="276" w:lineRule="auto"/>
+              <w:ind w:left="0"/>
+              <w:jc w:val="center"/>
+            </w:pPr>
+            <w:r>
+              <w:lastRenderedPageBreak/>
+              <w:t>6.</w:t>
+            </w:r>
+          </w:p>
+        </w:tc>
+        <w:tc>
+          <w:tcPr>
+            <w:tcW w:w="3402" w:type="dxa"/>
+            <w:vAlign w:val="center"/>
+          </w:tcPr>
+          <w:p>
+            <w:pPr>
+              <w:spacing w:line="276" w:lineRule="auto"/>
+              <w:ind w:left="0"/>
+              <w:jc w:val="left"/>
+            </w:pPr>
+            <w:r>
+              <w:t>Output</w:t>
+            </w:r>
+          </w:p>
+        </w:tc>
+        <w:tc>
+          <w:tcPr>
+            <w:tcW w:w="3843" w:type="dxa"/>
+            <w:vAlign w:val="center"/>
+          </w:tcPr>
+          <w:p>
+            <w:pPr>
+              <w:spacing w:line="276" w:lineRule="auto"/>
+              <w:ind w:left="0"/>
+              <w:jc w:val="left"/>
+            </w:pPr>
+            <w:r>
+              <w:t>1. LED (merah, kuning, hijau, biru)</w:t>
+            </w:r>
+          </w:p>
+          <w:p>
+            <w:pPr>
+              <w:spacing w:line="276" w:lineRule="auto"/>
+              <w:ind w:left="0"/>
+              <w:jc w:val="left"/>
+            </w:pPr>
+            <w:r>
+              <w:t>2. RGB LED</w:t>
+            </w:r>
+          </w:p>
+          <w:p>
+            <w:pPr>
+              <w:spacing w:line="276" w:lineRule="auto"/>
+              <w:ind w:left="0"/>
+              <w:jc w:val="left"/>
+            </w:pPr>
+            <w:r>
+              <w:t xml:space="preserve">3. Buzzer </w:t>
+            </w:r>
+            <w:r>
+              <w:t>(</w:t>
+            </w:r>
+            <w:r>
+              <w:t>Passive</w:t>
+            </w:r>
+            <w:r>
+              <w:t>)</w:t>
+            </w:r>
+          </w:p>
+          <w:p>
+            <w:pPr>
+              <w:spacing w:line="276" w:lineRule="auto"/>
+              <w:ind w:left="0"/>
+              <w:jc w:val="left"/>
+            </w:pPr>
+            <w:r>
+              <w:t xml:space="preserve">4. LCD </w:t>
+            </w:r>
+            <w:r>
+              <w:t>I2C</w:t>
+            </w:r>
+            <w:r>
+              <w:t xml:space="preserve"> </w:t>
+            </w:r>
+            <w:r>
+              <w:t>16x2</w:t>
+            </w:r>
+          </w:p>
+          <w:p>
+            <w:pPr>
+              <w:spacing w:line="276" w:lineRule="auto"/>
+              <w:ind w:left="0"/>
+              <w:jc w:val="left"/>
+            </w:pPr>
+            <w:r>
+              <w:t>5. Servo MG90S</w:t>
+            </w:r>
+          </w:p>
+        </w:tc>
+      </w:tr>
+      <w:tr>
+        <w:trPr>
+          <w:trHeight w:val="20"/>
+        </w:trPr>
+        <w:tc>
+          <w:tcPr>
+            <w:tcW w:w="522" w:type="dxa"/>
+            <w:vAlign w:val="center"/>
+          </w:tcPr>
+          <w:p>
+            <w:pPr>
+              <w:spacing w:line="276" w:lineRule="auto"/>
+              <w:ind w:left="0"/>
+              <w:jc w:val="center"/>
+            </w:pPr>
+            <w:r>
+              <w:t>7.</w:t>
+            </w:r>
+          </w:p>
+        </w:tc>
+        <w:tc>
+          <w:tcPr>
+            <w:tcW w:w="3402" w:type="dxa"/>
+            <w:vAlign w:val="center"/>
+          </w:tcPr>
+          <w:p>
+            <w:pPr>
+              <w:spacing w:line="276" w:lineRule="auto"/>
+              <w:ind w:left="0"/>
+              <w:jc w:val="left"/>
+            </w:pPr>
+            <w:r>
+              <w:t>Sumber Daya</w:t>
+            </w:r>
+          </w:p>
+        </w:tc>
+        <w:tc>
+          <w:tcPr>
+            <w:tcW w:w="3843" w:type="dxa"/>
+            <w:vAlign w:val="center"/>
+          </w:tcPr>
+          <w:p>
+            <w:pPr>
+              <w:spacing w:line="276" w:lineRule="auto"/>
+              <w:ind w:left="0"/>
+              <w:jc w:val="left"/>
+            </w:pPr>
+            <w:r>
+              <w:t>USB (5V)</w:t>
+            </w:r>
+          </w:p>
+        </w:tc>
+      </w:tr>
+      <w:tr>
+        <w:trPr>
+          <w:trHeight w:val="20"/>
+        </w:trPr>
+        <w:tc>
+          <w:tcPr>
+            <w:tcW w:w="522" w:type="dxa"/>
+            <w:vAlign w:val="center"/>
+          </w:tcPr>
+          <w:p>
+            <w:pPr>
+              <w:spacing w:line="276" w:lineRule="auto"/>
+              <w:ind w:left="0"/>
+              <w:jc w:val="center"/>
+            </w:pPr>
+            <w:r>
+              <w:t>8.</w:t>
+            </w:r>
+          </w:p>
+        </w:tc>
+        <w:tc>
+          <w:tcPr>
+            <w:tcW w:w="3402" w:type="dxa"/>
+            <w:vAlign w:val="center"/>
+          </w:tcPr>
+          <w:p>
+            <w:pPr>
+              <w:spacing w:line="276" w:lineRule="auto"/>
+              <w:ind w:left="0"/>
+              <w:jc w:val="left"/>
+            </w:pPr>
+            <w:r>
+              <w:t>Kelengkapan</w:t>
+            </w:r>
+          </w:p>
+        </w:tc>
+        <w:tc>
+          <w:tcPr>
+            <w:tcW w:w="3843" w:type="dxa"/>
+            <w:vAlign w:val="center"/>
+          </w:tcPr>
+          <w:p>
+            <w:pPr>
+              <w:spacing w:line="276" w:lineRule="auto"/>
+              <w:ind w:left="0"/>
+              <w:jc w:val="left"/>
+            </w:pPr>
+            <w:r>
+              <w:t xml:space="preserve">Modul dan </w:t>
+            </w:r>
+            <w:r>
+              <w:t>L</w:t>
+            </w:r>
+            <w:r>
+              <w:t>absheet</w:t>
+            </w:r>
+          </w:p>
+        </w:tc>
+      </w:tr>
+    </w:tbl>
+    <w:p/>
+    <w:p>
+      <w:pPr>
+        <w:ind w:left="0"/>
       </w:pPr>
       <w:r>
         <w:br w:type="page"/>
@@ -569,7 +1576,6 @@
           <w:ilvl w:val="0"/>
           <w:numId w:val="3"/>
         </w:numPr>
-        <w:spacing w:line="480" w:lineRule="auto"/>
       </w:pPr>
       <w:r>
         <w:t>Kajian Teori</w:t>
@@ -577,7 +1583,11 @@
     </w:p>
     <w:p>
       <w:pPr>
-        <w:pStyle w:val="Heading3"/>
+        <w:pStyle w:val="ListParagraph"/>
+        <w:numPr>
+          <w:ilvl w:val="0"/>
+          <w:numId w:val="32"/>
+        </w:numPr>
       </w:pPr>
       <w:r>
         <w:t>Penelitian dan Pengembangan</w:t>
@@ -585,7 +1595,11 @@
     </w:p>
     <w:p>
       <w:pPr>
-        <w:pStyle w:val="Heading3"/>
+        <w:pStyle w:val="ListParagraph"/>
+        <w:numPr>
+          <w:ilvl w:val="0"/>
+          <w:numId w:val="32"/>
+        </w:numPr>
       </w:pPr>
       <w:r>
         <w:t>Media Pembelajaran</w:t>
@@ -593,7 +1607,71 @@
     </w:p>
     <w:p>
       <w:pPr>
-        <w:pStyle w:val="Heading3"/>
+        <w:pStyle w:val="ListParagraph"/>
+        <w:numPr>
+          <w:ilvl w:val="0"/>
+          <w:numId w:val="36"/>
+        </w:numPr>
+      </w:pPr>
+      <w:r>
+        <w:t>Pengertian Media Pembelajaran</w:t>
+      </w:r>
+    </w:p>
+    <w:p>
+      <w:pPr>
+        <w:pStyle w:val="ListParagraph"/>
+        <w:numPr>
+          <w:ilvl w:val="0"/>
+          <w:numId w:val="36"/>
+        </w:numPr>
+      </w:pPr>
+      <w:r>
+        <w:t>Fungsi dan Manfaat Media Pembelajaran</w:t>
+      </w:r>
+    </w:p>
+    <w:p>
+      <w:pPr>
+        <w:pStyle w:val="ListParagraph"/>
+        <w:numPr>
+          <w:ilvl w:val="0"/>
+          <w:numId w:val="36"/>
+        </w:numPr>
+      </w:pPr>
+      <w:r>
+        <w:t>Kriteria Pemilihan Media Pembelajaran</w:t>
+      </w:r>
+    </w:p>
+    <w:p>
+      <w:pPr>
+        <w:pStyle w:val="ListParagraph"/>
+        <w:numPr>
+          <w:ilvl w:val="0"/>
+          <w:numId w:val="36"/>
+        </w:numPr>
+      </w:pPr>
+      <w:r>
+        <w:t>Klasifikasi Media Pembelajaran</w:t>
+      </w:r>
+    </w:p>
+    <w:p>
+      <w:pPr>
+        <w:pStyle w:val="ListParagraph"/>
+        <w:numPr>
+          <w:ilvl w:val="0"/>
+          <w:numId w:val="36"/>
+        </w:numPr>
+      </w:pPr>
+      <w:r>
+        <w:t>Trainer Kit</w:t>
+      </w:r>
+    </w:p>
+    <w:p>
+      <w:pPr>
+        <w:pStyle w:val="ListParagraph"/>
+        <w:numPr>
+          <w:ilvl w:val="0"/>
+          <w:numId w:val="32"/>
+        </w:numPr>
       </w:pPr>
       <w:r>
         <w:t>Arduino Uno</w:t>
@@ -604,7 +1682,7 @@
         <w:pStyle w:val="ListParagraph"/>
         <w:numPr>
           <w:ilvl w:val="0"/>
-          <w:numId w:val="10"/>
+          <w:numId w:val="33"/>
         </w:numPr>
       </w:pPr>
       <w:r>
@@ -616,7 +1694,7 @@
         <w:pStyle w:val="ListParagraph"/>
         <w:numPr>
           <w:ilvl w:val="0"/>
-          <w:numId w:val="10"/>
+          <w:numId w:val="33"/>
         </w:numPr>
       </w:pPr>
       <w:r>
@@ -628,7 +1706,7 @@
         <w:pStyle w:val="ListParagraph"/>
         <w:numPr>
           <w:ilvl w:val="0"/>
-          <w:numId w:val="10"/>
+          <w:numId w:val="33"/>
         </w:numPr>
       </w:pPr>
       <w:r>
@@ -637,33 +1715,61 @@
     </w:p>
     <w:p>
       <w:pPr>
-        <w:pStyle w:val="Heading3"/>
+        <w:pStyle w:val="ListParagraph"/>
+        <w:numPr>
+          <w:ilvl w:val="0"/>
+          <w:numId w:val="33"/>
+        </w:numPr>
+      </w:pPr>
+      <w:r>
+        <w:t>Pemrograman Mikrokontroler</w:t>
+      </w:r>
+    </w:p>
+    <w:p>
+      <w:pPr>
+        <w:pStyle w:val="ListParagraph"/>
+        <w:numPr>
+          <w:ilvl w:val="0"/>
+          <w:numId w:val="32"/>
+        </w:numPr>
       </w:pPr>
       <w:r>
         <w:t>Sensor</w:t>
       </w:r>
-    </w:p>
-    <w:p>
-      <w:pPr>
-        <w:pStyle w:val="ListParagraph"/>
-        <w:numPr>
-          <w:ilvl w:val="0"/>
-          <w:numId w:val="11"/>
-        </w:numPr>
-      </w:pPr>
-      <w:r>
-        <w:t xml:space="preserve">Pengertian </w:t>
-      </w:r>
-      <w:r>
-        <w:t>Sensor</w:t>
-      </w:r>
-    </w:p>
-    <w:p>
-      <w:pPr>
-        <w:pStyle w:val="ListParagraph"/>
-        <w:numPr>
-          <w:ilvl w:val="0"/>
-          <w:numId w:val="11"/>
+      <w:r>
+        <w:t xml:space="preserve"> dan Input</w:t>
+      </w:r>
+    </w:p>
+    <w:p>
+      <w:pPr>
+        <w:pStyle w:val="ListParagraph"/>
+        <w:numPr>
+          <w:ilvl w:val="0"/>
+          <w:numId w:val="34"/>
+        </w:numPr>
+      </w:pPr>
+      <w:r>
+        <w:t>Pengertian Sensor</w:t>
+      </w:r>
+    </w:p>
+    <w:p>
+      <w:pPr>
+        <w:pStyle w:val="ListParagraph"/>
+        <w:numPr>
+          <w:ilvl w:val="0"/>
+          <w:numId w:val="34"/>
+        </w:numPr>
+      </w:pPr>
+      <w:r>
+        <w:t>Push Button (Input Digital)</w:t>
+      </w:r>
+    </w:p>
+    <w:p>
+      <w:pPr>
+        <w:pStyle w:val="ListParagraph"/>
+        <w:numPr>
+          <w:ilvl w:val="0"/>
+          <w:numId w:val="34"/>
         </w:numPr>
       </w:pPr>
       <w:r>
@@ -675,19 +1781,34 @@
         <w:pStyle w:val="ListParagraph"/>
         <w:numPr>
           <w:ilvl w:val="0"/>
-          <w:numId w:val="11"/>
-        </w:numPr>
-      </w:pPr>
-      <w:r>
-        <w:t>Sensor Ultrasonic HC – SR04</w:t>
-      </w:r>
-    </w:p>
-    <w:p>
-      <w:pPr>
-        <w:pStyle w:val="ListParagraph"/>
-        <w:numPr>
-          <w:ilvl w:val="0"/>
-          <w:numId w:val="11"/>
+          <w:numId w:val="34"/>
+        </w:numPr>
+      </w:pPr>
+      <w:r>
+        <w:t xml:space="preserve">Sensor Ultrasonic </w:t>
+      </w:r>
+      <w:r>
+        <w:t>(</w:t>
+      </w:r>
+      <w:r>
+        <w:t>HC</w:t>
+      </w:r>
+      <w:r>
+        <w:t>-</w:t>
+      </w:r>
+      <w:r>
+        <w:t>SR04</w:t>
+      </w:r>
+      <w:r>
+        <w:t>)</w:t>
+      </w:r>
+    </w:p>
+    <w:p>
+      <w:pPr>
+        <w:pStyle w:val="ListParagraph"/>
+        <w:numPr>
+          <w:ilvl w:val="0"/>
+          <w:numId w:val="34"/>
         </w:numPr>
       </w:pPr>
       <w:r>
@@ -699,28 +1820,87 @@
         <w:pStyle w:val="ListParagraph"/>
         <w:numPr>
           <w:ilvl w:val="0"/>
-          <w:numId w:val="11"/>
-        </w:numPr>
-      </w:pPr>
-      <w:r>
-        <w:t>Sensor DHT11</w:t>
-      </w:r>
-    </w:p>
-    <w:p>
-      <w:pPr>
-        <w:pStyle w:val="ListParagraph"/>
-        <w:numPr>
-          <w:ilvl w:val="0"/>
-          <w:numId w:val="11"/>
+          <w:numId w:val="34"/>
+        </w:numPr>
+      </w:pPr>
+      <w:r>
+        <w:lastRenderedPageBreak/>
+        <w:t>Sensor DHT</w:t>
+      </w:r>
+      <w:r>
+        <w:t>22</w:t>
+      </w:r>
+    </w:p>
+    <w:p>
+      <w:pPr>
+        <w:pStyle w:val="ListParagraph"/>
+        <w:numPr>
+          <w:ilvl w:val="0"/>
+          <w:numId w:val="34"/>
         </w:numPr>
       </w:pPr>
       <w:r>
         <w:t>Sensor PIR</w:t>
       </w:r>
-    </w:p>
-    <w:p>
-      <w:pPr>
-        <w:pStyle w:val="Heading3"/>
+      <w:r>
+        <w:t xml:space="preserve"> (HC-SR501)</w:t>
+      </w:r>
+    </w:p>
+    <w:p>
+      <w:pPr>
+        <w:pStyle w:val="ListParagraph"/>
+        <w:numPr>
+          <w:ilvl w:val="0"/>
+          <w:numId w:val="34"/>
+        </w:numPr>
+      </w:pPr>
+      <w:r>
+        <w:t>Sensor MQ-6</w:t>
+      </w:r>
+    </w:p>
+    <w:p>
+      <w:pPr>
+        <w:pStyle w:val="ListParagraph"/>
+        <w:numPr>
+          <w:ilvl w:val="0"/>
+          <w:numId w:val="34"/>
+        </w:numPr>
+      </w:pPr>
+      <w:r>
+        <w:t>Sensor Rain Drop</w:t>
+      </w:r>
+    </w:p>
+    <w:p>
+      <w:pPr>
+        <w:pStyle w:val="ListParagraph"/>
+        <w:numPr>
+          <w:ilvl w:val="0"/>
+          <w:numId w:val="34"/>
+        </w:numPr>
+      </w:pPr>
+      <w:r>
+        <w:t>Sensor Flame Detector (KY-026)</w:t>
+      </w:r>
+    </w:p>
+    <w:p>
+      <w:pPr>
+        <w:pStyle w:val="ListParagraph"/>
+        <w:numPr>
+          <w:ilvl w:val="0"/>
+          <w:numId w:val="34"/>
+        </w:numPr>
+      </w:pPr>
+      <w:r>
+        <w:t>Sensor RFID (RC522)</w:t>
+      </w:r>
+    </w:p>
+    <w:p>
+      <w:pPr>
+        <w:pStyle w:val="ListParagraph"/>
+        <w:numPr>
+          <w:ilvl w:val="0"/>
+          <w:numId w:val="30"/>
+        </w:numPr>
       </w:pPr>
       <w:r>
         <w:t>Output</w:t>
@@ -728,32 +1908,88 @@
     </w:p>
     <w:p>
       <w:pPr>
-        <w:pStyle w:val="Heading3"/>
-      </w:pPr>
-      <w:r>
-        <w:t>Elektronika Dasar</w:t>
-      </w:r>
-    </w:p>
-    <w:p>
-      <w:pPr>
-        <w:pStyle w:val="Heading3"/>
-      </w:pPr>
-      <w:r>
-        <w:t>Pemrograman Mikrokontroler</w:t>
-      </w:r>
-    </w:p>
-    <w:p>
-      <w:pPr>
-        <w:pStyle w:val="Heading3"/>
-      </w:pPr>
-      <w:r>
-        <w:t xml:space="preserve"> Konteks Pembelajaran </w:t>
+        <w:pStyle w:val="ListParagraph"/>
+        <w:numPr>
+          <w:ilvl w:val="0"/>
+          <w:numId w:val="37"/>
+        </w:numPr>
+      </w:pPr>
+      <w:r>
+        <w:t>LED</w:t>
+      </w:r>
+    </w:p>
+    <w:p>
+      <w:pPr>
+        <w:pStyle w:val="ListParagraph"/>
+        <w:numPr>
+          <w:ilvl w:val="0"/>
+          <w:numId w:val="37"/>
+        </w:numPr>
+      </w:pPr>
+      <w:r>
+        <w:t>RGB LED</w:t>
+      </w:r>
+    </w:p>
+    <w:p>
+      <w:pPr>
+        <w:pStyle w:val="ListParagraph"/>
+        <w:numPr>
+          <w:ilvl w:val="0"/>
+          <w:numId w:val="37"/>
+        </w:numPr>
+      </w:pPr>
+      <w:r>
+        <w:t>Buzzer</w:t>
+      </w:r>
+      <w:r>
+        <w:t xml:space="preserve"> (Passive)</w:t>
+      </w:r>
+    </w:p>
+    <w:p>
+      <w:pPr>
+        <w:pStyle w:val="ListParagraph"/>
+        <w:numPr>
+          <w:ilvl w:val="0"/>
+          <w:numId w:val="37"/>
+        </w:numPr>
+      </w:pPr>
+      <w:r>
+        <w:t>LCD</w:t>
+      </w:r>
+      <w:r>
+        <w:t xml:space="preserve"> I2C 16x2</w:t>
+      </w:r>
+    </w:p>
+    <w:p>
+      <w:pPr>
+        <w:pStyle w:val="ListParagraph"/>
+        <w:numPr>
+          <w:ilvl w:val="0"/>
+          <w:numId w:val="37"/>
+        </w:numPr>
+      </w:pPr>
+      <w:r>
+        <w:t>Servo</w:t>
+      </w:r>
+      <w:r>
+        <w:t xml:space="preserve"> MG90S</w:t>
+      </w:r>
+    </w:p>
+    <w:p>
+      <w:pPr>
+        <w:pStyle w:val="ListParagraph"/>
+        <w:numPr>
+          <w:ilvl w:val="0"/>
+          <w:numId w:val="30"/>
+        </w:numPr>
+      </w:pPr>
+      <w:r>
+        <w:t>Kelas Robot Inovasi di CV Global Solusi Edukasi</w:t>
       </w:r>
     </w:p>
     <w:p>
       <w:pPr>
         <w:pStyle w:val="Heading2"/>
-        <w:spacing w:line="480" w:lineRule="auto"/>
       </w:pPr>
       <w:r>
         <w:t>Penelitian yang Relevan</w:t>
@@ -761,8 +1997,58 @@
     </w:p>
     <w:p>
       <w:pPr>
+        <w:ind w:firstLine="720"/>
+      </w:pPr>
+      <w:r>
+        <w:t>Penelitian tentang pengembangan media pembelajaran trainer kit telah banyak dilakukan sebelumnya. Namun, penelitian yang secara khusus mengembangkan trainer kit multi sensor berbasis Arduino Uno untuk peserta didik jenjang menengah di lembaga pelatihan non-formal masih terbatas. Oleh karena itu, kajian terhadap penelitian terdahulu perlu dilakukan sebagai bahan perbandingan, pijakan teoretis, serta untuk menegaskan kebaruan dari produk</w:t>
+      </w:r>
+    </w:p>
+    <w:p>
+      <w:r>
+        <w:lastRenderedPageBreak/>
+        <w:t>yang dikembangkan. Berikut adalah beberapa penelitian yang relevan dengan topik pengembangan media pembelajaran trainer kit multi sensor berbasis Arduino Uno.</w:t>
+      </w:r>
+    </w:p>
+    <w:p>
+      <w:pPr>
+        <w:pStyle w:val="ListParagraph"/>
+        <w:numPr>
+          <w:ilvl w:val="0"/>
+          <w:numId w:val="26"/>
+        </w:numPr>
+      </w:pPr>
+      <w:r>
+        <w:t>Penelitian oleh Arvin Heri Wicaksono (2016)</w:t>
+      </w:r>
+    </w:p>
+    <w:p>
+      <w:pPr>
+        <w:pStyle w:val="ListParagraph"/>
+        <w:ind w:left="1080"/>
+      </w:pPr>
+      <w:r>
+        <w:t xml:space="preserve">Dalam literatur penelitian Wicaksono (2016) "Pengembangan Trainer Kit Sensor sebagai Media Pembelajaran Mata Pelajaran Sensor dan Aktuator di SMK Negeri 2 Pengasih" bertujuan mengembangkan media pembelajaran berupa trainer kit sensor yang dilengkapi modul panduan dan labsheet, mengetahui unjuk kerja komponen, serta menguji kelayakan produk pembelajaran pada mata pelajaran Sensor dan Aktuator. Penelitian yang diintegrasikan berbasis Research and Development (R&amp;D) mengacu pada kerangka ADDIE dari Robert Maribe Branch, dengan skema pengujian oleh pakar materi, pakar media, serta calon pengguna memanfaatkan instrumen angket skala Likert empat tingkatan. Temuan mengonfirmasi bahwa modul instruksional yang direalisasikan berkategori sangat layak, dengan persentase validasi sebesar 87,50% dari penguji materi, 83,66% dari penguji media, serta 83,66% merujuk pada penilaian 32 siswa. Angka tersebut membuktikan bahwa alat peraga ini berdaya guna, mudah dioperasikan, dan efektif dalam meningkatkan antusiasme serta dorongan belajar siswa. Metode ini digunakan untuk menciptakan produk yang tidak hanya dibuat dan dikembangkan, tetapi diuji kelayakan, </w:t>
+      </w:r>
+      <w:r>
+        <w:lastRenderedPageBreak/>
+        <w:t>kepraktisan, dan fungsionalitasnya sebelum diimplementasikan pada proses pembelajaran. Sehingga, penelitian terdahulu memberikan landasan metodologis bagi pengembangan media pembelajaran pada bidang pendidikan kejuruan. Perbedaannya terletak pada media yang dikembangkan, yaitu penelitian ini berfokus pada pengembangan trainer kit multi sensor berbasis Arduino Uno sebagai media pembelajaran sensor dan aktuator yang disesuaikan dengan kebutuhan peserta didik jenjang menengah di CV Global Solusi Edukasi.</w:t>
+      </w:r>
+    </w:p>
+    <w:p>
+      <w:pPr>
+        <w:pStyle w:val="ListParagraph"/>
+        <w:numPr>
+          <w:ilvl w:val="0"/>
+          <w:numId w:val="26"/>
+        </w:numPr>
+      </w:pPr>
+      <w:r>
+        <w:t>Penelitian</w:t>
+      </w:r>
+    </w:p>
+    <w:p>
+      <w:pPr>
         <w:pStyle w:val="Heading2"/>
-        <w:spacing w:line="480" w:lineRule="auto"/>
       </w:pPr>
       <w:r>
         <w:t>Kerangka Berpikir</w:t>
@@ -771,7 +2057,6 @@
     <w:p>
       <w:pPr>
         <w:pStyle w:val="Heading2"/>
-        <w:spacing w:line="480" w:lineRule="auto"/>
       </w:pPr>
       <w:r>
         <w:t>Pertanyaan Penelitian</w:t>
@@ -782,7 +2067,6 @@
         <w:pStyle w:val="Heading1"/>
       </w:pPr>
       <w:r>
-        <w:lastRenderedPageBreak/>
         <w:t>B</w:t>
       </w:r>
       <w:r>
@@ -796,7 +2080,6 @@
     <w:p>
       <w:pPr>
         <w:pStyle w:val="Heading2"/>
-        <w:spacing w:line="480" w:lineRule="auto"/>
       </w:pPr>
       <w:r>
         <w:t>Jenis atau Desain Penelitian</w:t>
@@ -805,7 +2088,6 @@
     <w:p>
       <w:pPr>
         <w:pStyle w:val="Heading2"/>
-        <w:spacing w:line="480" w:lineRule="auto"/>
       </w:pPr>
       <w:r>
         <w:t>Tempat dan Waktu Penelitian</w:t>
@@ -814,7 +2096,6 @@
     <w:p>
       <w:pPr>
         <w:pStyle w:val="Heading2"/>
-        <w:spacing w:line="480" w:lineRule="auto"/>
       </w:pPr>
       <w:r>
         <w:t>Subjek dan Objek Penelitian</w:t>
@@ -823,7 +2104,6 @@
     <w:p>
       <w:pPr>
         <w:pStyle w:val="Heading2"/>
-        <w:spacing w:line="480" w:lineRule="auto"/>
       </w:pPr>
       <w:r>
         <w:t>Prosedur Pengembangan</w:t>
@@ -832,7 +2112,6 @@
     <w:p>
       <w:pPr>
         <w:pStyle w:val="Heading2"/>
-        <w:spacing w:line="480" w:lineRule="auto"/>
       </w:pPr>
       <w:r>
         <w:t>Teknik dan Instrumen Pengumpulan Data</w:t>
@@ -861,9 +2140,9 @@
     <w:p>
       <w:pPr>
         <w:pStyle w:val="Heading2"/>
-        <w:spacing w:line="480" w:lineRule="auto"/>
-      </w:pPr>
-      <w:r>
+      </w:pPr>
+      <w:r>
+        <w:lastRenderedPageBreak/>
         <w:t>Validitas dan Reliabilitas Instrumen</w:t>
       </w:r>
     </w:p>
@@ -890,19 +2169,12 @@
     <w:p>
       <w:pPr>
         <w:pStyle w:val="Heading2"/>
-        <w:spacing w:line="480" w:lineRule="auto"/>
       </w:pPr>
       <w:r>
         <w:t>Teknik Analisis Data</w:t>
       </w:r>
     </w:p>
     <w:p>
-      <w:pPr>
-        <w:rPr>
-          <w:b/>
-          <w:bCs/>
-        </w:rPr>
-      </w:pPr>
       <w:r>
         <w:br w:type="page"/>
       </w:r>
@@ -927,7 +2199,6 @@
           <w:ilvl w:val="0"/>
           <w:numId w:val="15"/>
         </w:numPr>
-        <w:spacing w:line="480" w:lineRule="auto"/>
       </w:pPr>
       <w:r>
         <w:t>Hasil Pengembangan Produk</w:t>
@@ -940,7 +2211,6 @@
           <w:ilvl w:val="0"/>
           <w:numId w:val="16"/>
         </w:numPr>
-        <w:spacing w:line="480" w:lineRule="auto"/>
       </w:pPr>
       <w:r>
         <w:t xml:space="preserve">Tahap </w:t>
@@ -956,7 +2226,6 @@
           <w:ilvl w:val="0"/>
           <w:numId w:val="16"/>
         </w:numPr>
-        <w:spacing w:line="480" w:lineRule="auto"/>
       </w:pPr>
       <w:r>
         <w:t xml:space="preserve">Tahap Design </w:t>
@@ -969,7 +2238,6 @@
           <w:ilvl w:val="0"/>
           <w:numId w:val="16"/>
         </w:numPr>
-        <w:spacing w:line="480" w:lineRule="auto"/>
       </w:pPr>
       <w:r>
         <w:t>Tahap Development</w:t>
@@ -982,7 +2250,6 @@
           <w:ilvl w:val="0"/>
           <w:numId w:val="16"/>
         </w:numPr>
-        <w:spacing w:line="480" w:lineRule="auto"/>
       </w:pPr>
       <w:r>
         <w:t>Tahap Implementation</w:t>
@@ -995,7 +2262,6 @@
           <w:ilvl w:val="0"/>
           <w:numId w:val="16"/>
         </w:numPr>
-        <w:spacing w:line="480" w:lineRule="auto"/>
       </w:pPr>
       <w:r>
         <w:t>Tahap Evaluatio</w:t>
@@ -1004,7 +2270,6 @@
     <w:p>
       <w:pPr>
         <w:pStyle w:val="Heading2"/>
-        <w:spacing w:line="480" w:lineRule="auto"/>
       </w:pPr>
       <w:r>
         <w:t>Hasil Uji Coba</w:t>
@@ -1017,7 +2282,6 @@
           <w:ilvl w:val="0"/>
           <w:numId w:val="17"/>
         </w:numPr>
-        <w:spacing w:line="480" w:lineRule="auto"/>
       </w:pPr>
       <w:r>
         <w:t>Hasil Validasi Ahli Media</w:t>
@@ -1030,7 +2294,6 @@
           <w:ilvl w:val="0"/>
           <w:numId w:val="17"/>
         </w:numPr>
-        <w:spacing w:line="480" w:lineRule="auto"/>
       </w:pPr>
       <w:r>
         <w:t>Hasil Validasi Ahli Materi</w:t>
@@ -1043,7 +2306,6 @@
           <w:ilvl w:val="0"/>
           <w:numId w:val="17"/>
         </w:numPr>
-        <w:spacing w:line="480" w:lineRule="auto"/>
       </w:pPr>
       <w:r>
         <w:t>Hasil Respons Peserta Didik</w:t>
@@ -1056,7 +2318,6 @@
           <w:ilvl w:val="0"/>
           <w:numId w:val="17"/>
         </w:numPr>
-        <w:spacing w:line="480" w:lineRule="auto"/>
       </w:pPr>
       <w:r>
         <w:t>Hasil Uji Reliabilitas</w:t>
@@ -1065,7 +2326,6 @@
     <w:p>
       <w:pPr>
         <w:pStyle w:val="Heading2"/>
-        <w:spacing w:line="480" w:lineRule="auto"/>
       </w:pPr>
       <w:r>
         <w:t>Revisi Produk</w:t>
@@ -1078,7 +2338,6 @@
           <w:ilvl w:val="0"/>
           <w:numId w:val="18"/>
         </w:numPr>
-        <w:spacing w:line="480" w:lineRule="auto"/>
       </w:pPr>
       <w:r>
         <w:t>Revisi Ahli Media</w:t>
@@ -1091,7 +2350,6 @@
           <w:ilvl w:val="0"/>
           <w:numId w:val="18"/>
         </w:numPr>
-        <w:spacing w:line="480" w:lineRule="auto"/>
       </w:pPr>
       <w:r>
         <w:t>Revisi Ahli Materi</w:t>
@@ -1104,7 +2362,6 @@
           <w:ilvl w:val="0"/>
           <w:numId w:val="18"/>
         </w:numPr>
-        <w:spacing w:line="480" w:lineRule="auto"/>
       </w:pPr>
       <w:r>
         <w:t>Revisi Berdasarkan Respons Peserta Didik</w:t>
@@ -1113,7 +2370,6 @@
     <w:p>
       <w:pPr>
         <w:pStyle w:val="Heading2"/>
-        <w:spacing w:line="480" w:lineRule="auto"/>
       </w:pPr>
       <w:r>
         <w:t>Kajian Produk Akhir</w:t>
@@ -1126,7 +2382,6 @@
           <w:ilvl w:val="0"/>
           <w:numId w:val="19"/>
         </w:numPr>
-        <w:spacing w:line="480" w:lineRule="auto"/>
       </w:pPr>
       <w:r>
         <w:t>Karakteristik Produk</w:t>
@@ -1139,7 +2394,6 @@
           <w:ilvl w:val="0"/>
           <w:numId w:val="19"/>
         </w:numPr>
-        <w:spacing w:line="480" w:lineRule="auto"/>
       </w:pPr>
       <w:r>
         <w:lastRenderedPageBreak/>
@@ -1153,7 +2407,6 @@
           <w:ilvl w:val="0"/>
           <w:numId w:val="19"/>
         </w:numPr>
-        <w:spacing w:line="480" w:lineRule="auto"/>
       </w:pPr>
       <w:r>
         <w:t>Kemampuan Operasional</w:t>
@@ -1162,7 +2415,6 @@
     <w:p>
       <w:pPr>
         <w:pStyle w:val="Heading2"/>
-        <w:spacing w:line="480" w:lineRule="auto"/>
       </w:pPr>
       <w:r>
         <w:t>Keterbatasan Penelitian</w:t>
@@ -1175,7 +2427,6 @@
           <w:ilvl w:val="0"/>
           <w:numId w:val="21"/>
         </w:numPr>
-        <w:spacing w:line="480" w:lineRule="auto"/>
       </w:pPr>
       <w:r>
         <w:t>Keterbatasan Metodologi</w:t>
@@ -1188,7 +2439,6 @@
           <w:ilvl w:val="0"/>
           <w:numId w:val="21"/>
         </w:numPr>
-        <w:spacing w:line="480" w:lineRule="auto"/>
       </w:pPr>
       <w:r>
         <w:t>Keterbatasan Produk</w:t>
@@ -1217,7 +2467,6 @@
           <w:ilvl w:val="0"/>
           <w:numId w:val="23"/>
         </w:numPr>
-        <w:spacing w:line="480" w:lineRule="auto"/>
       </w:pPr>
       <w:r>
         <w:t>Simpulan</w:t>
@@ -1230,7 +2479,6 @@
           <w:ilvl w:val="0"/>
           <w:numId w:val="24"/>
         </w:numPr>
-        <w:spacing w:line="480" w:lineRule="auto"/>
       </w:pPr>
       <w:r>
         <w:t>Jawaban Rumusan Masalah 1</w:t>
@@ -1243,7 +2491,6 @@
           <w:ilvl w:val="0"/>
           <w:numId w:val="24"/>
         </w:numPr>
-        <w:spacing w:line="480" w:lineRule="auto"/>
       </w:pPr>
       <w:r>
         <w:t>Jawaban Rumusan Masalah 2</w:t>
@@ -1256,7 +2503,6 @@
           <w:ilvl w:val="0"/>
           <w:numId w:val="24"/>
         </w:numPr>
-        <w:spacing w:line="480" w:lineRule="auto"/>
       </w:pPr>
       <w:r>
         <w:t>Jawaban Rumusan Masalah 3</w:t>
@@ -1265,7 +2511,6 @@
     <w:p>
       <w:pPr>
         <w:pStyle w:val="Heading2"/>
-        <w:spacing w:line="480" w:lineRule="auto"/>
       </w:pPr>
       <w:r>
         <w:t>Implikasi</w:t>
@@ -1274,7 +2519,6 @@
     <w:p>
       <w:pPr>
         <w:pStyle w:val="Heading2"/>
-        <w:spacing w:line="480" w:lineRule="auto"/>
       </w:pPr>
       <w:r>
         <w:t>Saran</w:t>
@@ -1287,7 +2531,6 @@
           <w:ilvl w:val="0"/>
           <w:numId w:val="25"/>
         </w:numPr>
-        <w:spacing w:line="480" w:lineRule="auto"/>
       </w:pPr>
       <w:r>
         <w:t>Bagi GSE</w:t>
@@ -1300,7 +2543,6 @@
           <w:ilvl w:val="0"/>
           <w:numId w:val="25"/>
         </w:numPr>
-        <w:spacing w:line="480" w:lineRule="auto"/>
       </w:pPr>
       <w:r>
         <w:t>Bagi Peneliti Selanjutnya</w:t>
@@ -1313,7 +2555,6 @@
           <w:ilvl w:val="0"/>
           <w:numId w:val="25"/>
         </w:numPr>
-        <w:spacing w:line="480" w:lineRule="auto"/>
       </w:pPr>
       <w:r>
         <w:t>Bagi Prodi</w:t>
@@ -1334,12 +2575,6 @@
       </w:r>
     </w:p>
     <w:p>
-      <w:pPr>
-        <w:rPr>
-          <w:b/>
-          <w:bCs/>
-        </w:rPr>
-      </w:pPr>
       <w:r>
         <w:br w:type="page"/>
       </w:r>
@@ -1353,12 +2588,7 @@
         <w:t>LAMPIRAN</w:t>
       </w:r>
     </w:p>
-    <w:p>
-      <w:pPr>
-        <w:spacing w:line="480" w:lineRule="auto"/>
-        <w:ind w:left="360"/>
-      </w:pPr>
-    </w:p>
+    <w:p/>
     <w:sectPr>
       <w:type w:val="continuous"/>
       <w:pgSz w:w="12240" w:h="15840"/>
@@ -1373,6 +2603,95 @@
 <file path=word/numbering.xml><?xml version="1.0" encoding="utf-8"?>
 <w:numbering xmlns:wpc="http://schemas.microsoft.com/office/word/2010/wordprocessingCanvas" xmlns:cx="http://schemas.microsoft.com/office/drawing/2014/chartex" xmlns:cx1="http://schemas.microsoft.com/office/drawing/2015/9/8/chartex" xmlns:cx2="http://schemas.microsoft.com/office/drawing/2015/10/21/chartex" xmlns:cx3="http://schemas.microsoft.com/office/drawing/2016/5/9/chartex" xmlns:cx4="http://schemas.microsoft.com/office/drawing/2016/5/10/chartex" xmlns:cx5="http://schemas.microsoft.com/office/drawing/2016/5/11/chartex" xmlns:cx6="http://schemas.microsoft.com/office/drawing/2016/5/12/chartex" xmlns:cx7="http://schemas.microsoft.com/office/drawing/2016/5/13/chartex" xmlns:cx8="http://schemas.microsoft.com/office/drawing/2016/5/14/chartex" xmlns:mc="http://schemas.openxmlformats.org/markup-compatibility/2006" xmlns:aink="http://schemas.microsoft.com/office/drawing/2016/ink" xmlns:am3d="http://schemas.microsoft.com/office/drawing/2017/model3d" xmlns:o="urn:schemas-microsoft-com:office:office" xmlns:oel="http://schemas.microsoft.com/office/2019/extlst" xmlns:r="http://schemas.openxmlformats.org/officeDocument/2006/relationships" xmlns:m="http://schemas.openxmlformats.org/officeDocument/2006/math" xmlns:v="urn:schemas-microsoft-com:vml" xmlns:wp14="http://schemas.microsoft.com/office/word/2010/wordprocessingDrawing" xmlns:wp="http://schemas.openxmlformats.org/drawingml/2006/wordprocessingDrawing" xmlns:w10="urn:schemas-microsoft-com:office:word" xmlns:w="http://schemas.openxmlformats.org/wordprocessingml/2006/main" xmlns:w14="http://schemas.microsoft.com/office/word/2010/wordml" xmlns:w15="http://schemas.microsoft.com/office/word/2012/wordml" xmlns:w16cex="http://schemas.microsoft.com/office/word/2018/wordml/cex" xmlns:w16cid="http://schemas.microsoft.com/office/word/2016/wordml/cid" xmlns:w16="http://schemas.microsoft.com/office/word/2018/wordml" xmlns:w16du="http://schemas.microsoft.com/office/word/2023/wordml/word16du" xmlns:w16sdtdh="http://schemas.microsoft.com/office/word/2020/wordml/sdtdatahash" xmlns:w16sdtfl="http://schemas.microsoft.com/office/word/2024/wordml/sdtformatlock" xmlns:w16se="http://schemas.microsoft.com/office/word/2015/wordml/symex" xmlns:wpg="http://schemas.microsoft.com/office/word/2010/wordprocessingGroup" xmlns:wpi="http://schemas.microsoft.com/office/word/2010/wordprocessingInk" xmlns:wne="http://schemas.microsoft.com/office/word/2006/wordml" xmlns:wps="http://schemas.microsoft.com/office/word/2010/wordprocessingShape" mc:Ignorable="w14 w15 w16se w16cid w16 w16cex w16sdtdh w16sdtfl w16du wp14">
   <w:abstractNum w:abstractNumId="0" w15:restartNumberingAfterBreak="0">
+    <w:nsid w:val="00BD7065"/>
+    <w:multiLevelType w:val="hybridMultilevel"/>
+    <w:tmpl w:val="4F9CA0F0"/>
+    <w:lvl w:ilvl="0" w:tplc="E6BC4082">
+      <w:start w:val="1"/>
+      <w:numFmt w:val="decimal"/>
+      <w:lvlText w:val="%1."/>
+      <w:lvlJc w:val="left"/>
+      <w:pPr>
+        <w:ind w:left="1080" w:hanging="360"/>
+      </w:pPr>
+      <w:rPr>
+        <w:rFonts w:hint="default"/>
+      </w:rPr>
+    </w:lvl>
+    <w:lvl w:ilvl="1" w:tplc="04210019" w:tentative="1">
+      <w:start w:val="1"/>
+      <w:numFmt w:val="lowerLetter"/>
+      <w:lvlText w:val="%2."/>
+      <w:lvlJc w:val="left"/>
+      <w:pPr>
+        <w:ind w:left="1800" w:hanging="360"/>
+      </w:pPr>
+    </w:lvl>
+    <w:lvl w:ilvl="2" w:tplc="0421001B" w:tentative="1">
+      <w:start w:val="1"/>
+      <w:numFmt w:val="lowerRoman"/>
+      <w:lvlText w:val="%3."/>
+      <w:lvlJc w:val="right"/>
+      <w:pPr>
+        <w:ind w:left="2520" w:hanging="180"/>
+      </w:pPr>
+    </w:lvl>
+    <w:lvl w:ilvl="3" w:tplc="0421000F" w:tentative="1">
+      <w:start w:val="1"/>
+      <w:numFmt w:val="decimal"/>
+      <w:lvlText w:val="%4."/>
+      <w:lvlJc w:val="left"/>
+      <w:pPr>
+        <w:ind w:left="3240" w:hanging="360"/>
+      </w:pPr>
+    </w:lvl>
+    <w:lvl w:ilvl="4" w:tplc="04210019" w:tentative="1">
+      <w:start w:val="1"/>
+      <w:numFmt w:val="lowerLetter"/>
+      <w:lvlText w:val="%5."/>
+      <w:lvlJc w:val="left"/>
+      <w:pPr>
+        <w:ind w:left="3960" w:hanging="360"/>
+      </w:pPr>
+    </w:lvl>
+    <w:lvl w:ilvl="5" w:tplc="0421001B" w:tentative="1">
+      <w:start w:val="1"/>
+      <w:numFmt w:val="lowerRoman"/>
+      <w:lvlText w:val="%6."/>
+      <w:lvlJc w:val="right"/>
+      <w:pPr>
+        <w:ind w:left="4680" w:hanging="180"/>
+      </w:pPr>
+    </w:lvl>
+    <w:lvl w:ilvl="6" w:tplc="0421000F" w:tentative="1">
+      <w:start w:val="1"/>
+      <w:numFmt w:val="decimal"/>
+      <w:lvlText w:val="%7."/>
+      <w:lvlJc w:val="left"/>
+      <w:pPr>
+        <w:ind w:left="5400" w:hanging="360"/>
+      </w:pPr>
+    </w:lvl>
+    <w:lvl w:ilvl="7" w:tplc="04210019" w:tentative="1">
+      <w:start w:val="1"/>
+      <w:numFmt w:val="lowerLetter"/>
+      <w:lvlText w:val="%8."/>
+      <w:lvlJc w:val="left"/>
+      <w:pPr>
+        <w:ind w:left="6120" w:hanging="360"/>
+      </w:pPr>
+    </w:lvl>
+    <w:lvl w:ilvl="8" w:tplc="0421001B" w:tentative="1">
+      <w:start w:val="1"/>
+      <w:numFmt w:val="lowerRoman"/>
+      <w:lvlText w:val="%9."/>
+      <w:lvlJc w:val="right"/>
+      <w:pPr>
+        <w:ind w:left="6840" w:hanging="180"/>
+      </w:pPr>
+    </w:lvl>
+  </w:abstractNum>
+  <w:abstractNum w:abstractNumId="1" w15:restartNumberingAfterBreak="0">
     <w:nsid w:val="012E624C"/>
     <w:multiLevelType w:val="hybridMultilevel"/>
     <w:tmpl w:val="FFCAB140"/>
@@ -1461,7 +2780,93 @@
       </w:pPr>
     </w:lvl>
   </w:abstractNum>
-  <w:abstractNum w:abstractNumId="1" w15:restartNumberingAfterBreak="0">
+  <w:abstractNum w:abstractNumId="2" w15:restartNumberingAfterBreak="0">
+    <w:nsid w:val="02313E38"/>
+    <w:multiLevelType w:val="hybridMultilevel"/>
+    <w:tmpl w:val="433821D6"/>
+    <w:lvl w:ilvl="0" w:tplc="04210019">
+      <w:start w:val="1"/>
+      <w:numFmt w:val="lowerLetter"/>
+      <w:lvlText w:val="%1."/>
+      <w:lvlJc w:val="left"/>
+      <w:pPr>
+        <w:ind w:left="1440" w:hanging="360"/>
+      </w:pPr>
+    </w:lvl>
+    <w:lvl w:ilvl="1" w:tplc="04210019" w:tentative="1">
+      <w:start w:val="1"/>
+      <w:numFmt w:val="lowerLetter"/>
+      <w:lvlText w:val="%2."/>
+      <w:lvlJc w:val="left"/>
+      <w:pPr>
+        <w:ind w:left="2160" w:hanging="360"/>
+      </w:pPr>
+    </w:lvl>
+    <w:lvl w:ilvl="2" w:tplc="0421001B" w:tentative="1">
+      <w:start w:val="1"/>
+      <w:numFmt w:val="lowerRoman"/>
+      <w:lvlText w:val="%3."/>
+      <w:lvlJc w:val="right"/>
+      <w:pPr>
+        <w:ind w:left="2880" w:hanging="180"/>
+      </w:pPr>
+    </w:lvl>
+    <w:lvl w:ilvl="3" w:tplc="0421000F" w:tentative="1">
+      <w:start w:val="1"/>
+      <w:numFmt w:val="decimal"/>
+      <w:lvlText w:val="%4."/>
+      <w:lvlJc w:val="left"/>
+      <w:pPr>
+        <w:ind w:left="3600" w:hanging="360"/>
+      </w:pPr>
+    </w:lvl>
+    <w:lvl w:ilvl="4" w:tplc="04210019" w:tentative="1">
+      <w:start w:val="1"/>
+      <w:numFmt w:val="lowerLetter"/>
+      <w:lvlText w:val="%5."/>
+      <w:lvlJc w:val="left"/>
+      <w:pPr>
+        <w:ind w:left="4320" w:hanging="360"/>
+      </w:pPr>
+    </w:lvl>
+    <w:lvl w:ilvl="5" w:tplc="0421001B" w:tentative="1">
+      <w:start w:val="1"/>
+      <w:numFmt w:val="lowerRoman"/>
+      <w:lvlText w:val="%6."/>
+      <w:lvlJc w:val="right"/>
+      <w:pPr>
+        <w:ind w:left="5040" w:hanging="180"/>
+      </w:pPr>
+    </w:lvl>
+    <w:lvl w:ilvl="6" w:tplc="0421000F" w:tentative="1">
+      <w:start w:val="1"/>
+      <w:numFmt w:val="decimal"/>
+      <w:lvlText w:val="%7."/>
+      <w:lvlJc w:val="left"/>
+      <w:pPr>
+        <w:ind w:left="5760" w:hanging="360"/>
+      </w:pPr>
+    </w:lvl>
+    <w:lvl w:ilvl="7" w:tplc="04210019" w:tentative="1">
+      <w:start w:val="1"/>
+      <w:numFmt w:val="lowerLetter"/>
+      <w:lvlText w:val="%8."/>
+      <w:lvlJc w:val="left"/>
+      <w:pPr>
+        <w:ind w:left="6480" w:hanging="360"/>
+      </w:pPr>
+    </w:lvl>
+    <w:lvl w:ilvl="8" w:tplc="0421001B" w:tentative="1">
+      <w:start w:val="1"/>
+      <w:numFmt w:val="lowerRoman"/>
+      <w:lvlText w:val="%9."/>
+      <w:lvlJc w:val="right"/>
+      <w:pPr>
+        <w:ind w:left="7200" w:hanging="180"/>
+      </w:pPr>
+    </w:lvl>
+  </w:abstractNum>
+  <w:abstractNum w:abstractNumId="3" w15:restartNumberingAfterBreak="0">
     <w:nsid w:val="02A1024A"/>
     <w:multiLevelType w:val="hybridMultilevel"/>
     <w:tmpl w:val="ACE2E634"/>
@@ -1550,7 +2955,7 @@
       </w:pPr>
     </w:lvl>
   </w:abstractNum>
-  <w:abstractNum w:abstractNumId="2" w15:restartNumberingAfterBreak="0">
+  <w:abstractNum w:abstractNumId="4" w15:restartNumberingAfterBreak="0">
     <w:nsid w:val="09BA66C7"/>
     <w:multiLevelType w:val="hybridMultilevel"/>
     <w:tmpl w:val="76AC4712"/>
@@ -1639,7 +3044,93 @@
       </w:pPr>
     </w:lvl>
   </w:abstractNum>
-  <w:abstractNum w:abstractNumId="3" w15:restartNumberingAfterBreak="0">
+  <w:abstractNum w:abstractNumId="5" w15:restartNumberingAfterBreak="0">
+    <w:nsid w:val="0FD640E2"/>
+    <w:multiLevelType w:val="hybridMultilevel"/>
+    <w:tmpl w:val="B96CDC0C"/>
+    <w:lvl w:ilvl="0" w:tplc="04210019">
+      <w:start w:val="1"/>
+      <w:numFmt w:val="lowerLetter"/>
+      <w:lvlText w:val="%1."/>
+      <w:lvlJc w:val="left"/>
+      <w:pPr>
+        <w:ind w:left="1440" w:hanging="360"/>
+      </w:pPr>
+    </w:lvl>
+    <w:lvl w:ilvl="1" w:tplc="04210019" w:tentative="1">
+      <w:start w:val="1"/>
+      <w:numFmt w:val="lowerLetter"/>
+      <w:lvlText w:val="%2."/>
+      <w:lvlJc w:val="left"/>
+      <w:pPr>
+        <w:ind w:left="2160" w:hanging="360"/>
+      </w:pPr>
+    </w:lvl>
+    <w:lvl w:ilvl="2" w:tplc="0421001B" w:tentative="1">
+      <w:start w:val="1"/>
+      <w:numFmt w:val="lowerRoman"/>
+      <w:lvlText w:val="%3."/>
+      <w:lvlJc w:val="right"/>
+      <w:pPr>
+        <w:ind w:left="2880" w:hanging="180"/>
+      </w:pPr>
+    </w:lvl>
+    <w:lvl w:ilvl="3" w:tplc="0421000F" w:tentative="1">
+      <w:start w:val="1"/>
+      <w:numFmt w:val="decimal"/>
+      <w:lvlText w:val="%4."/>
+      <w:lvlJc w:val="left"/>
+      <w:pPr>
+        <w:ind w:left="3600" w:hanging="360"/>
+      </w:pPr>
+    </w:lvl>
+    <w:lvl w:ilvl="4" w:tplc="04210019" w:tentative="1">
+      <w:start w:val="1"/>
+      <w:numFmt w:val="lowerLetter"/>
+      <w:lvlText w:val="%5."/>
+      <w:lvlJc w:val="left"/>
+      <w:pPr>
+        <w:ind w:left="4320" w:hanging="360"/>
+      </w:pPr>
+    </w:lvl>
+    <w:lvl w:ilvl="5" w:tplc="0421001B" w:tentative="1">
+      <w:start w:val="1"/>
+      <w:numFmt w:val="lowerRoman"/>
+      <w:lvlText w:val="%6."/>
+      <w:lvlJc w:val="right"/>
+      <w:pPr>
+        <w:ind w:left="5040" w:hanging="180"/>
+      </w:pPr>
+    </w:lvl>
+    <w:lvl w:ilvl="6" w:tplc="0421000F" w:tentative="1">
+      <w:start w:val="1"/>
+      <w:numFmt w:val="decimal"/>
+      <w:lvlText w:val="%7."/>
+      <w:lvlJc w:val="left"/>
+      <w:pPr>
+        <w:ind w:left="5760" w:hanging="360"/>
+      </w:pPr>
+    </w:lvl>
+    <w:lvl w:ilvl="7" w:tplc="04210019" w:tentative="1">
+      <w:start w:val="1"/>
+      <w:numFmt w:val="lowerLetter"/>
+      <w:lvlText w:val="%8."/>
+      <w:lvlJc w:val="left"/>
+      <w:pPr>
+        <w:ind w:left="6480" w:hanging="360"/>
+      </w:pPr>
+    </w:lvl>
+    <w:lvl w:ilvl="8" w:tplc="0421001B" w:tentative="1">
+      <w:start w:val="1"/>
+      <w:numFmt w:val="lowerRoman"/>
+      <w:lvlText w:val="%9."/>
+      <w:lvlJc w:val="right"/>
+      <w:pPr>
+        <w:ind w:left="7200" w:hanging="180"/>
+      </w:pPr>
+    </w:lvl>
+  </w:abstractNum>
+  <w:abstractNum w:abstractNumId="6" w15:restartNumberingAfterBreak="0">
     <w:nsid w:val="16015FAC"/>
     <w:multiLevelType w:val="hybridMultilevel"/>
     <w:tmpl w:val="62EC82EC"/>
@@ -1728,7 +3219,7 @@
       </w:pPr>
     </w:lvl>
   </w:abstractNum>
-  <w:abstractNum w:abstractNumId="4" w15:restartNumberingAfterBreak="0">
+  <w:abstractNum w:abstractNumId="7" w15:restartNumberingAfterBreak="0">
     <w:nsid w:val="1885490B"/>
     <w:multiLevelType w:val="hybridMultilevel"/>
     <w:tmpl w:val="CD0E4852"/>
@@ -1817,7 +3308,7 @@
       </w:pPr>
     </w:lvl>
   </w:abstractNum>
-  <w:abstractNum w:abstractNumId="5" w15:restartNumberingAfterBreak="0">
+  <w:abstractNum w:abstractNumId="8" w15:restartNumberingAfterBreak="0">
     <w:nsid w:val="1B0D658B"/>
     <w:multiLevelType w:val="hybridMultilevel"/>
     <w:tmpl w:val="5EDC8BCE"/>
@@ -1907,7 +3398,7 @@
       </w:pPr>
     </w:lvl>
   </w:abstractNum>
-  <w:abstractNum w:abstractNumId="6" w15:restartNumberingAfterBreak="0">
+  <w:abstractNum w:abstractNumId="9" w15:restartNumberingAfterBreak="0">
     <w:nsid w:val="1B710127"/>
     <w:multiLevelType w:val="hybridMultilevel"/>
     <w:tmpl w:val="99C23084"/>
@@ -1996,7 +3487,7 @@
       </w:pPr>
     </w:lvl>
   </w:abstractNum>
-  <w:abstractNum w:abstractNumId="7" w15:restartNumberingAfterBreak="0">
+  <w:abstractNum w:abstractNumId="10" w15:restartNumberingAfterBreak="0">
     <w:nsid w:val="1CA77775"/>
     <w:multiLevelType w:val="hybridMultilevel"/>
     <w:tmpl w:val="9A7043B2"/>
@@ -2085,7 +3576,7 @@
       </w:pPr>
     </w:lvl>
   </w:abstractNum>
-  <w:abstractNum w:abstractNumId="8" w15:restartNumberingAfterBreak="0">
+  <w:abstractNum w:abstractNumId="11" w15:restartNumberingAfterBreak="0">
     <w:nsid w:val="200768D7"/>
     <w:multiLevelType w:val="hybridMultilevel"/>
     <w:tmpl w:val="62EC82EC"/>
@@ -2174,7 +3665,7 @@
       </w:pPr>
     </w:lvl>
   </w:abstractNum>
-  <w:abstractNum w:abstractNumId="9" w15:restartNumberingAfterBreak="0">
+  <w:abstractNum w:abstractNumId="12" w15:restartNumberingAfterBreak="0">
     <w:nsid w:val="20896B2F"/>
     <w:multiLevelType w:val="hybridMultilevel"/>
     <w:tmpl w:val="06FEC19C"/>
@@ -2263,7 +3754,268 @@
       </w:pPr>
     </w:lvl>
   </w:abstractNum>
-  <w:abstractNum w:abstractNumId="10" w15:restartNumberingAfterBreak="0">
+  <w:abstractNum w:abstractNumId="13" w15:restartNumberingAfterBreak="0">
+    <w:nsid w:val="22845652"/>
+    <w:multiLevelType w:val="hybridMultilevel"/>
+    <w:tmpl w:val="88C46ADA"/>
+    <w:lvl w:ilvl="0" w:tplc="04210019">
+      <w:start w:val="1"/>
+      <w:numFmt w:val="lowerLetter"/>
+      <w:lvlText w:val="%1."/>
+      <w:lvlJc w:val="left"/>
+      <w:pPr>
+        <w:ind w:left="1440" w:hanging="360"/>
+      </w:pPr>
+    </w:lvl>
+    <w:lvl w:ilvl="1" w:tplc="04210019" w:tentative="1">
+      <w:start w:val="1"/>
+      <w:numFmt w:val="lowerLetter"/>
+      <w:lvlText w:val="%2."/>
+      <w:lvlJc w:val="left"/>
+      <w:pPr>
+        <w:ind w:left="2160" w:hanging="360"/>
+      </w:pPr>
+    </w:lvl>
+    <w:lvl w:ilvl="2" w:tplc="0421001B" w:tentative="1">
+      <w:start w:val="1"/>
+      <w:numFmt w:val="lowerRoman"/>
+      <w:lvlText w:val="%3."/>
+      <w:lvlJc w:val="right"/>
+      <w:pPr>
+        <w:ind w:left="2880" w:hanging="180"/>
+      </w:pPr>
+    </w:lvl>
+    <w:lvl w:ilvl="3" w:tplc="0421000F" w:tentative="1">
+      <w:start w:val="1"/>
+      <w:numFmt w:val="decimal"/>
+      <w:lvlText w:val="%4."/>
+      <w:lvlJc w:val="left"/>
+      <w:pPr>
+        <w:ind w:left="3600" w:hanging="360"/>
+      </w:pPr>
+    </w:lvl>
+    <w:lvl w:ilvl="4" w:tplc="04210019" w:tentative="1">
+      <w:start w:val="1"/>
+      <w:numFmt w:val="lowerLetter"/>
+      <w:lvlText w:val="%5."/>
+      <w:lvlJc w:val="left"/>
+      <w:pPr>
+        <w:ind w:left="4320" w:hanging="360"/>
+      </w:pPr>
+    </w:lvl>
+    <w:lvl w:ilvl="5" w:tplc="0421001B" w:tentative="1">
+      <w:start w:val="1"/>
+      <w:numFmt w:val="lowerRoman"/>
+      <w:lvlText w:val="%6."/>
+      <w:lvlJc w:val="right"/>
+      <w:pPr>
+        <w:ind w:left="5040" w:hanging="180"/>
+      </w:pPr>
+    </w:lvl>
+    <w:lvl w:ilvl="6" w:tplc="0421000F" w:tentative="1">
+      <w:start w:val="1"/>
+      <w:numFmt w:val="decimal"/>
+      <w:lvlText w:val="%7."/>
+      <w:lvlJc w:val="left"/>
+      <w:pPr>
+        <w:ind w:left="5760" w:hanging="360"/>
+      </w:pPr>
+    </w:lvl>
+    <w:lvl w:ilvl="7" w:tplc="04210019" w:tentative="1">
+      <w:start w:val="1"/>
+      <w:numFmt w:val="lowerLetter"/>
+      <w:lvlText w:val="%8."/>
+      <w:lvlJc w:val="left"/>
+      <w:pPr>
+        <w:ind w:left="6480" w:hanging="360"/>
+      </w:pPr>
+    </w:lvl>
+    <w:lvl w:ilvl="8" w:tplc="0421001B" w:tentative="1">
+      <w:start w:val="1"/>
+      <w:numFmt w:val="lowerRoman"/>
+      <w:lvlText w:val="%9."/>
+      <w:lvlJc w:val="right"/>
+      <w:pPr>
+        <w:ind w:left="7200" w:hanging="180"/>
+      </w:pPr>
+    </w:lvl>
+  </w:abstractNum>
+  <w:abstractNum w:abstractNumId="14" w15:restartNumberingAfterBreak="0">
+    <w:nsid w:val="2CFB6027"/>
+    <w:multiLevelType w:val="hybridMultilevel"/>
+    <w:tmpl w:val="3EDC006E"/>
+    <w:lvl w:ilvl="0" w:tplc="6F6607A2">
+      <w:start w:val="1"/>
+      <w:numFmt w:val="decimal"/>
+      <w:lvlText w:val="%1."/>
+      <w:lvlJc w:val="left"/>
+      <w:pPr>
+        <w:ind w:left="1080" w:hanging="360"/>
+      </w:pPr>
+      <w:rPr>
+        <w:rFonts w:hint="default"/>
+      </w:rPr>
+    </w:lvl>
+    <w:lvl w:ilvl="1" w:tplc="04210019">
+      <w:start w:val="1"/>
+      <w:numFmt w:val="lowerLetter"/>
+      <w:lvlText w:val="%2."/>
+      <w:lvlJc w:val="left"/>
+      <w:pPr>
+        <w:ind w:left="1800" w:hanging="360"/>
+      </w:pPr>
+    </w:lvl>
+    <w:lvl w:ilvl="2" w:tplc="0421001B" w:tentative="1">
+      <w:start w:val="1"/>
+      <w:numFmt w:val="lowerRoman"/>
+      <w:lvlText w:val="%3."/>
+      <w:lvlJc w:val="right"/>
+      <w:pPr>
+        <w:ind w:left="2520" w:hanging="180"/>
+      </w:pPr>
+    </w:lvl>
+    <w:lvl w:ilvl="3" w:tplc="0421000F" w:tentative="1">
+      <w:start w:val="1"/>
+      <w:numFmt w:val="decimal"/>
+      <w:lvlText w:val="%4."/>
+      <w:lvlJc w:val="left"/>
+      <w:pPr>
+        <w:ind w:left="3240" w:hanging="360"/>
+      </w:pPr>
+    </w:lvl>
+    <w:lvl w:ilvl="4" w:tplc="04210019" w:tentative="1">
+      <w:start w:val="1"/>
+      <w:numFmt w:val="lowerLetter"/>
+      <w:lvlText w:val="%5."/>
+      <w:lvlJc w:val="left"/>
+      <w:pPr>
+        <w:ind w:left="3960" w:hanging="360"/>
+      </w:pPr>
+    </w:lvl>
+    <w:lvl w:ilvl="5" w:tplc="0421001B" w:tentative="1">
+      <w:start w:val="1"/>
+      <w:numFmt w:val="lowerRoman"/>
+      <w:lvlText w:val="%6."/>
+      <w:lvlJc w:val="right"/>
+      <w:pPr>
+        <w:ind w:left="4680" w:hanging="180"/>
+      </w:pPr>
+    </w:lvl>
+    <w:lvl w:ilvl="6" w:tplc="0421000F" w:tentative="1">
+      <w:start w:val="1"/>
+      <w:numFmt w:val="decimal"/>
+      <w:lvlText w:val="%7."/>
+      <w:lvlJc w:val="left"/>
+      <w:pPr>
+        <w:ind w:left="5400" w:hanging="360"/>
+      </w:pPr>
+    </w:lvl>
+    <w:lvl w:ilvl="7" w:tplc="04210019" w:tentative="1">
+      <w:start w:val="1"/>
+      <w:numFmt w:val="lowerLetter"/>
+      <w:lvlText w:val="%8."/>
+      <w:lvlJc w:val="left"/>
+      <w:pPr>
+        <w:ind w:left="6120" w:hanging="360"/>
+      </w:pPr>
+    </w:lvl>
+    <w:lvl w:ilvl="8" w:tplc="0421001B" w:tentative="1">
+      <w:start w:val="1"/>
+      <w:numFmt w:val="lowerRoman"/>
+      <w:lvlText w:val="%9."/>
+      <w:lvlJc w:val="right"/>
+      <w:pPr>
+        <w:ind w:left="6840" w:hanging="180"/>
+      </w:pPr>
+    </w:lvl>
+  </w:abstractNum>
+  <w:abstractNum w:abstractNumId="15" w15:restartNumberingAfterBreak="0">
+    <w:nsid w:val="2DE31381"/>
+    <w:multiLevelType w:val="hybridMultilevel"/>
+    <w:tmpl w:val="F148044C"/>
+    <w:lvl w:ilvl="0" w:tplc="08BEC2B8">
+      <w:start w:val="1"/>
+      <w:numFmt w:val="decimal"/>
+      <w:lvlText w:val="%1."/>
+      <w:lvlJc w:val="left"/>
+      <w:pPr>
+        <w:ind w:left="1080" w:hanging="360"/>
+      </w:pPr>
+    </w:lvl>
+    <w:lvl w:ilvl="1" w:tplc="04210019" w:tentative="1">
+      <w:start w:val="1"/>
+      <w:numFmt w:val="lowerLetter"/>
+      <w:lvlText w:val="%2."/>
+      <w:lvlJc w:val="left"/>
+      <w:pPr>
+        <w:ind w:left="1800" w:hanging="360"/>
+      </w:pPr>
+    </w:lvl>
+    <w:lvl w:ilvl="2" w:tplc="0421001B" w:tentative="1">
+      <w:start w:val="1"/>
+      <w:numFmt w:val="lowerRoman"/>
+      <w:lvlText w:val="%3."/>
+      <w:lvlJc w:val="right"/>
+      <w:pPr>
+        <w:ind w:left="2520" w:hanging="180"/>
+      </w:pPr>
+    </w:lvl>
+    <w:lvl w:ilvl="3" w:tplc="0421000F" w:tentative="1">
+      <w:start w:val="1"/>
+      <w:numFmt w:val="decimal"/>
+      <w:lvlText w:val="%4."/>
+      <w:lvlJc w:val="left"/>
+      <w:pPr>
+        <w:ind w:left="3240" w:hanging="360"/>
+      </w:pPr>
+    </w:lvl>
+    <w:lvl w:ilvl="4" w:tplc="04210019" w:tentative="1">
+      <w:start w:val="1"/>
+      <w:numFmt w:val="lowerLetter"/>
+      <w:lvlText w:val="%5."/>
+      <w:lvlJc w:val="left"/>
+      <w:pPr>
+        <w:ind w:left="3960" w:hanging="360"/>
+      </w:pPr>
+    </w:lvl>
+    <w:lvl w:ilvl="5" w:tplc="0421001B" w:tentative="1">
+      <w:start w:val="1"/>
+      <w:numFmt w:val="lowerRoman"/>
+      <w:lvlText w:val="%6."/>
+      <w:lvlJc w:val="right"/>
+      <w:pPr>
+        <w:ind w:left="4680" w:hanging="180"/>
+      </w:pPr>
+    </w:lvl>
+    <w:lvl w:ilvl="6" w:tplc="0421000F" w:tentative="1">
+      <w:start w:val="1"/>
+      <w:numFmt w:val="decimal"/>
+      <w:lvlText w:val="%7."/>
+      <w:lvlJc w:val="left"/>
+      <w:pPr>
+        <w:ind w:left="5400" w:hanging="360"/>
+      </w:pPr>
+    </w:lvl>
+    <w:lvl w:ilvl="7" w:tplc="04210019" w:tentative="1">
+      <w:start w:val="1"/>
+      <w:numFmt w:val="lowerLetter"/>
+      <w:lvlText w:val="%8."/>
+      <w:lvlJc w:val="left"/>
+      <w:pPr>
+        <w:ind w:left="6120" w:hanging="360"/>
+      </w:pPr>
+    </w:lvl>
+    <w:lvl w:ilvl="8" w:tplc="0421001B" w:tentative="1">
+      <w:start w:val="1"/>
+      <w:numFmt w:val="lowerRoman"/>
+      <w:lvlText w:val="%9."/>
+      <w:lvlJc w:val="right"/>
+      <w:pPr>
+        <w:ind w:left="6840" w:hanging="180"/>
+      </w:pPr>
+    </w:lvl>
+  </w:abstractNum>
+  <w:abstractNum w:abstractNumId="16" w15:restartNumberingAfterBreak="0">
     <w:nsid w:val="367D0644"/>
     <w:multiLevelType w:val="hybridMultilevel"/>
     <w:tmpl w:val="EB7EF2F2"/>
@@ -2352,7 +4104,7 @@
       </w:pPr>
     </w:lvl>
   </w:abstractNum>
-  <w:abstractNum w:abstractNumId="11" w15:restartNumberingAfterBreak="0">
+  <w:abstractNum w:abstractNumId="17" w15:restartNumberingAfterBreak="0">
     <w:nsid w:val="38C93393"/>
     <w:multiLevelType w:val="hybridMultilevel"/>
     <w:tmpl w:val="FED28302"/>
@@ -2442,7 +4194,7 @@
       </w:pPr>
     </w:lvl>
   </w:abstractNum>
-  <w:abstractNum w:abstractNumId="12" w15:restartNumberingAfterBreak="0">
+  <w:abstractNum w:abstractNumId="18" w15:restartNumberingAfterBreak="0">
     <w:nsid w:val="3C860F25"/>
     <w:multiLevelType w:val="hybridMultilevel"/>
     <w:tmpl w:val="16924BB8"/>
@@ -2531,7 +4283,7 @@
       </w:pPr>
     </w:lvl>
   </w:abstractNum>
-  <w:abstractNum w:abstractNumId="13" w15:restartNumberingAfterBreak="0">
+  <w:abstractNum w:abstractNumId="19" w15:restartNumberingAfterBreak="0">
     <w:nsid w:val="3D4D6AC1"/>
     <w:multiLevelType w:val="hybridMultilevel"/>
     <w:tmpl w:val="C518CA2C"/>
@@ -2620,7 +4372,96 @@
       </w:pPr>
     </w:lvl>
   </w:abstractNum>
-  <w:abstractNum w:abstractNumId="14" w15:restartNumberingAfterBreak="0">
+  <w:abstractNum w:abstractNumId="20" w15:restartNumberingAfterBreak="0">
+    <w:nsid w:val="42C40896"/>
+    <w:multiLevelType w:val="hybridMultilevel"/>
+    <w:tmpl w:val="6D664C72"/>
+    <w:lvl w:ilvl="0" w:tplc="1CAEBFF4">
+      <w:start w:val="1"/>
+      <w:numFmt w:val="decimal"/>
+      <w:lvlText w:val="%1."/>
+      <w:lvlJc w:val="left"/>
+      <w:pPr>
+        <w:ind w:left="1080" w:hanging="360"/>
+      </w:pPr>
+      <w:rPr>
+        <w:rFonts w:hint="default"/>
+      </w:rPr>
+    </w:lvl>
+    <w:lvl w:ilvl="1" w:tplc="04210019" w:tentative="1">
+      <w:start w:val="1"/>
+      <w:numFmt w:val="lowerLetter"/>
+      <w:lvlText w:val="%2."/>
+      <w:lvlJc w:val="left"/>
+      <w:pPr>
+        <w:ind w:left="1800" w:hanging="360"/>
+      </w:pPr>
+    </w:lvl>
+    <w:lvl w:ilvl="2" w:tplc="0421001B" w:tentative="1">
+      <w:start w:val="1"/>
+      <w:numFmt w:val="lowerRoman"/>
+      <w:lvlText w:val="%3."/>
+      <w:lvlJc w:val="right"/>
+      <w:pPr>
+        <w:ind w:left="2520" w:hanging="180"/>
+      </w:pPr>
+    </w:lvl>
+    <w:lvl w:ilvl="3" w:tplc="0421000F" w:tentative="1">
+      <w:start w:val="1"/>
+      <w:numFmt w:val="decimal"/>
+      <w:lvlText w:val="%4."/>
+      <w:lvlJc w:val="left"/>
+      <w:pPr>
+        <w:ind w:left="3240" w:hanging="360"/>
+      </w:pPr>
+    </w:lvl>
+    <w:lvl w:ilvl="4" w:tplc="04210019" w:tentative="1">
+      <w:start w:val="1"/>
+      <w:numFmt w:val="lowerLetter"/>
+      <w:lvlText w:val="%5."/>
+      <w:lvlJc w:val="left"/>
+      <w:pPr>
+        <w:ind w:left="3960" w:hanging="360"/>
+      </w:pPr>
+    </w:lvl>
+    <w:lvl w:ilvl="5" w:tplc="0421001B" w:tentative="1">
+      <w:start w:val="1"/>
+      <w:numFmt w:val="lowerRoman"/>
+      <w:lvlText w:val="%6."/>
+      <w:lvlJc w:val="right"/>
+      <w:pPr>
+        <w:ind w:left="4680" w:hanging="180"/>
+      </w:pPr>
+    </w:lvl>
+    <w:lvl w:ilvl="6" w:tplc="0421000F" w:tentative="1">
+      <w:start w:val="1"/>
+      <w:numFmt w:val="decimal"/>
+      <w:lvlText w:val="%7."/>
+      <w:lvlJc w:val="left"/>
+      <w:pPr>
+        <w:ind w:left="5400" w:hanging="360"/>
+      </w:pPr>
+    </w:lvl>
+    <w:lvl w:ilvl="7" w:tplc="04210019" w:tentative="1">
+      <w:start w:val="1"/>
+      <w:numFmt w:val="lowerLetter"/>
+      <w:lvlText w:val="%8."/>
+      <w:lvlJc w:val="left"/>
+      <w:pPr>
+        <w:ind w:left="6120" w:hanging="360"/>
+      </w:pPr>
+    </w:lvl>
+    <w:lvl w:ilvl="8" w:tplc="0421001B" w:tentative="1">
+      <w:start w:val="1"/>
+      <w:numFmt w:val="lowerRoman"/>
+      <w:lvlText w:val="%9."/>
+      <w:lvlJc w:val="right"/>
+      <w:pPr>
+        <w:ind w:left="6840" w:hanging="180"/>
+      </w:pPr>
+    </w:lvl>
+  </w:abstractNum>
+  <w:abstractNum w:abstractNumId="21" w15:restartNumberingAfterBreak="0">
     <w:nsid w:val="43350838"/>
     <w:multiLevelType w:val="hybridMultilevel"/>
     <w:tmpl w:val="CB088636"/>
@@ -2709,7 +4550,7 @@
       </w:pPr>
     </w:lvl>
   </w:abstractNum>
-  <w:abstractNum w:abstractNumId="15" w15:restartNumberingAfterBreak="0">
+  <w:abstractNum w:abstractNumId="22" w15:restartNumberingAfterBreak="0">
     <w:nsid w:val="4FDE34DC"/>
     <w:multiLevelType w:val="hybridMultilevel"/>
     <w:tmpl w:val="4A10B99C"/>
@@ -2798,7 +4639,7 @@
       </w:pPr>
     </w:lvl>
   </w:abstractNum>
-  <w:abstractNum w:abstractNumId="16" w15:restartNumberingAfterBreak="0">
+  <w:abstractNum w:abstractNumId="23" w15:restartNumberingAfterBreak="0">
     <w:nsid w:val="643C1DA0"/>
     <w:multiLevelType w:val="hybridMultilevel"/>
     <w:tmpl w:val="D9ECC6BE"/>
@@ -2887,7 +4728,7 @@
       </w:pPr>
     </w:lvl>
   </w:abstractNum>
-  <w:abstractNum w:abstractNumId="17" w15:restartNumberingAfterBreak="0">
+  <w:abstractNum w:abstractNumId="24" w15:restartNumberingAfterBreak="0">
     <w:nsid w:val="678B1320"/>
     <w:multiLevelType w:val="hybridMultilevel"/>
     <w:tmpl w:val="27E61AAC"/>
@@ -2976,7 +4817,179 @@
       </w:pPr>
     </w:lvl>
   </w:abstractNum>
-  <w:abstractNum w:abstractNumId="18" w15:restartNumberingAfterBreak="0">
+  <w:abstractNum w:abstractNumId="25" w15:restartNumberingAfterBreak="0">
+    <w:nsid w:val="6B805D93"/>
+    <w:multiLevelType w:val="hybridMultilevel"/>
+    <w:tmpl w:val="1F40294E"/>
+    <w:lvl w:ilvl="0" w:tplc="04210019">
+      <w:start w:val="1"/>
+      <w:numFmt w:val="lowerLetter"/>
+      <w:lvlText w:val="%1."/>
+      <w:lvlJc w:val="left"/>
+      <w:pPr>
+        <w:ind w:left="1440" w:hanging="360"/>
+      </w:pPr>
+    </w:lvl>
+    <w:lvl w:ilvl="1" w:tplc="04210019" w:tentative="1">
+      <w:start w:val="1"/>
+      <w:numFmt w:val="lowerLetter"/>
+      <w:lvlText w:val="%2."/>
+      <w:lvlJc w:val="left"/>
+      <w:pPr>
+        <w:ind w:left="2160" w:hanging="360"/>
+      </w:pPr>
+    </w:lvl>
+    <w:lvl w:ilvl="2" w:tplc="0421001B" w:tentative="1">
+      <w:start w:val="1"/>
+      <w:numFmt w:val="lowerRoman"/>
+      <w:lvlText w:val="%3."/>
+      <w:lvlJc w:val="right"/>
+      <w:pPr>
+        <w:ind w:left="2880" w:hanging="180"/>
+      </w:pPr>
+    </w:lvl>
+    <w:lvl w:ilvl="3" w:tplc="0421000F" w:tentative="1">
+      <w:start w:val="1"/>
+      <w:numFmt w:val="decimal"/>
+      <w:lvlText w:val="%4."/>
+      <w:lvlJc w:val="left"/>
+      <w:pPr>
+        <w:ind w:left="3600" w:hanging="360"/>
+      </w:pPr>
+    </w:lvl>
+    <w:lvl w:ilvl="4" w:tplc="04210019" w:tentative="1">
+      <w:start w:val="1"/>
+      <w:numFmt w:val="lowerLetter"/>
+      <w:lvlText w:val="%5."/>
+      <w:lvlJc w:val="left"/>
+      <w:pPr>
+        <w:ind w:left="4320" w:hanging="360"/>
+      </w:pPr>
+    </w:lvl>
+    <w:lvl w:ilvl="5" w:tplc="0421001B" w:tentative="1">
+      <w:start w:val="1"/>
+      <w:numFmt w:val="lowerRoman"/>
+      <w:lvlText w:val="%6."/>
+      <w:lvlJc w:val="right"/>
+      <w:pPr>
+        <w:ind w:left="5040" w:hanging="180"/>
+      </w:pPr>
+    </w:lvl>
+    <w:lvl w:ilvl="6" w:tplc="0421000F" w:tentative="1">
+      <w:start w:val="1"/>
+      <w:numFmt w:val="decimal"/>
+      <w:lvlText w:val="%7."/>
+      <w:lvlJc w:val="left"/>
+      <w:pPr>
+        <w:ind w:left="5760" w:hanging="360"/>
+      </w:pPr>
+    </w:lvl>
+    <w:lvl w:ilvl="7" w:tplc="04210019" w:tentative="1">
+      <w:start w:val="1"/>
+      <w:numFmt w:val="lowerLetter"/>
+      <w:lvlText w:val="%8."/>
+      <w:lvlJc w:val="left"/>
+      <w:pPr>
+        <w:ind w:left="6480" w:hanging="360"/>
+      </w:pPr>
+    </w:lvl>
+    <w:lvl w:ilvl="8" w:tplc="0421001B" w:tentative="1">
+      <w:start w:val="1"/>
+      <w:numFmt w:val="lowerRoman"/>
+      <w:lvlText w:val="%9."/>
+      <w:lvlJc w:val="right"/>
+      <w:pPr>
+        <w:ind w:left="7200" w:hanging="180"/>
+      </w:pPr>
+    </w:lvl>
+  </w:abstractNum>
+  <w:abstractNum w:abstractNumId="26" w15:restartNumberingAfterBreak="0">
+    <w:nsid w:val="71E06B04"/>
+    <w:multiLevelType w:val="hybridMultilevel"/>
+    <w:tmpl w:val="68BC93CE"/>
+    <w:lvl w:ilvl="0" w:tplc="0421000F">
+      <w:start w:val="1"/>
+      <w:numFmt w:val="decimal"/>
+      <w:lvlText w:val="%1."/>
+      <w:lvlJc w:val="left"/>
+      <w:pPr>
+        <w:ind w:left="1080" w:hanging="360"/>
+      </w:pPr>
+    </w:lvl>
+    <w:lvl w:ilvl="1" w:tplc="04210019" w:tentative="1">
+      <w:start w:val="1"/>
+      <w:numFmt w:val="lowerLetter"/>
+      <w:lvlText w:val="%2."/>
+      <w:lvlJc w:val="left"/>
+      <w:pPr>
+        <w:ind w:left="1800" w:hanging="360"/>
+      </w:pPr>
+    </w:lvl>
+    <w:lvl w:ilvl="2" w:tplc="0421001B" w:tentative="1">
+      <w:start w:val="1"/>
+      <w:numFmt w:val="lowerRoman"/>
+      <w:lvlText w:val="%3."/>
+      <w:lvlJc w:val="right"/>
+      <w:pPr>
+        <w:ind w:left="2520" w:hanging="180"/>
+      </w:pPr>
+    </w:lvl>
+    <w:lvl w:ilvl="3" w:tplc="0421000F" w:tentative="1">
+      <w:start w:val="1"/>
+      <w:numFmt w:val="decimal"/>
+      <w:lvlText w:val="%4."/>
+      <w:lvlJc w:val="left"/>
+      <w:pPr>
+        <w:ind w:left="3240" w:hanging="360"/>
+      </w:pPr>
+    </w:lvl>
+    <w:lvl w:ilvl="4" w:tplc="04210019" w:tentative="1">
+      <w:start w:val="1"/>
+      <w:numFmt w:val="lowerLetter"/>
+      <w:lvlText w:val="%5."/>
+      <w:lvlJc w:val="left"/>
+      <w:pPr>
+        <w:ind w:left="3960" w:hanging="360"/>
+      </w:pPr>
+    </w:lvl>
+    <w:lvl w:ilvl="5" w:tplc="0421001B" w:tentative="1">
+      <w:start w:val="1"/>
+      <w:numFmt w:val="lowerRoman"/>
+      <w:lvlText w:val="%6."/>
+      <w:lvlJc w:val="right"/>
+      <w:pPr>
+        <w:ind w:left="4680" w:hanging="180"/>
+      </w:pPr>
+    </w:lvl>
+    <w:lvl w:ilvl="6" w:tplc="0421000F" w:tentative="1">
+      <w:start w:val="1"/>
+      <w:numFmt w:val="decimal"/>
+      <w:lvlText w:val="%7."/>
+      <w:lvlJc w:val="left"/>
+      <w:pPr>
+        <w:ind w:left="5400" w:hanging="360"/>
+      </w:pPr>
+    </w:lvl>
+    <w:lvl w:ilvl="7" w:tplc="04210019" w:tentative="1">
+      <w:start w:val="1"/>
+      <w:numFmt w:val="lowerLetter"/>
+      <w:lvlText w:val="%8."/>
+      <w:lvlJc w:val="left"/>
+      <w:pPr>
+        <w:ind w:left="6120" w:hanging="360"/>
+      </w:pPr>
+    </w:lvl>
+    <w:lvl w:ilvl="8" w:tplc="0421001B" w:tentative="1">
+      <w:start w:val="1"/>
+      <w:numFmt w:val="lowerRoman"/>
+      <w:lvlText w:val="%9."/>
+      <w:lvlJc w:val="right"/>
+      <w:pPr>
+        <w:ind w:left="6840" w:hanging="180"/>
+      </w:pPr>
+    </w:lvl>
+  </w:abstractNum>
+  <w:abstractNum w:abstractNumId="27" w15:restartNumberingAfterBreak="0">
     <w:nsid w:val="71FF1E5C"/>
     <w:multiLevelType w:val="hybridMultilevel"/>
     <w:tmpl w:val="F04064A2"/>
@@ -3065,7 +5078,96 @@
       </w:pPr>
     </w:lvl>
   </w:abstractNum>
-  <w:abstractNum w:abstractNumId="19" w15:restartNumberingAfterBreak="0">
+  <w:abstractNum w:abstractNumId="28" w15:restartNumberingAfterBreak="0">
+    <w:nsid w:val="722C621D"/>
+    <w:multiLevelType w:val="hybridMultilevel"/>
+    <w:tmpl w:val="593E1976"/>
+    <w:lvl w:ilvl="0" w:tplc="0421000F">
+      <w:start w:val="1"/>
+      <w:numFmt w:val="decimal"/>
+      <w:lvlText w:val="%1."/>
+      <w:lvlJc w:val="left"/>
+      <w:pPr>
+        <w:ind w:left="720" w:hanging="360"/>
+      </w:pPr>
+      <w:rPr>
+        <w:rFonts w:hint="default"/>
+      </w:rPr>
+    </w:lvl>
+    <w:lvl w:ilvl="1" w:tplc="04210019" w:tentative="1">
+      <w:start w:val="1"/>
+      <w:numFmt w:val="lowerLetter"/>
+      <w:lvlText w:val="%2."/>
+      <w:lvlJc w:val="left"/>
+      <w:pPr>
+        <w:ind w:left="1440" w:hanging="360"/>
+      </w:pPr>
+    </w:lvl>
+    <w:lvl w:ilvl="2" w:tplc="0421001B" w:tentative="1">
+      <w:start w:val="1"/>
+      <w:numFmt w:val="lowerRoman"/>
+      <w:lvlText w:val="%3."/>
+      <w:lvlJc w:val="right"/>
+      <w:pPr>
+        <w:ind w:left="2160" w:hanging="180"/>
+      </w:pPr>
+    </w:lvl>
+    <w:lvl w:ilvl="3" w:tplc="0421000F" w:tentative="1">
+      <w:start w:val="1"/>
+      <w:numFmt w:val="decimal"/>
+      <w:lvlText w:val="%4."/>
+      <w:lvlJc w:val="left"/>
+      <w:pPr>
+        <w:ind w:left="2880" w:hanging="360"/>
+      </w:pPr>
+    </w:lvl>
+    <w:lvl w:ilvl="4" w:tplc="04210019" w:tentative="1">
+      <w:start w:val="1"/>
+      <w:numFmt w:val="lowerLetter"/>
+      <w:lvlText w:val="%5."/>
+      <w:lvlJc w:val="left"/>
+      <w:pPr>
+        <w:ind w:left="3600" w:hanging="360"/>
+      </w:pPr>
+    </w:lvl>
+    <w:lvl w:ilvl="5" w:tplc="0421001B" w:tentative="1">
+      <w:start w:val="1"/>
+      <w:numFmt w:val="lowerRoman"/>
+      <w:lvlText w:val="%6."/>
+      <w:lvlJc w:val="right"/>
+      <w:pPr>
+        <w:ind w:left="4320" w:hanging="180"/>
+      </w:pPr>
+    </w:lvl>
+    <w:lvl w:ilvl="6" w:tplc="0421000F" w:tentative="1">
+      <w:start w:val="1"/>
+      <w:numFmt w:val="decimal"/>
+      <w:lvlText w:val="%7."/>
+      <w:lvlJc w:val="left"/>
+      <w:pPr>
+        <w:ind w:left="5040" w:hanging="360"/>
+      </w:pPr>
+    </w:lvl>
+    <w:lvl w:ilvl="7" w:tplc="04210019" w:tentative="1">
+      <w:start w:val="1"/>
+      <w:numFmt w:val="lowerLetter"/>
+      <w:lvlText w:val="%8."/>
+      <w:lvlJc w:val="left"/>
+      <w:pPr>
+        <w:ind w:left="5760" w:hanging="360"/>
+      </w:pPr>
+    </w:lvl>
+    <w:lvl w:ilvl="8" w:tplc="0421001B" w:tentative="1">
+      <w:start w:val="1"/>
+      <w:numFmt w:val="lowerRoman"/>
+      <w:lvlText w:val="%9."/>
+      <w:lvlJc w:val="right"/>
+      <w:pPr>
+        <w:ind w:left="6480" w:hanging="180"/>
+      </w:pPr>
+    </w:lvl>
+  </w:abstractNum>
+  <w:abstractNum w:abstractNumId="29" w15:restartNumberingAfterBreak="0">
     <w:nsid w:val="729B74B9"/>
     <w:multiLevelType w:val="hybridMultilevel"/>
     <w:tmpl w:val="76842972"/>
@@ -3154,95 +5256,303 @@
       </w:pPr>
     </w:lvl>
   </w:abstractNum>
+  <w:abstractNum w:abstractNumId="30" w15:restartNumberingAfterBreak="0">
+    <w:nsid w:val="752D099B"/>
+    <w:multiLevelType w:val="hybridMultilevel"/>
+    <w:tmpl w:val="79763336"/>
+    <w:lvl w:ilvl="0" w:tplc="0421000F">
+      <w:start w:val="1"/>
+      <w:numFmt w:val="decimal"/>
+      <w:lvlText w:val="%1."/>
+      <w:lvlJc w:val="left"/>
+      <w:pPr>
+        <w:ind w:left="1080" w:hanging="360"/>
+      </w:pPr>
+    </w:lvl>
+    <w:lvl w:ilvl="1" w:tplc="04210019" w:tentative="1">
+      <w:start w:val="1"/>
+      <w:numFmt w:val="lowerLetter"/>
+      <w:lvlText w:val="%2."/>
+      <w:lvlJc w:val="left"/>
+      <w:pPr>
+        <w:ind w:left="1800" w:hanging="360"/>
+      </w:pPr>
+    </w:lvl>
+    <w:lvl w:ilvl="2" w:tplc="0421001B" w:tentative="1">
+      <w:start w:val="1"/>
+      <w:numFmt w:val="lowerRoman"/>
+      <w:lvlText w:val="%3."/>
+      <w:lvlJc w:val="right"/>
+      <w:pPr>
+        <w:ind w:left="2520" w:hanging="180"/>
+      </w:pPr>
+    </w:lvl>
+    <w:lvl w:ilvl="3" w:tplc="0421000F" w:tentative="1">
+      <w:start w:val="1"/>
+      <w:numFmt w:val="decimal"/>
+      <w:lvlText w:val="%4."/>
+      <w:lvlJc w:val="left"/>
+      <w:pPr>
+        <w:ind w:left="3240" w:hanging="360"/>
+      </w:pPr>
+    </w:lvl>
+    <w:lvl w:ilvl="4" w:tplc="04210019" w:tentative="1">
+      <w:start w:val="1"/>
+      <w:numFmt w:val="lowerLetter"/>
+      <w:lvlText w:val="%5."/>
+      <w:lvlJc w:val="left"/>
+      <w:pPr>
+        <w:ind w:left="3960" w:hanging="360"/>
+      </w:pPr>
+    </w:lvl>
+    <w:lvl w:ilvl="5" w:tplc="0421001B" w:tentative="1">
+      <w:start w:val="1"/>
+      <w:numFmt w:val="lowerRoman"/>
+      <w:lvlText w:val="%6."/>
+      <w:lvlJc w:val="right"/>
+      <w:pPr>
+        <w:ind w:left="4680" w:hanging="180"/>
+      </w:pPr>
+    </w:lvl>
+    <w:lvl w:ilvl="6" w:tplc="0421000F" w:tentative="1">
+      <w:start w:val="1"/>
+      <w:numFmt w:val="decimal"/>
+      <w:lvlText w:val="%7."/>
+      <w:lvlJc w:val="left"/>
+      <w:pPr>
+        <w:ind w:left="5400" w:hanging="360"/>
+      </w:pPr>
+    </w:lvl>
+    <w:lvl w:ilvl="7" w:tplc="04210019" w:tentative="1">
+      <w:start w:val="1"/>
+      <w:numFmt w:val="lowerLetter"/>
+      <w:lvlText w:val="%8."/>
+      <w:lvlJc w:val="left"/>
+      <w:pPr>
+        <w:ind w:left="6120" w:hanging="360"/>
+      </w:pPr>
+    </w:lvl>
+    <w:lvl w:ilvl="8" w:tplc="0421001B" w:tentative="1">
+      <w:start w:val="1"/>
+      <w:numFmt w:val="lowerRoman"/>
+      <w:lvlText w:val="%9."/>
+      <w:lvlJc w:val="right"/>
+      <w:pPr>
+        <w:ind w:left="6840" w:hanging="180"/>
+      </w:pPr>
+    </w:lvl>
+  </w:abstractNum>
+  <w:abstractNum w:abstractNumId="31" w15:restartNumberingAfterBreak="0">
+    <w:nsid w:val="76BE26C6"/>
+    <w:multiLevelType w:val="hybridMultilevel"/>
+    <w:tmpl w:val="5A689A4E"/>
+    <w:lvl w:ilvl="0" w:tplc="0421000F">
+      <w:start w:val="1"/>
+      <w:numFmt w:val="decimal"/>
+      <w:lvlText w:val="%1."/>
+      <w:lvlJc w:val="left"/>
+      <w:pPr>
+        <w:ind w:left="1080" w:hanging="360"/>
+      </w:pPr>
+    </w:lvl>
+    <w:lvl w:ilvl="1" w:tplc="04210019" w:tentative="1">
+      <w:start w:val="1"/>
+      <w:numFmt w:val="lowerLetter"/>
+      <w:lvlText w:val="%2."/>
+      <w:lvlJc w:val="left"/>
+      <w:pPr>
+        <w:ind w:left="1800" w:hanging="360"/>
+      </w:pPr>
+    </w:lvl>
+    <w:lvl w:ilvl="2" w:tplc="0421001B" w:tentative="1">
+      <w:start w:val="1"/>
+      <w:numFmt w:val="lowerRoman"/>
+      <w:lvlText w:val="%3."/>
+      <w:lvlJc w:val="right"/>
+      <w:pPr>
+        <w:ind w:left="2520" w:hanging="180"/>
+      </w:pPr>
+    </w:lvl>
+    <w:lvl w:ilvl="3" w:tplc="0421000F" w:tentative="1">
+      <w:start w:val="1"/>
+      <w:numFmt w:val="decimal"/>
+      <w:lvlText w:val="%4."/>
+      <w:lvlJc w:val="left"/>
+      <w:pPr>
+        <w:ind w:left="3240" w:hanging="360"/>
+      </w:pPr>
+    </w:lvl>
+    <w:lvl w:ilvl="4" w:tplc="04210019" w:tentative="1">
+      <w:start w:val="1"/>
+      <w:numFmt w:val="lowerLetter"/>
+      <w:lvlText w:val="%5."/>
+      <w:lvlJc w:val="left"/>
+      <w:pPr>
+        <w:ind w:left="3960" w:hanging="360"/>
+      </w:pPr>
+    </w:lvl>
+    <w:lvl w:ilvl="5" w:tplc="0421001B" w:tentative="1">
+      <w:start w:val="1"/>
+      <w:numFmt w:val="lowerRoman"/>
+      <w:lvlText w:val="%6."/>
+      <w:lvlJc w:val="right"/>
+      <w:pPr>
+        <w:ind w:left="4680" w:hanging="180"/>
+      </w:pPr>
+    </w:lvl>
+    <w:lvl w:ilvl="6" w:tplc="0421000F" w:tentative="1">
+      <w:start w:val="1"/>
+      <w:numFmt w:val="decimal"/>
+      <w:lvlText w:val="%7."/>
+      <w:lvlJc w:val="left"/>
+      <w:pPr>
+        <w:ind w:left="5400" w:hanging="360"/>
+      </w:pPr>
+    </w:lvl>
+    <w:lvl w:ilvl="7" w:tplc="04210019" w:tentative="1">
+      <w:start w:val="1"/>
+      <w:numFmt w:val="lowerLetter"/>
+      <w:lvlText w:val="%8."/>
+      <w:lvlJc w:val="left"/>
+      <w:pPr>
+        <w:ind w:left="6120" w:hanging="360"/>
+      </w:pPr>
+    </w:lvl>
+    <w:lvl w:ilvl="8" w:tplc="0421001B" w:tentative="1">
+      <w:start w:val="1"/>
+      <w:numFmt w:val="lowerRoman"/>
+      <w:lvlText w:val="%9."/>
+      <w:lvlJc w:val="right"/>
+      <w:pPr>
+        <w:ind w:left="6840" w:hanging="180"/>
+      </w:pPr>
+    </w:lvl>
+  </w:abstractNum>
   <w:num w:numId="1" w16cid:durableId="117529985">
-    <w:abstractNumId w:val="5"/>
+    <w:abstractNumId w:val="8"/>
   </w:num>
   <w:num w:numId="2" w16cid:durableId="1754469094">
-    <w:abstractNumId w:val="15"/>
+    <w:abstractNumId w:val="22"/>
   </w:num>
   <w:num w:numId="3" w16cid:durableId="489054059">
-    <w:abstractNumId w:val="5"/>
+    <w:abstractNumId w:val="8"/>
     <w:lvlOverride w:ilvl="0">
       <w:startOverride w:val="1"/>
     </w:lvlOverride>
   </w:num>
   <w:num w:numId="4" w16cid:durableId="74713970">
-    <w:abstractNumId w:val="2"/>
+    <w:abstractNumId w:val="4"/>
   </w:num>
   <w:num w:numId="5" w16cid:durableId="526799419">
-    <w:abstractNumId w:val="4"/>
+    <w:abstractNumId w:val="7"/>
   </w:num>
   <w:num w:numId="6" w16cid:durableId="810833425">
-    <w:abstractNumId w:val="11"/>
+    <w:abstractNumId w:val="17"/>
   </w:num>
   <w:num w:numId="7" w16cid:durableId="1663502578">
-    <w:abstractNumId w:val="16"/>
+    <w:abstractNumId w:val="23"/>
   </w:num>
   <w:num w:numId="8" w16cid:durableId="1514610107">
-    <w:abstractNumId w:val="11"/>
+    <w:abstractNumId w:val="17"/>
     <w:lvlOverride w:ilvl="0">
       <w:startOverride w:val="1"/>
     </w:lvlOverride>
   </w:num>
   <w:num w:numId="9" w16cid:durableId="1509759572">
-    <w:abstractNumId w:val="11"/>
+    <w:abstractNumId w:val="17"/>
     <w:lvlOverride w:ilvl="0">
       <w:startOverride w:val="1"/>
     </w:lvlOverride>
   </w:num>
   <w:num w:numId="10" w16cid:durableId="464810751">
+    <w:abstractNumId w:val="6"/>
+  </w:num>
+  <w:num w:numId="11" w16cid:durableId="1085148928">
+    <w:abstractNumId w:val="11"/>
+  </w:num>
+  <w:num w:numId="12" w16cid:durableId="1390107721">
     <w:abstractNumId w:val="3"/>
   </w:num>
-  <w:num w:numId="11" w16cid:durableId="1085148928">
-    <w:abstractNumId w:val="8"/>
-  </w:num>
-  <w:num w:numId="12" w16cid:durableId="1390107721">
+  <w:num w:numId="13" w16cid:durableId="1241020474">
     <w:abstractNumId w:val="1"/>
   </w:num>
-  <w:num w:numId="13" w16cid:durableId="1241020474">
-    <w:abstractNumId w:val="0"/>
-  </w:num>
   <w:num w:numId="14" w16cid:durableId="1973828626">
-    <w:abstractNumId w:val="7"/>
+    <w:abstractNumId w:val="10"/>
   </w:num>
   <w:num w:numId="15" w16cid:durableId="484275023">
-    <w:abstractNumId w:val="5"/>
+    <w:abstractNumId w:val="8"/>
     <w:lvlOverride w:ilvl="0">
       <w:startOverride w:val="1"/>
     </w:lvlOverride>
   </w:num>
   <w:num w:numId="16" w16cid:durableId="1401058754">
-    <w:abstractNumId w:val="10"/>
+    <w:abstractNumId w:val="16"/>
   </w:num>
   <w:num w:numId="17" w16cid:durableId="987057199">
+    <w:abstractNumId w:val="27"/>
+  </w:num>
+  <w:num w:numId="18" w16cid:durableId="906959416">
+    <w:abstractNumId w:val="12"/>
+  </w:num>
+  <w:num w:numId="19" w16cid:durableId="751975993">
+    <w:abstractNumId w:val="29"/>
+  </w:num>
+  <w:num w:numId="20" w16cid:durableId="1362051166">
     <w:abstractNumId w:val="18"/>
   </w:num>
-  <w:num w:numId="18" w16cid:durableId="906959416">
-    <w:abstractNumId w:val="9"/>
+  <w:num w:numId="21" w16cid:durableId="307712894">
+    <w:abstractNumId w:val="24"/>
   </w:num>
-  <w:num w:numId="19" w16cid:durableId="751975993">
+  <w:num w:numId="22" w16cid:durableId="394426661">
     <w:abstractNumId w:val="19"/>
   </w:num>
-  <w:num w:numId="20" w16cid:durableId="1362051166">
-    <w:abstractNumId w:val="12"/>
-  </w:num>
-  <w:num w:numId="21" w16cid:durableId="307712894">
-    <w:abstractNumId w:val="17"/>
-  </w:num>
-  <w:num w:numId="22" w16cid:durableId="394426661">
-    <w:abstractNumId w:val="13"/>
-  </w:num>
   <w:num w:numId="23" w16cid:durableId="1293831601">
-    <w:abstractNumId w:val="5"/>
+    <w:abstractNumId w:val="8"/>
     <w:lvlOverride w:ilvl="0">
       <w:startOverride w:val="1"/>
     </w:lvlOverride>
   </w:num>
   <w:num w:numId="24" w16cid:durableId="921720301">
-    <w:abstractNumId w:val="6"/>
+    <w:abstractNumId w:val="9"/>
   </w:num>
   <w:num w:numId="25" w16cid:durableId="205988421">
+    <w:abstractNumId w:val="21"/>
+  </w:num>
+  <w:num w:numId="26" w16cid:durableId="1498498755">
+    <w:abstractNumId w:val="0"/>
+  </w:num>
+  <w:num w:numId="27" w16cid:durableId="1586956230">
+    <w:abstractNumId w:val="30"/>
+  </w:num>
+  <w:num w:numId="28" w16cid:durableId="1226524269">
+    <w:abstractNumId w:val="20"/>
+  </w:num>
+  <w:num w:numId="29" w16cid:durableId="1777671596">
+    <w:abstractNumId w:val="31"/>
+  </w:num>
+  <w:num w:numId="30" w16cid:durableId="935406345">
+    <w:abstractNumId w:val="15"/>
+  </w:num>
+  <w:num w:numId="31" w16cid:durableId="1742025498">
+    <w:abstractNumId w:val="28"/>
+  </w:num>
+  <w:num w:numId="32" w16cid:durableId="667025482">
     <w:abstractNumId w:val="14"/>
+  </w:num>
+  <w:num w:numId="33" w16cid:durableId="1255556967">
+    <w:abstractNumId w:val="5"/>
+  </w:num>
+  <w:num w:numId="34" w16cid:durableId="74867961">
+    <w:abstractNumId w:val="25"/>
+  </w:num>
+  <w:num w:numId="35" w16cid:durableId="1146707946">
+    <w:abstractNumId w:val="26"/>
+  </w:num>
+  <w:num w:numId="36" w16cid:durableId="315229427">
+    <w:abstractNumId w:val="2"/>
+  </w:num>
+  <w:num w:numId="37" w16cid:durableId="1529874175">
+    <w:abstractNumId w:val="13"/>
   </w:num>
 </w:numbering>
 </file>
@@ -3647,6 +5957,12 @@
   <w:style w:type="paragraph" w:default="1" w:styleId="Normal">
     <w:name w:val="Normal"/>
     <w:qFormat/>
+    <w:rsid w:val="009841CB"/>
+    <w:pPr>
+      <w:spacing w:line="480" w:lineRule="auto"/>
+      <w:ind w:left="720"/>
+      <w:jc w:val="both"/>
+    </w:pPr>
   </w:style>
   <w:style w:type="paragraph" w:styleId="Heading1">
     <w:name w:val="heading 1"/>
@@ -3657,7 +5973,6 @@
     <w:qFormat/>
     <w:rsid w:val="00524C25"/>
     <w:pPr>
-      <w:spacing w:line="480" w:lineRule="auto"/>
       <w:jc w:val="center"/>
       <w:outlineLvl w:val="0"/>
     </w:pPr>
@@ -3699,7 +6014,6 @@
       <w:numPr>
         <w:numId w:val="6"/>
       </w:numPr>
-      <w:spacing w:line="480" w:lineRule="auto"/>
       <w:outlineLvl w:val="2"/>
     </w:pPr>
   </w:style>
@@ -3838,7 +6152,6 @@
   <w:style w:type="character" w:default="1" w:styleId="DefaultParagraphFont">
     <w:name w:val="Default Paragraph Font"/>
     <w:uiPriority w:val="1"/>
-    <w:semiHidden/>
     <w:unhideWhenUsed/>
   </w:style>
   <w:style w:type="table" w:default="1" w:styleId="TableNormal">
@@ -4015,6 +6328,7 @@
       <w:numPr>
         <w:ilvl w:val="1"/>
       </w:numPr>
+      <w:ind w:left="720"/>
     </w:pPr>
     <w:rPr>
       <w:rFonts w:asciiTheme="minorHAnsi" w:eastAsiaTheme="majorEastAsia" w:hAnsiTheme="minorHAnsi" w:cstheme="majorBidi"/>
@@ -4075,7 +6389,6 @@
     <w:qFormat/>
     <w:rsid w:val="00BD1B01"/>
     <w:pPr>
-      <w:ind w:left="720"/>
       <w:contextualSpacing/>
     </w:pPr>
   </w:style>
@@ -4139,6 +6452,25 @@
       <w:color w:val="0F4761" w:themeColor="accent1" w:themeShade="BF"/>
       <w:spacing w:val="5"/>
     </w:rPr>
+  </w:style>
+  <w:style w:type="table" w:styleId="TableGrid">
+    <w:name w:val="Table Grid"/>
+    <w:basedOn w:val="TableNormal"/>
+    <w:uiPriority w:val="39"/>
+    <w:rsid w:val="00553367"/>
+    <w:pPr>
+      <w:spacing w:after="0" w:line="240" w:lineRule="auto"/>
+    </w:pPr>
+    <w:tblPr>
+      <w:tblBorders>
+        <w:top w:val="single" w:sz="4" w:space="0" w:color="auto"/>
+        <w:left w:val="single" w:sz="4" w:space="0" w:color="auto"/>
+        <w:bottom w:val="single" w:sz="4" w:space="0" w:color="auto"/>
+        <w:right w:val="single" w:sz="4" w:space="0" w:color="auto"/>
+        <w:insideH w:val="single" w:sz="4" w:space="0" w:color="auto"/>
+        <w:insideV w:val="single" w:sz="4" w:space="0" w:color="auto"/>
+      </w:tblBorders>
+    </w:tblPr>
   </w:style>
 </w:styles>
 </file>

</xml_diff>

<commit_message>
Update naskah BAB III (A-D), revisi objek penelitian, dan sinkronisasi notes
</commit_message>
<xml_diff>
--- a/naskah/Naskah Skripsi - Raiya Yusuf Priatmojo - 22518244004.docx
+++ b/naskah/Naskah Skripsi - Raiya Yusuf Priatmojo - 22518244004.docx
@@ -436,7 +436,7 @@
         <w:jc w:val="both"/>
       </w:pPr>
       <w:r>
-        <w:t>Perkembangan teknologi di bidang otomasi dan sensor terus meningkat seiring dengan tuntutan Revolusi Industri 4.0. Revolusi Industri 4.0 membawa perubahan fundamental dalam berbagai sektor kehidupan, termasuk dunia industri dan pendidikan. Paradigma produksi modern telah bergeser dari sistem otomasi yang terisolasi menuju ekosistem yang saling terhubung secara digital (Galar &amp; Kumar, 2024). Perubahan ini menuntut adanya sumber daya manusia yang tidak hanya menguasai teori, tetapi juga memiliki keterampilan praktis yang relevan dengan kebutuhan industri. Kebutuhan tenaga kerja yang kompeten di bidang ini mendorong lembaga pendidikan, baik formal maupun non-formal, untuk menyiapkan media pembelajaran yang praktis dan relevan. Media pembelajaran yang tepat tidak hanya membantu peserta didik memahami konsep, tetapi juga meningkatkan motivasi dan keterlibatan mereka dalam proses belajar (Arsyad, 2013).</w:t>
+        <w:t>Perkembangan teknologi di bidang otomasi dan sensor terus meningkat seiring dengan tuntutan Revolusi Industri 4.0. Revolusi Industri 4.0 membawa perubahan fundamental dalam berbagai sektor kehidupan, termasuk dunia industri dan pendidikan. Paradigma produksi modern telah bergeser dari sistem otomasi yang terisolasi menuju ekosistem yang saling terhubung secara digital (Galar &amp; Kumar, 2024). Perubahan ini menuntut adanya sumber daya manusia yang tidak hanya menguasai teori, tetapi juga memiliki keterampilan praktis yang relevan dengan kebutuhan industri. Kebutuhan tenaga kerja yang kompeten di bidang ini mendorong lembaga pendidikan, baik formal maupun non-formal, untuk menyiapkan media pembelajaran yang efisien dan aplikatif. Media pembelajaran yang tepat tidak hanya membantu peserta didik memahami konsep, tetapi juga meningkatkan motivasi dan keterlibatan mereka dalam proses belajar (Arsyad, 2013).</w:t>
       </w:r>
     </w:p>
     <w:p>
@@ -460,7 +460,58 @@
         <w:jc w:val="both"/>
       </w:pPr>
       <w:r>
-        <w:t>GSE adalah lembaga pelatihan teknologi yang bergerak di bidang robotika, Internet of Things (IoT), coding, dan visual design. GSE melayani siswa jenjang menengah (SMP-SMA) melalui berbagai program kelas, seperti Robotik uKit, Coding Scratch, Coding Python, Robot Inovasi, dan IoT. Setiap kelas dirancang untuk membekali siswa dengan keterampilan teknis yang aplikatif, terutama di bidang sensor dan sistem kendali. Kelas Robot Inovasi, misalnya, menjadi fondasi awal bagi siswa untuk mempelajari sensor-sensor dasar sebelum melanjutkan ke kelas IoT yang lebih kompleks. Kelas ini tergolong baru di GSE sehingga masih dalam tahap pengembangan, baik dari segi materi maupun media pembelajaran yang digunakan. Materi yang diajarkan di kelas Robot Inovasi meliputi pengenalan sensor-sensor dasar seperti sensor cahaya (LDR), sensor jarak (ultrasonik), sensor suhu (DHT11), sensor gerak (PIR), serta aktuator seperti LED, buzzer, LCD, dan servo.</w:t>
+        <w:t xml:space="preserve">GSE adalah lembaga pelatihan teknologi yang bergerak di bidang robotika, </w:t>
+      </w:r>
+      <w:r>
+        <w:rPr>
+          <w:i/>
+        </w:rPr>
+        <w:t>Internet of Things</w:t>
+      </w:r>
+      <w:r>
+        <w:t xml:space="preserve"> (IoT), </w:t>
+      </w:r>
+      <w:r>
+        <w:rPr>
+          <w:i/>
+        </w:rPr>
+        <w:t>coding</w:t>
+      </w:r>
+      <w:r>
+        <w:t xml:space="preserve">, dan </w:t>
+      </w:r>
+      <w:r>
+        <w:rPr>
+          <w:i/>
+        </w:rPr>
+        <w:t>visual design</w:t>
+      </w:r>
+      <w:r>
+        <w:t xml:space="preserve">. GSE melayani siswa jenjang menengah (SMP-SMA) melalui berbagai program kelas, seperti Robotik uKit, </w:t>
+      </w:r>
+      <w:r>
+        <w:rPr>
+          <w:i/>
+        </w:rPr>
+        <w:t>Coding</w:t>
+      </w:r>
+      <w:r>
+        <w:t xml:space="preserve"> Scratch, </w:t>
+      </w:r>
+      <w:r>
+        <w:rPr>
+          <w:i/>
+        </w:rPr>
+        <w:t>Coding</w:t>
+      </w:r>
+      <w:r>
+        <w:t xml:space="preserve"> Python, Robot Inovasi, dan IoT. Setiap kelas dirancang untuk membekali siswa dengan keterampilan teknis yang aplikatif, terutama di bidang sensor dan sistem kendali. Kelas Robot Inovasi, misalnya, menjadi fondasi awal bagi siswa untuk mempelajari sensor-sensor dasar sebelum melanjutkan ke kelas IoT yang lebih kompleks. Kelas ini tergolong baru di GSE sehingga masih dalam tahap pengembangan, baik dari segi materi maupun media pembelajaran yang digunakan. Materi yang diajarkan di kelas Robot Inovasi meliputi pengenalan sensor-sensor dasar seperti sensor cahaya (LDR), sensor jarak (ultrasonik), sensor suhu (DHT</w:t>
+      </w:r>
+      <w:r>
+        <w:t>22</w:t>
+      </w:r>
+      <w:r>
+        <w:t>), sensor gerak (PIR), serta aktuator seperti LED, buzzer, LCD, dan servo.</w:t>
       </w:r>
     </w:p>
     <w:p>
@@ -498,7 +549,7 @@
       </w:r>
       <w:r>
         <w:lastRenderedPageBreak/>
-        <w:t>kegiatan belajar. Namun, kondisi saat ini masih menunjukkan adanya kesenjangan antara harapan dan kenyataan. Belum tersedianya media pembelajaran berupa trainer kit yang praktis dan siap pakai menyebabkan proses praktikum kurang optimal. Diperlukan solusi berupa media pembelajaran yang dapat mempercepat persiapan, mempermudah siswa dalam merangkai, serta meningkatkan efektivitas pembelajaran. Media pembelajaran praktikum berupa trainer kit merupakan salah satu potensi yang dapat digunakan peserta didik untuk mengenal lebih dalam tentang teknologi kontrol dan pemrograman sensor (Nur &amp; Suprianto, 2016).</w:t>
+        <w:t>kegiatan belajar. Namun, kondisi saat ini masih menunjukkan adanya kesenjangan antara harapan dan kenyataan. Belum tersedianya media pembelajaran berupa trainer kit yang efisien dan siap pakai menyebabkan proses praktikum kurang optimal. Diperlukan solusi berupa media pembelajaran yang dapat mempercepat persiapan, mempermudah siswa dalam merangkai, serta meningkatkan efektivitas pembelajaran. Media pembelajaran praktikum berupa trainer kit merupakan salah satu potensi yang dapat digunakan peserta didik untuk mengenal lebih dalam tentang teknologi kontrol dan pemrograman sensor (Nur &amp; Suprianto, 2016).</w:t>
       </w:r>
     </w:p>
     <w:p>
@@ -508,7 +559,16 @@
         <w:jc w:val="both"/>
       </w:pPr>
       <w:r>
-        <w:t>Salah satu solusi yang ditawarkan adalah pengembangan trainer kit multi sensor berbasis Arduino Uno. Trainer kit ini dirancang dengan konsep plug-and-play, sehingga siswa dapat langsung menghubungkan sensor tanpa harus merangkai dari awal. Media ini dilengkapi dengan modul dan labsheet sebagai panduan praktikum. Dengan desain yang praktis, trainer kit ini diharapkan dapat mengatasi kendala persiapan, mengurangi risiko kesalahan perangkaian, dan meningkatkan pemahaman siswa terhadap konsep sensor dan aktuator (Usman &amp; Pratiwi, 2022). Penelitian sebelumnya menunjukkan bahwa penggunaan trainer kit dalam pembelajaran praktikum mampu meningkatkan pemahaman, motivasi, serta keterampilan praktikum peserta didik (AlFaris et al., 2026).</w:t>
+        <w:t xml:space="preserve">Salah satu solusi yang ditawarkan adalah pengembangan trainer kit multi sensor berbasis Arduino Uno. Trainer kit ini dirancang dengan konsep </w:t>
+      </w:r>
+      <w:r>
+        <w:rPr>
+          <w:i/>
+        </w:rPr>
+        <w:t>plug-and-play</w:t>
+      </w:r>
+      <w:r>
+        <w:t>, sehingga siswa dapat langsung menghubungkan sensor tanpa harus merangkai dari awal. Media ini dilengkapi dengan modul dan labsheet sebagai panduan praktikum. Dengan desain yang ergonomis dan aplikatif, trainer kit ini diharapkan dapat mengatasi kendala persiapan, mengurangi risiko kesalahan perangkaian, dan meningkatkan pemahaman siswa terhadap konsep sensor dan aktuator (Usman &amp; Pratiwi, 2022). Penelitian sebelumnya menunjukkan bahwa penggunaan trainer kit dalam pembelajaran praktikum mampu meningkatkan pemahaman, motivasi, serta keterampilan praktikum peserta didik (AlFaris et al., 2026).</w:t>
       </w:r>
     </w:p>
     <w:p>
@@ -522,7 +582,16 @@
       </w:r>
       <w:r>
         <w:lastRenderedPageBreak/>
-        <w:t>digunakan dalam pembelajaran dasar elektronika dan pemrograman (Usman &amp; Pratiwi, 2022). Kedua, Arduino Uno memiliki komunitas pengguna yang besar sehingga ketersediaan referensi dan library pendukung sangat melimpah. Ketiga, Arduino Uno memiliki harga yang terjangkau dan mudah didapatkan di pasaran. Keempat, Arduino Uno memiliki jumlah pin I/O yang cukup untuk mengakomodasi berbagai sensor dan aktuator yang akan digunakan dalam trainer kit ini. Dengan pertimbangan-pertimbangan tersebut, Arduino Uno dinilai sesuai sebagai kontroler utama dalam pengembangan trainer kit multi sensor untuk pembelajaran sensor dan aktuator.</w:t>
+        <w:t xml:space="preserve">digunakan dalam pembelajaran dasar elektronika dan pemrograman (Usman &amp; Pratiwi, 2022). Kedua, Arduino Uno memiliki komunitas pengguna yang besar sehingga ketersediaan referensi dan </w:t>
+      </w:r>
+      <w:r>
+        <w:rPr>
+          <w:i/>
+        </w:rPr>
+        <w:t>library</w:t>
+      </w:r>
+      <w:r>
+        <w:t xml:space="preserve"> pendukung sangat melimpah. Ketiga, Arduino Uno memiliki harga yang terjangkau dan mudah didapatkan di pasaran. Keempat, Arduino Uno memiliki jumlah pin I/O yang cukup untuk mengakomodasi berbagai sensor dan aktuator yang akan digunakan dalam trainer kit ini. Dengan pertimbangan-pertimbangan tersebut, Arduino Uno dinilai sesuai sebagai kontroler utama dalam pengembangan trainer kit multi sensor untuk pembelajaran sensor dan aktuator.</w:t>
       </w:r>
     </w:p>
     <w:p>
@@ -532,13 +601,7 @@
         <w:jc w:val="both"/>
       </w:pPr>
       <w:r>
-        <w:t>Berdasarkan permasalahan yang telah diuraikan, yaitu keterbatasan media pembelajaran yang praktis dan siap pakai di kelas Robot Inovasi CV Global Solusi Edukasipenelitian ini mengangkat judul "</w:t>
-      </w:r>
-      <w:r>
-        <w:t>Pengembangan Trainer Kit Multi Sensor Berbasis Arduino Uno sebagai Media Pembelajaran Sensor dan Aktuator di CV Global Solusi Edukasi</w:t>
-      </w:r>
-      <w:r>
-        <w:t>".</w:t>
+        <w:t>Berdasarkan permasalahan yang telah diuraikan, yaitu keterbatasan media pembelajaran yang efisien dan siap pakai di kelas Robot Inovasi CV Global Solusi Edukasi, penelitian ini mengangkat judul "Pengembangan Trainer Kit Multi Sensor Berbasis Arduino Uno sebagai Media Pembelajaran Sensor dan Aktuator di CV Global Solusi Edukasi".</w:t>
       </w:r>
     </w:p>
     <w:p>
@@ -571,7 +634,25 @@
         <w:jc w:val="both"/>
       </w:pPr>
       <w:r>
-        <w:t>Media pembelajaran sensor dan aktuator yang tersedia di kelas Robot Inovasi CV Global Solusi Edukasi masih berupa komponen terpisah, sehingga siswa harus memasang komponen satu per satu ke breadboard sebelum melakukan wiring rangkaian praktikum.</w:t>
+        <w:t xml:space="preserve">Media pembelajaran sensor dan aktuator yang tersedia di kelas Robot Inovasi CV Global Solusi Edukasi masih berupa komponen terpisah, sehingga siswa harus memasang komponen satu per satu ke </w:t>
+      </w:r>
+      <w:r>
+        <w:rPr>
+          <w:i/>
+        </w:rPr>
+        <w:t>breadboard</w:t>
+      </w:r>
+      <w:r>
+        <w:t xml:space="preserve"> sebelum melakukan </w:t>
+      </w:r>
+      <w:r>
+        <w:rPr>
+          <w:i/>
+        </w:rPr>
+        <w:t>wiring</w:t>
+      </w:r>
+      <w:r>
+        <w:t xml:space="preserve"> rangkaian praktikum.</w:t>
       </w:r>
     </w:p>
     <w:p>
@@ -617,7 +698,25 @@
         <w:jc w:val="both"/>
       </w:pPr>
       <w:r>
-        <w:t>Belum tersedianya trainer kit multi sensor berbasis Arduino Uno yang praktis dan siap pakai, di mana komponen sensor dan aktuator telah terpasang permanen pada board sehingga siswa hanya perlu melakukan wiring tanpa harus memasang komponen satu per satu.</w:t>
+        <w:t xml:space="preserve">Media pembelajaran sensor dan aktuator yang tersedia di kelas Robot Inovasi CV Global Solusi Edukasi masih berupa komponen terpisah, sehingga siswa harus memasang komponen satu per satu ke </w:t>
+      </w:r>
+      <w:r>
+        <w:rPr>
+          <w:i/>
+        </w:rPr>
+        <w:t>breadboard</w:t>
+      </w:r>
+      <w:r>
+        <w:t xml:space="preserve"> sebelum melakukan </w:t>
+      </w:r>
+      <w:r>
+        <w:rPr>
+          <w:i/>
+        </w:rPr>
+        <w:t>wiring</w:t>
+      </w:r>
+      <w:r>
+        <w:t xml:space="preserve"> rangkaian praktikum.</w:t>
       </w:r>
     </w:p>
     <w:p>
@@ -653,7 +752,34 @@
         <w:jc w:val="both"/>
       </w:pPr>
       <w:r>
-        <w:t xml:space="preserve">Berdasarkan identifikasi masalah yang telah diuraikan, penelitian ini dibatasi pada pengembangan media pembelajaran berupa trainer kit multi sensor berbasis Arduino Uno untuk kelas Robot Inovasi di CV Global Solusi Edukasi. Trainer kit ini dirancang dengan konsep plug-and-play, yaitu komponen sensor dan aktuator telah terpasang permanen pada board sehingga siswa hanya perlu melakukan wiring rangkaian praktikum tanpa harus memasang komponen satu per satu. Sensor yang digunakan meliputi </w:t>
+        <w:t xml:space="preserve">Berdasarkan identifikasi masalah yang telah diuraikan, penelitian ini dibatasi pada pengembangan media pembelajaran berupa trainer kit multi sensor berbasis Arduino Uno untuk kelas Robot Inovasi di CV Global Solusi Edukasi. Trainer kit ini dirancang dengan konsep </w:t>
+      </w:r>
+      <w:r>
+        <w:rPr>
+          <w:i/>
+        </w:rPr>
+        <w:t>plug-and-play</w:t>
+      </w:r>
+      <w:r>
+        <w:t xml:space="preserve">, yaitu komponen sensor dan aktuator telah terpasang permanen pada </w:t>
+      </w:r>
+      <w:r>
+        <w:rPr>
+          <w:i/>
+        </w:rPr>
+        <w:t>board</w:t>
+      </w:r>
+      <w:r>
+        <w:t xml:space="preserve"> sehingga siswa hanya perlu melakukan </w:t>
+      </w:r>
+      <w:r>
+        <w:rPr>
+          <w:i/>
+        </w:rPr>
+        <w:t>wiring</w:t>
+      </w:r>
+      <w:r>
+        <w:t xml:space="preserve"> rangkaian praktikum tanpa harus memasang komponen satu per satu. Sensor yang digunakan meliputi </w:t>
       </w:r>
       <w:r>
         <w:lastRenderedPageBreak/>
@@ -705,7 +831,13 @@
         <w:t xml:space="preserve"> 16x2</w:t>
       </w:r>
       <w:r>
-        <w:t>, dan Servo. Trainer kit ini dilengkapi dengan modul dan labsheet sebagai panduan praktikum. Validasi produk dilakukan oleh ahli media dan ahli materi, sedangkan uji coba skala terbatas dilakukan kepada peserta didik jenjang menengah (SMP-SMA) di CV Global Solusi Edukasi untuk mengetahui tingkat kepraktisannya.</w:t>
+        <w:t xml:space="preserve">, dan Servo. Trainer kit ini dilengkapi dengan modul dan labsheet sebagai panduan praktikum. Validasi produk dilakukan oleh ahli media dan ahli materi, sedangkan uji coba skala terbatas dilakukan kepada peserta didik jenjang menengah (SMP-SMA) di CV Global Solusi Edukasi untuk mengetahui tingkat </w:t>
+      </w:r>
+      <w:r>
+        <w:t>kelayakannya</w:t>
+      </w:r>
+      <w:r>
+        <w:t>.</w:t>
       </w:r>
     </w:p>
     <w:p>
@@ -885,7 +1017,13 @@
         <w:jc w:val="both"/>
       </w:pPr>
       <w:r>
-        <w:t>Penelitian ini diharapkan dapat menyediakan media pembelajaran berupa trainer kit multi sensor berbasis Arduino Uno yang praktis dan siap pakai untuk kelas Robot Inovasi. Selain itu, produk ini dapat menjadi aset media pembelajaran yang dapat digunakan secara berkelanjutan, sehingga kualitas pembelajaran sensor dan aktuator di GSE dapat meningkat.</w:t>
+        <w:t xml:space="preserve">Penelitian ini diharapkan dapat menyediakan media pembelajaran berupa trainer kit multi sensor berbasis Arduino Uno yang </w:t>
+      </w:r>
+      <w:r>
+        <w:t>layak</w:t>
+      </w:r>
+      <w:r>
+        <w:t xml:space="preserve"> dan siap pakai untuk kelas Robot Inovasi. Selain itu, produk ini dapat menjadi aset media pembelajaran yang dapat digunakan secara berkelanjutan, sehingga kualitas pembelajaran sensor dan aktuator di GSE dapat meningkat.</w:t>
       </w:r>
     </w:p>
     <w:p>
@@ -1630,7 +1768,22 @@
         <w:jc w:val="both"/>
       </w:pPr>
       <w:r>
-        <w:t>Penelitian dan Pengembangan, atau yang lebih dikenal dengan sebutan Research and Development (R&amp;D), merupakan salah satu metode penelitian yang populer di dunia pendidikan, khususnya dalam ranah pengembangan media atau bahan ajar. Metode ini tidak hanya berfokus pada pengujian teori, tetapi lebih menekankan pada upaya menghasilkan produk tertentu yang kemudian dievaluasi efektivitasnya. Menurut Sugiyono (2023: 297), R&amp;D adalah metode penelitian yang digunakan untuk menghasilkan produk tertentu dan menguji keefektifan produk tersebut. Definisi ini menegaskan bahwa R&amp;D memiliki dua tujuan utama, yaitu menghasilkan produk dan memastikan produk tersebut bermanfaat.</w:t>
+        <w:t xml:space="preserve">Penelitian dan Pengembangan, atau yang lebih dikenal dengan sebutan </w:t>
+      </w:r>
+      <w:r>
+        <w:rPr>
+          <w:i/>
+        </w:rPr>
+        <w:t xml:space="preserve">Research and </w:t>
+      </w:r>
+      <w:r>
+        <w:rPr>
+          <w:i/>
+        </w:rPr>
+        <w:t>Development</w:t>
+      </w:r>
+      <w:r>
+        <w:t xml:space="preserve"> (R&amp;D), merupakan salah satu metode penelitian yang populer di dunia pendidikan, khususnya dalam ranah pengembangan media atau bahan ajar. Metode ini tidak hanya berfokus pada pengujian teori, tetapi lebih menekankan pada upaya menghasilkan produk tertentu yang kemudian dievaluasi efektivitasnya. Menurut Sugiyono (2023: 297), R&amp;D adalah metode penelitian yang digunakan untuk menghasilkan produk tertentu dan menguji keefektifan produk tersebut. Definisi ini menegaskan bahwa R&amp;D memiliki dua tujuan utama, yaitu menghasilkan produk dan memastikan produk tersebut bermanfaat.</w:t>
       </w:r>
     </w:p>
     <w:p>
@@ -1656,7 +1809,13 @@
         <w:jc w:val="both"/>
       </w:pPr>
       <w:r>
-        <w:t>Dalam konteks penelitian ini, R&amp;D digunakan untuk merancang, mengembangkan, dan menguji kelayakan trainer kit multi sensor berbasis Arduino Uno. Produk ini diharapkan dapat menjadi solusi atas keterbatasan media pembelajaran yang praktis dan siap pakai di kelas Robot Inovasi CV Global Solusi Edukasi. Dengan kata lain, R&amp;D berfungsi sebagai kerangka kerja yang memandu proses dari analisis kebutuhan hingga evaluasi produk.</w:t>
+        <w:t xml:space="preserve">Dalam konteks penelitian ini, R&amp;D digunakan untuk merancang, mengembangkan, dan menguji kelayakan trainer kit multi sensor berbasis Arduino Uno. Produk ini diharapkan dapat menjadi solusi atas keterbatasan media pembelajaran yang </w:t>
+      </w:r>
+      <w:r>
+        <w:t>efisien</w:t>
+      </w:r>
+      <w:r>
+        <w:t xml:space="preserve"> dan siap pakai di kelas Robot Inovasi CV Global Solusi Edukasi. Dengan kata lain, R&amp;D berfungsi sebagai kerangka kerja yang memandu proses dari analisis kebutuhan hingga evaluasi produk.</w:t>
       </w:r>
     </w:p>
     <w:p>
@@ -1681,7 +1840,16 @@
         <w:jc w:val="both"/>
       </w:pPr>
       <w:r>
-        <w:t>Secara umum, tujuan R&amp;D dalam pendidikan adalah untuk menghasilkan produk pembelajaran yang inovatif, terstruktur, dan relevan dengan kebutuhan peserta didik. Produk yang dihasilkan dapat berupa media, modul, bahan ajar, atau sistem pembelajaran. Menurut Rahayu (2025: 460), R&amp;D tidak hanya berkontribusi pada pengembangan teori, tetapi juga menghasilkan luaran yang praktis seperti media pembelajaran atau rancangan pembelajaran. Produk tersebut kemudian diuji coba secara bertahap sampai dinyatakan efektif dan memenuhi standar kelayakan.</w:t>
+        <w:t xml:space="preserve">Secara umum, tujuan R&amp;D dalam pendidikan adalah untuk menghasilkan produk pembelajaran yang inovatif, terstruktur, dan relevan dengan kebutuhan peserta didik. Produk yang dihasilkan dapat berupa media, modul, bahan ajar, atau sistem pembelajaran. Menurut Rahayu (2025: 460), R&amp;D tidak hanya berkontribusi pada pengembangan teori, tetapi juga menghasilkan luaran yang </w:t>
+      </w:r>
+      <w:r>
+        <w:t>bersifat aplikatif</w:t>
+      </w:r>
+      <w:r>
+        <w:t xml:space="preserve"> </w:t>
+      </w:r>
+      <w:r>
+        <w:t>seperti media pembelajaran atau rancangan pembelajaran. Produk tersebut kemudian diuji coba secara bertahap sampai dinyatakan efektif dan memenuhi standar kelayakan.</w:t>
       </w:r>
     </w:p>
     <w:p>
@@ -1758,7 +1926,52 @@
         <w:jc w:val="both"/>
       </w:pPr>
       <w:r>
-        <w:t>Kata ADDIE merupakan akronim dari Analysis, Design, Development, Implementation, dan Evaluation. Setiap tahap dalam model ini saling berkaitan dan bersifat iteratif, artinya hasil dari satu tahap menjadi dasar untuk tahap berikutnya, dan proses revisi dapat terjadi di setiap tahap. Menurut Branch (2009: 3), model ADDIE dirancang untuk memastikan bahwa produk yang dikembangkan tidak hanya sesuai dengan kebutuhan, tetapi juga efektif dan efisien dalam penggunaannya.</w:t>
+        <w:t xml:space="preserve">Kata ADDIE merupakan akronim dari </w:t>
+      </w:r>
+      <w:r>
+        <w:rPr>
+          <w:i/>
+        </w:rPr>
+        <w:t>Analysis</w:t>
+      </w:r>
+      <w:r>
+        <w:t xml:space="preserve">, </w:t>
+      </w:r>
+      <w:r>
+        <w:rPr>
+          <w:i/>
+        </w:rPr>
+        <w:t>Design</w:t>
+      </w:r>
+      <w:r>
+        <w:t xml:space="preserve">, </w:t>
+      </w:r>
+      <w:r>
+        <w:rPr>
+          <w:i/>
+        </w:rPr>
+        <w:t>Development</w:t>
+      </w:r>
+      <w:r>
+        <w:t xml:space="preserve">, </w:t>
+      </w:r>
+      <w:r>
+        <w:rPr>
+          <w:i/>
+        </w:rPr>
+        <w:t>Implementation</w:t>
+      </w:r>
+      <w:r>
+        <w:t xml:space="preserve">, dan </w:t>
+      </w:r>
+      <w:r>
+        <w:rPr>
+          <w:i/>
+        </w:rPr>
+        <w:t>Evaluation</w:t>
+      </w:r>
+      <w:r>
+        <w:t>. Setiap tahap dalam model ini saling berkaitan dan bersifat iteratif, artinya hasil dari satu tahap menjadi dasar untuk tahap berikutnya, dan proses revisi dapat terjadi di setiap tahap. Menurut Branch (2009: 3), model ADDIE dirancang untuk memastikan bahwa produk yang dikembangkan tidak hanya sesuai dengan kebutuhan, tetapi juga efektif dan efisien dalam penggunaannya.</w:t>
       </w:r>
     </w:p>
     <w:p>
@@ -1812,7 +2025,13 @@
         <w:ind w:left="2117"/>
       </w:pPr>
       <w:r>
-        <w:t>Analysis (Analisis)</w:t>
+        <w:rPr>
+          <w:i/>
+        </w:rPr>
+        <w:t>Analysis</w:t>
+      </w:r>
+      <w:r>
+        <w:t xml:space="preserve"> (Analisis)</w:t>
       </w:r>
     </w:p>
     <w:p>
@@ -1838,7 +2057,13 @@
       </w:r>
       <w:r>
         <w:lastRenderedPageBreak/>
-        <w:t>yang berisiko menyebabkan kesalahan dan kerusakan komponen. Dari analisis ini, peneliti menyimpulkan bahwa diperlukan media pembelajaran berupa trainer kit yang praktis dan siap pakai.</w:t>
+        <w:t xml:space="preserve">yang berisiko menyebabkan kesalahan dan kerusakan komponen. Dari analisis ini, peneliti menyimpulkan bahwa diperlukan media pembelajaran berupa trainer kit yang </w:t>
+      </w:r>
+      <w:r>
+        <w:t>efisien</w:t>
+      </w:r>
+      <w:r>
+        <w:t xml:space="preserve"> dan siap pakai.</w:t>
       </w:r>
     </w:p>
     <w:p>
@@ -1852,7 +2077,13 @@
         <w:ind w:left="2117"/>
       </w:pPr>
       <w:r>
-        <w:t>Design (Desain)</w:t>
+        <w:rPr>
+          <w:i/>
+        </w:rPr>
+        <w:t>Design</w:t>
+      </w:r>
+      <w:r>
+        <w:t xml:space="preserve"> (Desain)</w:t>
       </w:r>
     </w:p>
     <w:p>
@@ -1872,7 +2103,16 @@
         <w:jc w:val="both"/>
       </w:pPr>
       <w:r>
-        <w:t>Dalam pengembangan trainer kit multi sensor, tahap desain meliputi perancangan tata letak komponen pada board, pemilihan sensor dan aktuator yang sesuai, perancangan casing, serta penyusunan modul dan labsheet. Desain ini dibuat dengan mempertimbangkan aspek ergonomis, keamanan, dan kemudahan penggunaan. Selain itu, pada tahap ini juga dirancang instrumen penilaian berupa angket untuk ahli media, ahli materi, dan respons peserta didik.</w:t>
+        <w:t xml:space="preserve">Dalam pengembangan trainer kit multi sensor, tahap desain meliputi perancangan tata letak komponen pada </w:t>
+      </w:r>
+      <w:r>
+        <w:rPr>
+          <w:i/>
+        </w:rPr>
+        <w:t>board</w:t>
+      </w:r>
+      <w:r>
+        <w:t>, pemilihan sensor dan aktuator yang sesuai, perancangan casing, serta penyusunan modul dan labsheet. Desain ini dibuat dengan mempertimbangkan aspek ergonomis, keamanan, dan kemudahan penggunaan. Selain itu, pada tahap ini juga dirancang instrumen penilaian berupa angket untuk ahli media, ahli materi, dan respons peserta didik.</w:t>
       </w:r>
     </w:p>
     <w:p>
@@ -1896,8 +2136,14 @@
         <w:ind w:left="2117"/>
       </w:pPr>
       <w:r>
+        <w:rPr>
+          <w:i/>
+        </w:rPr>
         <w:lastRenderedPageBreak/>
-        <w:t>Development (Pengembangan)</w:t>
+        <w:t>Development</w:t>
+      </w:r>
+      <w:r>
+        <w:t xml:space="preserve"> (Pengembangan)</w:t>
       </w:r>
     </w:p>
     <w:p>
@@ -1953,7 +2199,13 @@
         <w:ind w:left="2117"/>
       </w:pPr>
       <w:r>
-        <w:t>Implementation (Implementasi)</w:t>
+        <w:rPr>
+          <w:i/>
+        </w:rPr>
+        <w:t>Implementation</w:t>
+      </w:r>
+      <w:r>
+        <w:t xml:space="preserve"> (Implementasi)</w:t>
       </w:r>
     </w:p>
     <w:p>
@@ -1979,7 +2231,13 @@
         <w:jc w:val="both"/>
       </w:pPr>
       <w:r>
-        <w:t>Dalam penelitian ini, tahap implementasi dilakukan dengan mengujicobakan trainer kit multi sensor kepada peserta didik di kelas Robot Inovasi CV Global Solusi Edukasi. Peserta didik menggunakan trainer kit untuk kegiatan praktikum sesuai dengan modul dan labsheet yang telah disediakan. Setelah selesai, peserta didik diminta mengisi angket respons untuk menilai kepraktisan dan kebermanfaatan produk.</w:t>
+        <w:t xml:space="preserve">Dalam penelitian ini, tahap implementasi dilakukan dengan mengujicobakan trainer kit multi sensor kepada peserta didik di kelas Robot Inovasi CV Global Solusi Edukasi. Peserta didik menggunakan trainer kit untuk kegiatan praktikum sesuai dengan modul dan labsheet yang telah disediakan. Setelah selesai, peserta didik diminta mengisi angket respons untuk menilai </w:t>
+      </w:r>
+      <w:r>
+        <w:t>kelayakan</w:t>
+      </w:r>
+      <w:r>
+        <w:t xml:space="preserve"> dan kebermanfaatan produk.</w:t>
       </w:r>
     </w:p>
     <w:p>
@@ -2011,7 +2269,13 @@
         <w:ind w:left="2117"/>
       </w:pPr>
       <w:r>
-        <w:t>Evaluation (Evaluasi)</w:t>
+        <w:rPr>
+          <w:i/>
+        </w:rPr>
+        <w:t>Evaluation</w:t>
+      </w:r>
+      <w:r>
+        <w:t xml:space="preserve"> (Evaluasi)</w:t>
       </w:r>
     </w:p>
     <w:p>
@@ -2022,7 +2286,7 @@
         <w:jc w:val="both"/>
       </w:pPr>
       <w:r>
-        <w:t>Tahap evaluasi merupakan tahap akhir dalam model ADDIE. Pada tahap ini, peneliti menganalisis data yang telah dikumpulkan dari validasi ahli dan uji coba pengguna, kemudian menarik simpulan mengenai kelayakan dan kepraktisan produk. Menurut Branch (2009: 103), evaluasi dilakukan secara formatif dan sumatif. Evaluasi formatif dilakukan di setiap tahap pengembangan, sedangkan evaluasi sumatif dilakukan setelah produk selesai diuji coba.</w:t>
+        <w:t>Tahap evaluasi merupakan tahap akhir dalam model ADDIE. Pada tahap ini, peneliti menganalisis data yang telah dikumpulkan dari validasi ahli dan uji coba pengguna, kemudian menarik simpulan mengenai kelayakan produk. Menurut Branch (2009: 103), evaluasi dilakukan secara formatif dan sumatif. Evaluasi formatif dilakukan di setiap tahap pengembangan, sedangkan evaluasi sumatif dilakukan setelah produk selesai diuji coba.</w:t>
       </w:r>
     </w:p>
     <w:p>
@@ -2034,7 +2298,7 @@
       </w:pPr>
       <w:r>
         <w:lastRenderedPageBreak/>
-        <w:t>Dalam penelitian ini, evaluasi dilakukan dengan menganalisis data dari angket ahli media, ahli materi, dan respons peserta didik. Hasil analisis digunakan untuk menentukan tingkat kelayakan dan kepraktisan trainer kit multi sensor. Selain itu, masukan dari ahli dan peserta didik digunakan untuk melakukan revisi akhir sebelum produk dinyatakan layak digunakan.</w:t>
+        <w:t>Dalam penelitian ini, evaluasi dilakukan dengan menganalisis data dari angket ahli media, ahli materi, dan respons peserta didik. Hasil analisis digunakan untuk menentukan tingkat kelayakan trainer kit multi sensor. Selain itu, masukan dari ahli dan peserta didik digunakan untuk melakukan revisi akhir sebelum produk dinyatakan layak digunakan.</w:t>
       </w:r>
     </w:p>
     <w:p>
@@ -2070,7 +2334,16 @@
         <w:jc w:val="both"/>
       </w:pPr>
       <w:r>
-        <w:t>Model ADDIE dipilih dalam penelitian ini karena beberapa alasan. Pertama, model ADDIE bersifat sistematis dan terstruktur. Setiap tahapan dalam model ini memiliki tujuan yang jelas dan saling berkaitan, sehingga proses pengembangan produk menjadi lebih terarah. Kedua, model ADDIE bersifat iteratif. Artinya, evaluasi dan revisi dapat dilakukan di setiap tahap, sehingga produk yang dihasilkan benar-benar sesuai dengan kebutuhan. Ketiga, model ADDIE dilengkapi dengan panduan praktis (checklist) di setiap tahapannya, sehingga memudahkan peneliti untuk memastikan bahwa setiap langkah telah dilakukan dengan benar (Branch, 2009: 5).</w:t>
+        <w:t>Model ADDIE dipilih dalam penelitian ini karena beberapa alasan. Pertama, model ADDIE bersifat sistematis dan terstruktur. Setiap tahapan dalam model ini memiliki tujuan yang jelas dan saling berkaitan, sehingga proses pengembangan produk menjadi lebih terarah. Kedua, model ADDIE bersifat iteratif. Artinya, evaluasi dan revisi dapat dilakukan di setiap tahap, sehingga produk yang dihasilkan benar-benar sesuai dengan kebutuhan. Ketiga, model ADDIE dilengkapi dengan panduan praktis (</w:t>
+      </w:r>
+      <w:r>
+        <w:rPr>
+          <w:i/>
+        </w:rPr>
+        <w:t>checklist</w:t>
+      </w:r>
+      <w:r>
+        <w:t>) di setiap tahapannya, sehingga memudahkan peneliti untuk memastikan bahwa setiap langkah telah dilakukan dengan benar (Branch, 2009: 5).</w:t>
       </w:r>
     </w:p>
     <w:p>
@@ -2155,7 +2428,25 @@
         <w:jc w:val="both"/>
       </w:pPr>
       <w:r>
-        <w:t>Berdasarkan beberapa pengertian di atas, dapat disimpulkan bahwa media pembelajaran adalah segala hal yang dapat digunakan untuk menyampaikan bahan pembelajaran sehingga menarik perhatian, minat, pikiran, dan perasaan peserta didik dalam kegiatan belajar untuk mencapai tujuan tertentu. Media pembelajaran terdiri atas dua unsur utama, yaitu perangkat keras (hardware) sebagai komponen fisik yang dapat dilihat, didengar, atau dirasakan, dan perangkat lunak (software) sebagai isi atau pesan yang ingin disampaikan (Arsyad, 2011: 5; Shoffa et al., 2023).</w:t>
+        <w:t>Berdasarkan beberapa pengertian di atas, dapat disimpulkan bahwa media pembelajaran adalah segala hal yang dapat digunakan untuk menyampaikan bahan pembelajaran sehingga menarik perhatian, minat, pikiran, dan perasaan peserta didik dalam kegiatan belajar untuk mencapai tujuan tertentu. Media pembelajaran terdiri atas dua unsur utama, yaitu perangkat keras (</w:t>
+      </w:r>
+      <w:r>
+        <w:rPr>
+          <w:i/>
+        </w:rPr>
+        <w:t>hardware</w:t>
+      </w:r>
+      <w:r>
+        <w:t>) sebagai komponen fisik yang dapat dilihat, didengar, atau dirasakan, dan perangkat lunak (</w:t>
+      </w:r>
+      <w:r>
+        <w:rPr>
+          <w:i/>
+        </w:rPr>
+        <w:t>software</w:t>
+      </w:r>
+      <w:r>
+        <w:t>) sebagai isi atau pesan yang ingin disampaikan (Arsyad, 2011: 5; Shoffa et al., 2023).</w:t>
       </w:r>
     </w:p>
     <w:p>
@@ -2536,11 +2827,38 @@
         <w:jc w:val="both"/>
       </w:pPr>
       <w:r>
-        <w:t xml:space="preserve">Karakteristik keempat adalah portabel. Trainer kit dirancang agar mudah dibawa dan digunakan di berbagai tempat. Ini penting, terutama untuk lembaga pelatihan yang mungkin tidak memiliki laboratorium tetap. Kelima, plug-and-play. Beberapa trainer kit modern dirancang dengan konsep ini. Komponen sudah terpasang </w:t>
+        <w:t xml:space="preserve">Karakteristik keempat adalah portabel. Trainer kit dirancang agar mudah dibawa dan digunakan di berbagai tempat. Ini penting, terutama untuk lembaga pelatihan yang mungkin tidak memiliki laboratorium tetap. Kelima, </w:t>
+      </w:r>
+      <w:r>
+        <w:rPr>
+          <w:i/>
+        </w:rPr>
+        <w:t>plug-and-play</w:t>
+      </w:r>
+      <w:r>
+        <w:t xml:space="preserve">. Beberapa trainer kit modern dirancang dengan konsep ini. Komponen sudah terpasang </w:t>
       </w:r>
       <w:r>
         <w:lastRenderedPageBreak/>
-        <w:t>permanen pada board, sehingga siswa hanya perlu melakukan wiring sederhana tanpa harus merakit dari nol. Konsep ini sangat membantu dalam menghemat waktu dan mengurangi risiko kerusakan.</w:t>
+        <w:t xml:space="preserve">permanen pada </w:t>
+      </w:r>
+      <w:r>
+        <w:rPr>
+          <w:i/>
+        </w:rPr>
+        <w:t>board</w:t>
+      </w:r>
+      <w:r>
+        <w:t xml:space="preserve">, sehingga siswa hanya perlu melakukan </w:t>
+      </w:r>
+      <w:r>
+        <w:rPr>
+          <w:i/>
+        </w:rPr>
+        <w:t>wiring</w:t>
+      </w:r>
+      <w:r>
+        <w:t xml:space="preserve"> sederhana tanpa harus merakit dari nol. Konsep ini sangat membantu dalam menghemat waktu dan mengurangi risiko kerusakan.</w:t>
       </w:r>
     </w:p>
     <w:p>
@@ -2718,7 +3036,34 @@
         <w:jc w:val="both"/>
       </w:pPr>
       <w:r>
-        <w:t>Trainer kit merupakan salah satu bentuk media pembelajaran yang efektif, terutama untuk mata pelajaran yang bersifat praktikum. Efektivitas ini tidak muncul begitu saja, melainkan karena trainer kit memenuhi beberapa kriteria kualitas. Menurut Van den Akker (1999: 10) dan Nieveen (1999: 127), dalam penelitian pengembangan media pembelajaran perlu memperhatikan tiga kriteria: kevalidan (validity), kepraktisan (practicality), dan keefektifan (effectiveness). Ketiga kriteria ini bisa dijadikan acuan untuk menilai apakah sebuah trainer kit layak digunakan atau tidak.</w:t>
+        <w:t>Trainer kit merupakan salah satu bentuk media pembelajaran yang efektif, terutama untuk mata pelajaran yang bersifat praktikum. Efektivitas ini tidak muncul begitu saja, melainkan karena trainer kit memenuhi beberapa kriteria kualitas. Menurut Van den Akker (1999: 10) dan Nieveen (1999: 127), dalam penelitian pengembangan media pembelajaran perlu memperhatikan tiga kriteria: kevalidan (</w:t>
+      </w:r>
+      <w:r>
+        <w:rPr>
+          <w:i/>
+        </w:rPr>
+        <w:t>validity</w:t>
+      </w:r>
+      <w:r>
+        <w:t>), kepraktisan (</w:t>
+      </w:r>
+      <w:r>
+        <w:rPr>
+          <w:i/>
+        </w:rPr>
+        <w:t>practicality</w:t>
+      </w:r>
+      <w:r>
+        <w:t>), dan keefektifan (</w:t>
+      </w:r>
+      <w:r>
+        <w:rPr>
+          <w:i/>
+        </w:rPr>
+        <w:t>effectiveness</w:t>
+      </w:r>
+      <w:r>
+        <w:t>). Ketiga kriteria ini bisa dijadikan acuan untuk menilai apakah sebuah trainer kit layak digunakan atau tidak.</w:t>
       </w:r>
     </w:p>
     <w:p>
@@ -2729,11 +3074,11 @@
         <w:jc w:val="both"/>
       </w:pPr>
       <w:r>
-        <w:t xml:space="preserve">Penelitian yang dilakukan oleh Muhammad Febri Wardiyanto (2019) menunjukkan bahwa trainer kit mikrokontroller Arduino Uno berbasis IoT yang dikembangkan memperoleh tingkat validitas sebesar 91.67% (sangat valid). Tingkat kepraktisannya mencapai 81.25% (praktis). Sementara itu, efektivitasnya </w:t>
+        <w:t xml:space="preserve">Penelitian yang dilakukan oleh Wardiyanto (2019) menunjukkan bahwa trainer kit mikrokontroler Arduino Uno berbasis IoT yang dikembangkan memperoleh tingkat validitas sebesar 91.67% (sangat valid). Selain itu, produk tersebut juga memperoleh respons positif dari pengguna. Sementara itu, </w:t>
       </w:r>
       <w:r>
         <w:lastRenderedPageBreak/>
-        <w:t>dibuktikan dengan hasil belajar peserta didik yang lebih besar dari KKM. Ini menunjukkan bahwa trainer kit tidak hanya layak secara teoritis, tetapi juga terbukti membantu siswa mencapai hasil belajar yang lebih baik.</w:t>
+        <w:t>efektivitasnya dibuktikan dengan hasil belajar peserta didik yang lebih besar dari KKM.</w:t>
       </w:r>
     </w:p>
     <w:p>
@@ -2744,7 +3089,19 @@
         <w:jc w:val="both"/>
       </w:pPr>
       <w:r>
-        <w:t>Penelitian lain oleh Cecen Hafada Ihsan (2024) juga memberikan gambaran serupa. Trainer kit sensor suhu berbasis Arduino Uno yang ia kembangkan memperoleh tingkat kelayakan 93% dari ahli media, 99% dari ahli materi, dan 85% dari uji coba siswa. Ketiga angka ini masuk dalam kategori "sangat layak". Artinya, trainer kit yang dirancang dengan baik tidak hanya diterima oleh para ahli, tetapi juga oleh pengguna akhir, yaitu siswa.</w:t>
+        <w:t xml:space="preserve">Penelitian lain oleh Cecen Hafada Ihsan (2024) juga memberikan gambaran serupa. Trainer kit sensor suhu berbasis Arduino Uno yang </w:t>
+      </w:r>
+      <w:r>
+        <w:t>dikembangkan oleh ihsan</w:t>
+      </w:r>
+      <w:r>
+        <w:t xml:space="preserve"> memperoleh tingkat kelayakan 93% dari ahli media, 99% dari ahli materi, dan 85% dari uji coba siswa. Ketiga angka ini masuk dalam kategori "sangat layak". Artinya, trainer kit yang dirancang dengan baik tidak hanya diterima oleh para ahli, tetapi juga oleh pengguna akhir, yaitu </w:t>
+      </w:r>
+      <w:r>
+        <w:t>peserta didik</w:t>
+      </w:r>
+      <w:r>
+        <w:t>.</w:t>
       </w:r>
     </w:p>
     <w:p>
@@ -2755,7 +3112,19 @@
         <w:jc w:val="both"/>
       </w:pPr>
       <w:r>
-        <w:t>Dari dua penelitian ini, bisa disimpulkan bahwa trainer kit adalah media pembelajaran yang layak dan efektif. Trainer kit tidak hanya membantu siswa memahami konsep, tetapi juga melatih keterampilan praktik yang relevan dengan dunia kerja. Untuk lembaga pelatihan seperti CV Global Solusi Edukasi, pengembangan trainer kit menjadi salah satu upaya strategis untuk meningkatkan kualitas pembelajaran. Dengan trainer kit, waktu praktikum yang terbatas bisa dimanfaatkan secara lebih optimal. Siswa tidak lagi menghabiskan waktu untuk merakit komponen dari nol, tetapi bisa langsung fokus pada eksplorasi dan analisis.</w:t>
+        <w:t xml:space="preserve">Dari dua penelitian ini, </w:t>
+      </w:r>
+      <w:r>
+        <w:t>dapat</w:t>
+      </w:r>
+      <w:r>
+        <w:t xml:space="preserve"> disimpulkan bahwa trainer kit adalah media pembelajaran yang layak dan efektif. Trainer kit tidak hanya membantu siswa memahami konsep, tetapi juga melatih keterampilan praktik yang relevan dengan </w:t>
+      </w:r>
+      <w:r>
+        <w:t>kebutuhan pembelajaran</w:t>
+      </w:r>
+      <w:r>
+        <w:t>. Untuk lembaga pelatihan seperti CV Global Solusi Edukasi, pengembangan trainer kit menjadi salah satu upaya strategis untuk meningkatkan kualitas pembelajaran. Dengan trainer kit, waktu praktikum yang terbatas bisa dimanfaatkan secara lebih optimal. Siswa tidak lagi menghabiskan waktu untuk merakit komponen dari nol, tetapi bisa langsung fokus pada eksplorasi dan analisis.</w:t>
       </w:r>
     </w:p>
     <w:p>
@@ -2766,8 +3135,20 @@
         <w:jc w:val="both"/>
       </w:pPr>
       <w:r>
+        <w:t>Dengan demikian</w:t>
+      </w:r>
+      <w:r>
+        <w:t xml:space="preserve">, trainer kit bukan sekadar alat. Media ini adalah perwujudan dari pendekatan pembelajaran yang menempatkan pengalaman langsung sebagai inti. Dalam konteks </w:t>
+      </w:r>
+      <w:r>
         <w:lastRenderedPageBreak/>
-        <w:t>Pada akhirnya, trainer kit bukan sekadar alat. Media ini adalah perwujudan dari pendekatan pembelajaran yang menempatkan pengalaman langsung sebagai inti. Dalam konteks pendidikan vokasi, pendekatan seperti ini sangat penting. Karena di sinilah siswa belajar untuk tidak hanya tahu, tetapi juga bisa.</w:t>
+        <w:t xml:space="preserve">pendidikan vokasi, pendekatan seperti ini sangat penting. Karena di sinilah siswa belajar untuk tidak hanya tahu, tetapi juga </w:t>
+      </w:r>
+      <w:r>
+        <w:t>menguasai keterampilan tersebut</w:t>
+      </w:r>
+      <w:r>
+        <w:t>.</w:t>
       </w:r>
     </w:p>
     <w:p>
@@ -2804,7 +3185,17 @@
         <w:t xml:space="preserve">Mikrokontroller </w:t>
       </w:r>
       <w:r>
-        <w:t>adalah perangkat elektronika digital yang mampu menerima masukan, memproses data, dan menghasilkan keluaran sesuai dengan program yang dapat ditulis maupun dihapus (Sumardi, 2013, dikutip dalam Tika, 2018). Cara kerja perangkat ini adalah dengan membaca dan menulis data secara terprogram, sehingga dapat dimanfaatkan untuk mengendalikan bermacam sistem elektronika. Suprapto (2012, dikutip dalam Tika, 2018) menjelaskan bahwa mikrokontroler tergolong sebagai embedded computer, yakni sistem komputer sederhana yang tersusun atas beberapa komponen pokok seperti prosesor, memori, input/output (I/O), serta clock.</w:t>
+        <w:t xml:space="preserve">adalah perangkat elektronika digital yang mampu menerima masukan, memproses data, dan menghasilkan keluaran sesuai dengan program yang dapat ditulis maupun dihapus (Sumardi, 2013, dikutip dalam Tika, 2018). Cara kerja perangkat ini adalah dengan membaca dan menulis data secara terprogram, sehingga dapat dimanfaatkan untuk mengendalikan bermacam sistem elektronika. Suprapto (2012, dikutip dalam Tika, 2018) menjelaskan bahwa mikrokontroler tergolong sebagai </w:t>
+      </w:r>
+      <w:r>
+        <w:rPr>
+          <w:i/>
+          <w:iCs/>
+        </w:rPr>
+        <w:t>embedded computer</w:t>
+      </w:r>
+      <w:r>
+        <w:t>, yakni sistem komputer sederhana yang tersusun atas beberapa komponen pokok seperti prosesor, memori, input/output (I/O), serta clock.</w:t>
       </w:r>
     </w:p>
     <w:p>
@@ -2852,9 +3243,8 @@
         <w:rPr>
           <w:noProof/>
         </w:rPr>
-        <w:lastRenderedPageBreak/>
         <w:drawing>
-          <wp:inline distT="0" distB="0" distL="0" distR="0" wp14:anchorId="33D2D60E" wp14:editId="1B25D965">
+          <wp:inline distT="0" distB="0" distL="0" distR="0" wp14:anchorId="33D2D60E" wp14:editId="0911AC5C">
             <wp:extent cx="2880000" cy="2179695"/>
             <wp:effectExtent l="0" t="0" r="0" b="0"/>
             <wp:docPr id="815156417" name="Picture 3"/>
@@ -2916,7 +3306,26 @@
         <w:jc w:val="both"/>
       </w:pPr>
       <w:r>
-        <w:t>Arduino Uno termasuk salah satu papan mikrokontroler yang dikembangkan oleh Arduino.cc dengan chip ATmega328P sebagai unit pemroses utamanya. Papan ini masuk dalam kategori development board yang dirancang agar pengguna lebih mudah mempelajari serta mengimplementasikan sistem kendali berbasis mikrokontroler. Usman &amp; Pratiwi (2022) menyebutkan bahwa Arduino Uno merupakan mikrokontroler yang ramah bagi pemula, mudah dipahami, dan banyak dipakai dalam pembelajaran dasar elektronika dan pemrograman.</w:t>
+        <w:lastRenderedPageBreak/>
+        <w:t xml:space="preserve">Arduino Uno termasuk salah satu papan mikrokontroler yang dikembangkan oleh Arduino.cc dengan chip ATmega328P sebagai unit pemroses utamanya. Papan ini masuk dalam kategori </w:t>
+      </w:r>
+      <w:r>
+        <w:rPr>
+          <w:i/>
+        </w:rPr>
+        <w:t>development</w:t>
+      </w:r>
+      <w:r>
+        <w:t xml:space="preserve"> </w:t>
+      </w:r>
+      <w:r>
+        <w:rPr>
+          <w:i/>
+        </w:rPr>
+        <w:t>board</w:t>
+      </w:r>
+      <w:r>
+        <w:t xml:space="preserve"> yang dirancang agar pengguna lebih mudah mempelajari serta mengimplementasikan sistem kendali berbasis mikrokontroler. Usman &amp; Pratiwi (2022) menyebutkan bahwa Arduino Uno merupakan mikrokontroler yang ramah bagi pemula, mudah dipahami, dan banyak dipakai dalam pembelajaran dasar elektronika dan pemrograman.</w:t>
       </w:r>
     </w:p>
     <w:p>
@@ -2927,36 +3336,68 @@
         <w:jc w:val="both"/>
       </w:pPr>
       <w:r>
-        <w:t xml:space="preserve">Arduino Uno memiliki sejumlah keunggulan sehingga banyak dimanfaatkan dalam dunia pendidikan, khususnya pembelajaran teknik. Keunggulan tersebut antara lain: (1) mudah digunakan karena tidak membutuhkan perangkat tambahan yang rumit untuk mulai memprogram; (2) memiliki komunitas pengguna yang besar sehingga referensi dan library pendukung sangat melimpah; (3) harganya terjangkau dan mudah diperoleh di pasaran; serta (4) </w:t>
+        <w:t xml:space="preserve">Arduino Uno memiliki sejumlah keunggulan sehingga banyak dimanfaatkan dalam dunia pendidikan, khususnya pembelajaran teknik. Keunggulan tersebut antara lain: (1) mudah digunakan karena tidak membutuhkan perangkat tambahan yang rumit untuk mulai memprogram; (2) memiliki komunitas pengguna yang besar sehingga referensi dan </w:t>
+      </w:r>
+      <w:r>
+        <w:rPr>
+          <w:i/>
+        </w:rPr>
+        <w:t>library</w:t>
+      </w:r>
+      <w:r>
+        <w:t xml:space="preserve"> pendukung sangat melimpah; (3) harganya terjangkau dan mudah diperoleh di pasaran; serta (4) jumlah pin I/O-nya cukup untuk mengakomodasi berbagai sensor dan aktuator.</w:t>
+      </w:r>
+    </w:p>
+    <w:p>
+      <w:pPr>
+        <w:spacing w:line="480" w:lineRule="auto"/>
+        <w:ind w:left="1353" w:firstLine="556"/>
+        <w:jc w:val="both"/>
+      </w:pPr>
+      <w:r>
+        <w:t xml:space="preserve">Selain itu, Syahwill (2013, dikutip dalam Tika, 2018) menambahkan beberapa kelebihan Arduino dibandingkan mikrokontroler lain, yaitu: (1) harga papan Arduino relatif lebih murah dibanding platform mikrokontroler lain; (2) bahasa pemrogramannya cukup fleksibel, baik untuk pemula maupun </w:t>
       </w:r>
       <w:r>
         <w:lastRenderedPageBreak/>
-        <w:t>jumlah pin I/O-nya cukup untuk mengakomodasi berbagai sensor dan aktuator.</w:t>
-      </w:r>
-    </w:p>
-    <w:p>
-      <w:pPr>
+        <w:t xml:space="preserve">pengguna mahir; (3) perangkat lunak Arduino IDE bersifat </w:t>
+      </w:r>
+      <w:r>
+        <w:rPr>
+          <w:i/>
+        </w:rPr>
+        <w:t>open source</w:t>
+      </w:r>
+      <w:r>
+        <w:t xml:space="preserve"> sehingga dapat dikembangkan lebih lanjut; (4) perangkat kerasnya juga </w:t>
+      </w:r>
+      <w:r>
+        <w:rPr>
+          <w:i/>
+        </w:rPr>
+        <w:t>open source</w:t>
+      </w:r>
+      <w:r>
+        <w:t xml:space="preserve"> sehingga pengguna dapat membuat sendiri Arduino berbasis ATmega8, ATmega168, ATmega328, dan ATmega1280; (5) Arduino sudah dilengkapi chip programmer; (6) komunikasi dapat dilakukan melalui USB; (7) perangkat lunaknya dilengkapi kumpulan </w:t>
+      </w:r>
+      <w:r>
+        <w:rPr>
+          <w:i/>
+        </w:rPr>
+        <w:t>library</w:t>
+      </w:r>
+      <w:r>
+        <w:t xml:space="preserve"> sehingga bahasa pemrograman relatif mudah; dan (8) tersedia modul siap pakai (shield) yang dapat langsung ditancapkan pada papan Arduino, seperti shield GPS, Ethernet, dan SD Card.</w:t>
+      </w:r>
+    </w:p>
+    <w:p>
+      <w:pPr>
+        <w:pStyle w:val="ListParagraph"/>
         <w:spacing w:line="480" w:lineRule="auto"/>
         <w:ind w:left="1353" w:firstLine="556"/>
         <w:jc w:val="both"/>
       </w:pPr>
       <w:r>
-        <w:t>Selain itu, Syahwill (2013, dikutip dalam Tika, 2018) menambahkan beberapa kelebihan Arduino dibandingkan mikrokontroler lain, yaitu: (1) harga papan Arduino relatif lebih murah dibanding platform mikrokontroler lain; (2) bahasa pemrogramannya cukup fleksibel, baik untuk pemula maupun pengguna mahir; (3) perangkat lunak Arduino IDE bersifat open source sehingga dapat dikembangkan lebih lanjut; (4) perangkat kerasnya juga open source sehingga pengguna dapat membuat sendiri Arduino berbasis ATmega8, ATmega168, ATmega328, dan ATmega1280; (5) Arduino sudah dilengkapi chip programmer; (6) komunikasi dapat dilakukan melalui USB; (7) perangkat lunaknya dilengkapi kumpulan library sehingga bahasa pemrograman relatif mudah; dan (8) tersedia modul siap pakai (shield) yang dapat langsung ditancapkan pada papan Arduino, seperti shield GPS, Ethernet, dan SD Card.</w:t>
-      </w:r>
-    </w:p>
-    <w:p>
-      <w:pPr>
-        <w:pStyle w:val="ListParagraph"/>
-        <w:spacing w:line="480" w:lineRule="auto"/>
-        <w:ind w:left="1353" w:firstLine="556"/>
-        <w:jc w:val="both"/>
-      </w:pPr>
-      <w:r>
-        <w:t xml:space="preserve">Secara umum, Arduino Uno berperan sebagai pusat kendali dalam suatu sistem elektronika. Mikrokontroler ini mampu membaca input dari berbagai sensor, memproses data berdasarkan program yang telah diunggah, lalu memberikan output kepada aktuator seperti LED, buzzer, LCD, dan servo. Dengan kemampuan tersebut, Arduino Uno dinilai cocok digunakan sebagai kontroler </w:t>
-      </w:r>
-      <w:r>
-        <w:lastRenderedPageBreak/>
-        <w:t>utama dalam pengembangan media pembelajaran berbasis praktikum, terutama pada materi sensor dan aktuator.</w:t>
+        <w:t>Secara umum, Arduino Uno berperan sebagai pusat kendali dalam suatu sistem elektronika. Mikrokontroler ini mampu membaca input dari berbagai sensor, memproses data berdasarkan program yang telah diunggah, lalu memberikan output kepada aktuator seperti LED, buzzer, LCD, dan servo. Dengan kemampuan tersebut, Arduino Uno dinilai cocok digunakan sebagai kontroler utama dalam pengembangan media pembelajaran berbasis praktikum, terutama pada materi sensor dan aktuator.</w:t>
       </w:r>
     </w:p>
     <w:p>
@@ -2981,7 +3422,11 @@
         <w:jc w:val="both"/>
       </w:pPr>
       <w:r>
-        <w:t>Arduino Uno memiliki spesifikasi teknis yang perlu dipahami sebelum digunakan dalam pengembangan suatu sistem. Spesifikasi tersebut mencakup aspek pemrosesan, memori, tegangan kerja, dan jumlah pin yang tersedia. Adapun spesifikasi lengkap Arduino Uno disajikan pada Tabel 2 berikut.</w:t>
+        <w:t xml:space="preserve">Arduino Uno memiliki spesifikasi teknis yang perlu dipahami sebelum digunakan dalam pengembangan suatu sistem. Spesifikasi tersebut mencakup aspek pemrosesan, memori, tegangan kerja, dan </w:t>
+      </w:r>
+      <w:r>
+        <w:lastRenderedPageBreak/>
+        <w:t>jumlah pin yang tersedia. Adapun spesifikasi lengkap Arduino Uno disajikan pada Tabel 2 berikut.</w:t>
       </w:r>
     </w:p>
     <w:p>
@@ -3681,21 +4126,21 @@
         <w:jc w:val="both"/>
       </w:pPr>
       <w:r>
-        <w:t xml:space="preserve">Berdasarkan Tabel 2, Arduino Uno memiliki kapasitas memori yang cukup untuk menyimpan program sederhana hingga menengah. Flash memory sebesar 32 KB dapat digunakan untuk menyimpan program, sedangkan SRAM sebesar 2 KB digunakan </w:t>
+        <w:t>Berdasarkan Tabel 2, Arduino Uno memiliki kapasitas memori yang cukup untuk menyimpan program sederhana hingga menengah. Flash memory sebesar 32 KB dapat digunakan untuk menyimpan program, sedangkan SRAM sebesar 2 KB digunakan untuk menyimpan data sementara saat program berjalan. Adapun EEPROM sebesar 1 KB dapat digunakan untuk menyimpan data yang bersifat permanen meskipun daya dimatikan.</w:t>
+      </w:r>
+    </w:p>
+    <w:p>
+      <w:pPr>
+        <w:spacing w:line="480" w:lineRule="auto"/>
+        <w:ind w:left="1361" w:firstLine="545"/>
+        <w:jc w:val="both"/>
+      </w:pPr>
+      <w:r>
+        <w:t xml:space="preserve">Tegangan operasi Arduino Uno sebesar 5V membuatnya kompatibel dengan sebagian besar modul sensor dan aktuator yang tersedia di pasaran. Tegangan input yang direkomendasikan </w:t>
       </w:r>
       <w:r>
         <w:lastRenderedPageBreak/>
-        <w:t>untuk menyimpan data sementara saat program berjalan. Adapun EEPROM sebesar 1 KB dapat digunakan untuk menyimpan data yang bersifat permanen meskipun daya dimatikan.</w:t>
-      </w:r>
-    </w:p>
-    <w:p>
-      <w:pPr>
-        <w:spacing w:line="480" w:lineRule="auto"/>
-        <w:ind w:left="1361" w:firstLine="545"/>
-        <w:jc w:val="both"/>
-      </w:pPr>
-      <w:r>
-        <w:t>Tegangan operasi Arduino Uno sebesar 5V membuatnya kompatibel dengan sebagian besar modul sensor dan aktuator yang tersedia di pasaran. Tegangan input yang direkomendasikan berkisar antara 7-12V, sehingga Arduino Uno dapat disuplai daya melalui adaptor DC maupun melalui kabel USB yang terhubung ke komputer. Dalam pengembangan trainer kit ini, Arduino Uno disuplai daya melalui kabel USB yang terhubung ke laptop, sehingga tidak memerlukan adaptor tambahan.</w:t>
+        <w:t>berkisar antara 7-12V, sehingga Arduino Uno dapat disuplai daya melalui adaptor DC maupun melalui kabel USB yang terhubung ke komputer. Dalam pengembangan trainer kit ini, Arduino Uno disuplai daya melalui kabel USB yang terhubung ke laptop, sehingga tidak memerlukan adaptor tambahan.</w:t>
       </w:r>
     </w:p>
     <w:p>
@@ -3748,11 +4193,7 @@
         <w:jc w:val="both"/>
       </w:pPr>
       <w:r>
-        <w:t xml:space="preserve">Arduino Uno memiliki 14 pin digital yang diberi label D0 hingga D13. Pin-pin tersebut dapat difungsikan sebagai </w:t>
-      </w:r>
-      <w:r>
-        <w:lastRenderedPageBreak/>
-        <w:t>input maupun output digital. Beberapa pin memiliki fungsi khusus yang perlu diperhatikan dalam perancangan rangkaian, yaitu:</w:t>
+        <w:t>Arduino Uno memiliki 14 pin digital yang diberi label D0 hingga D13. Pin-pin tersebut dapat difungsikan sebagai input maupun output digital. Beberapa pin memiliki fungsi khusus yang perlu diperhatikan dalam perancangan rangkaian, yaitu:</w:t>
       </w:r>
     </w:p>
     <w:p>
@@ -3766,7 +4207,11 @@
         <w:jc w:val="both"/>
       </w:pPr>
       <w:r>
-        <w:t>Pin 0 (RX) dan Pin 1 (TX): digunakan untuk komunikasi serial. Pin ini juga terhubung dengan chip USB-serial, sehingga sebaiknya tidak digunakan sebagai input/output digital biasa saat proses upload program berlangsung.</w:t>
+        <w:t xml:space="preserve">Pin 0 (RX) dan Pin 1 (TX): digunakan untuk komunikasi serial. Pin ini juga terhubung dengan chip USB-serial, </w:t>
+      </w:r>
+      <w:r>
+        <w:lastRenderedPageBreak/>
+        <w:t>sehingga sebaiknya tidak digunakan sebagai input/output digital biasa saat proses upload program berlangsung.</w:t>
       </w:r>
     </w:p>
     <w:p>
@@ -3833,11 +4278,20 @@
         <w:jc w:val="both"/>
       </w:pPr>
       <w:r>
-        <w:t xml:space="preserve">Arduino Uno memiliki 6 pin analog yang diberi label A0 hingga A5. Pin-pin tersebut berfungsi untuk membaca sinyal analog dari sensor dan mengonversinya menjadi data digital </w:t>
+        <w:t xml:space="preserve">Arduino Uno memiliki 6 pin analog yang diberi label A0 hingga A5. Pin-pin tersebut berfungsi untuk membaca sinyal analog dari sensor dan mengonversinya menjadi data digital melalui fitur </w:t>
+      </w:r>
+      <w:r>
+        <w:rPr>
+          <w:i/>
+        </w:rPr>
+        <w:t>Analog-to-Digital Converter</w:t>
+      </w:r>
+      <w:r>
+        <w:t xml:space="preserve"> (ADC) yang terdapat pada mikrokontroler. Setiap pin analog memiliki resolusi 10 bit, sehingga mampu membaca nilai dari 0 hingga 1023. Fitur ini sangat penting dalam pengembangan trainer kit karena sebagian besar sensor yang digunakan, seperti LDR, MQ-6, </w:t>
       </w:r>
       <w:r>
         <w:lastRenderedPageBreak/>
-        <w:t>melalui fitur Analog-to-Digital Converter (ADC) yang terdapat pada mikrokontroler. Setiap pin analog memiliki resolusi 10 bit, sehingga mampu membaca nilai dari 0 hingga 1023. Fitur ini sangat penting dalam pengembangan trainer kit karena sebagian besar sensor yang digunakan, seperti LDR, MQ-6, dan Rain Drop, menghasilkan keluaran berupa tegangan analog yang perlu dikonversi terlebih dahulu sebelum diproses lebih lanjut.</w:t>
+        <w:t>dan Rain Drop, menghasilkan keluaran berupa tegangan analog yang perlu dikonversi terlebih dahulu sebelum diproses lebih lanjut.</w:t>
       </w:r>
     </w:p>
     <w:p>
@@ -3935,7 +4389,6 @@
         <w:jc w:val="both"/>
       </w:pPr>
       <w:r>
-        <w:lastRenderedPageBreak/>
         <w:t>AREF: tegangan referensi untuk pin analog, digunakan apabila pengguna ingin mengubah rentang pembacaan ADC.</w:t>
       </w:r>
     </w:p>
@@ -3964,6 +4417,7 @@
         <w:jc w:val="both"/>
       </w:pPr>
       <w:r>
+        <w:lastRenderedPageBreak/>
         <w:t>Pin Khusus</w:t>
       </w:r>
     </w:p>
@@ -3975,7 +4429,16 @@
         <w:jc w:val="both"/>
       </w:pPr>
       <w:r>
-        <w:t>Selain pin digital, analog, dan power, Arduino Uno juga memiliki pin khusus yang berfungsi untuk keperluan tertentu. Pin ICSP (In-Circuit Serial Programming) digunakan untuk memprogram mikrokontroler secara langsung tanpa melalui bootloader, sedangkan pin USB digunakan untuk komunikasi data antara Arduino Uno dengan komputer, sekaligus sebagai jalur upload program dan sumber daya. Keberadaan pin khusus ini memberikan fleksibilitas bagi pengguna dalam mengembangkan sistem yang lebih kompleks.</w:t>
+        <w:t>Selain pin digital, analog, dan power, Arduino Uno juga memiliki pin khusus yang berfungsi untuk keperluan tertentu. Pin ICSP (</w:t>
+      </w:r>
+      <w:r>
+        <w:rPr>
+          <w:i/>
+        </w:rPr>
+        <w:t>In-circuit serial programming</w:t>
+      </w:r>
+      <w:r>
+        <w:t>) digunakan untuk memprogram mikrokontroler secara langsung tanpa melalui bootloader, sedangkan pin USB digunakan untuk komunikasi data antara Arduino Uno dengan komputer, sekaligus sebagai jalur upload program dan sumber daya. Keberadaan pin khusus ini memberikan fleksibilitas bagi pengguna dalam mengembangkan sistem yang lebih kompleks.</w:t>
       </w:r>
       <w:r>
         <w:t xml:space="preserve"> </w:t>
@@ -4360,11 +4823,7 @@
           </w:tcPr>
           <w:p>
             <w:r>
-              <w:t xml:space="preserve">D10 (SS), D11 (MOSI), D12 </w:t>
-            </w:r>
-            <w:r>
-              <w:lastRenderedPageBreak/>
-              <w:t>(MISO), D13 (SCK)</w:t>
+              <w:t>D10 (SS), D11 (MOSI), D12 (MISO), D13 (SCK)</w:t>
             </w:r>
             <w:r>
               <w:tab/>
@@ -4378,7 +4837,6 @@
           </w:tcPr>
           <w:p>
             <w:r>
-              <w:lastRenderedPageBreak/>
               <w:t>Komunikasi SPI</w:t>
             </w:r>
           </w:p>
@@ -4648,7 +5106,11 @@
           </w:tcPr>
           <w:p>
             <w:r>
-              <w:t>Tegangan output 5V</w:t>
+              <w:t xml:space="preserve">Tegangan output </w:t>
+            </w:r>
+            <w:r>
+              <w:lastRenderedPageBreak/>
+              <w:t>5V</w:t>
             </w:r>
           </w:p>
         </w:tc>
@@ -4667,6 +5129,7 @@
               <w:jc w:val="center"/>
             </w:pPr>
             <w:r>
+              <w:lastRenderedPageBreak/>
               <w:t>11.</w:t>
             </w:r>
           </w:p>
@@ -4960,19 +5423,22 @@
         <w:jc w:val="both"/>
       </w:pPr>
       <w:r>
+        <w:t>Pengertian Sensor</w:t>
+      </w:r>
+    </w:p>
+    <w:p>
+      <w:pPr>
+        <w:pStyle w:val="ListParagraph"/>
+        <w:spacing w:line="480" w:lineRule="auto"/>
+        <w:ind w:left="1417" w:firstLine="568"/>
+        <w:jc w:val="both"/>
+      </w:pPr>
+      <w:r>
+        <w:t xml:space="preserve">Sensor merupakan perangkat yang berfungsi untuk mendeteksi perubahan besaran fisik atau kimia di lingkungan sekitarnya, kemudian mengubahnya menjadi sinyal listrik yang dapat dibaca oleh mikrokontroler. Menurut Arsyad (2011: 20), </w:t>
+      </w:r>
+      <w:r>
         <w:lastRenderedPageBreak/>
-        <w:t>Pengertian Sensor</w:t>
-      </w:r>
-    </w:p>
-    <w:p>
-      <w:pPr>
-        <w:pStyle w:val="ListParagraph"/>
-        <w:spacing w:line="480" w:lineRule="auto"/>
-        <w:ind w:left="1417" w:firstLine="568"/>
-        <w:jc w:val="both"/>
-      </w:pPr>
-      <w:r>
-        <w:t>Sensor merupakan perangkat yang berfungsi untuk mendeteksi perubahan besaran fisik atau kimia di lingkungan sekitarnya, kemudian mengubahnya menjadi sinyal listrik yang dapat dibaca oleh mikrokontroler. Menurut Arsyad (2011: 20), sensor adalah komponen yang berfungsi untuk mengubah besaran fisik menjadi besaran listrik. Dalam konteks sistem kendali, sensor berperan sebagai masukan (input) yang memberikan informasi mengenai kondisi lingkungan kepada sistem. Informasi tersebut kemudian diproses oleh mikrokontroler untuk menghasilkan keluaran (output) yang sesuai. Tanpa sensor, sistem kendali tidak akan mampu berinteraksi dengan lingkungannya secara otomatis.</w:t>
+        <w:t>sensor adalah komponen yang berfungsi untuk mengubah besaran fisik menjadi besaran listrik. Dalam konteks sistem kendali, sensor berperan sebagai masukan (input) yang memberikan informasi mengenai kondisi lingkungan kepada sistem. Informasi tersebut kemudian diproses oleh mikrokontroler untuk menghasilkan keluaran (output) yang sesuai. Tanpa sensor, sistem kendali tidak akan mampu berinteraksi dengan lingkungannya secara otomatis.</w:t>
       </w:r>
     </w:p>
     <w:p>
@@ -5009,11 +5475,11 @@
         <w:jc w:val="both"/>
       </w:pPr>
       <w:r>
-        <w:t xml:space="preserve">Push button merupakan salah satu jenis saklar yang bekerja secara momentary, artinya tombol ini hanya akan terhubung (ON) selama ditekan, dan akan kembali terputus (OFF) saat dilepaskan. </w:t>
+        <w:t xml:space="preserve">Push button merupakan salah satu jenis saklar yang bekerja secara momentary, artinya tombol ini hanya akan terhubung (ON) selama ditekan, dan akan kembali terputus (OFF) saat dilepaskan. Push button termasuk dalam kategori sensor digital karena hanya menghasilkan dua kondisi, yaitu high dan low. Prinsip kerjanya didasarkan pada prinsip kontak mekanis. Ketika tombol ditekan, kontak akan tertutup dan mengalirkan arus listrik. Sebaliknya, </w:t>
       </w:r>
       <w:r>
         <w:lastRenderedPageBreak/>
-        <w:t>Push button termasuk dalam kategori sensor digital karena hanya menghasilkan dua kondisi, yaitu high dan low. Prinsip kerjanya didasarkan pada prinsip kontak mekanis. Ketika tombol ditekan, kontak akan tertutup dan mengalirkan arus listrik. Sebaliknya, ketika tombol dilepaskan, kontak akan terbuka dan arus listrik terhenti.</w:t>
+        <w:t>ketika tombol dilepaskan, kontak akan terbuka dan arus listrik terhenti.</w:t>
       </w:r>
     </w:p>
     <w:p>
@@ -5191,22 +5657,22 @@
         <w:jc w:val="both"/>
       </w:pPr>
       <w:r>
-        <w:t xml:space="preserve">Light Dependent Resistor (LDR) adalah salah satu jenis resistor yang nilai resistansinya berubah-ubah sesuai dengan intensitas cahaya yang mengenainya. LDR terbuat dari bahan semikonduktor seperti kadmium sulfida. Prinsip kerjanya didasarkan pada efek fotokonduktif, yaitu ketika cahaya mengenai permukaan LDR, energi foton akan mengeksitasi elektron pada bahan semikonduktor. Akibatnya, jumlah elektron bebas meningkat </w:t>
+        <w:t>Light Dependent Resistor (LDR) adalah salah satu jenis resistor yang nilai resistansinya berubah-ubah sesuai dengan intensitas cahaya yang mengenainya. LDR terbuat dari bahan semikonduktor seperti kadmium sulfida. Prinsip kerjanya didasarkan pada efek fotokonduktif, yaitu ketika cahaya mengenai permukaan LDR, energi foton akan mengeksitasi elektron pada bahan semikonduktor. Akibatnya, jumlah elektron bebas meningkat dan nilai resistansi LDR menurun. Sebaliknya, ketika intensitas cahaya rendah (gelap), nilai resistansi LDR akan meningkat.</w:t>
+      </w:r>
+    </w:p>
+    <w:p>
+      <w:pPr>
+        <w:pStyle w:val="ListParagraph"/>
+        <w:spacing w:line="480" w:lineRule="auto"/>
+        <w:ind w:left="1417" w:firstLine="568"/>
+        <w:jc w:val="both"/>
+      </w:pPr>
+      <w:r>
+        <w:t xml:space="preserve">Dalam pengembangan trainer kit ini, LDR yang digunakan adalah modul LDR yang telah dilengkapi dengan rangkaian </w:t>
       </w:r>
       <w:r>
         <w:lastRenderedPageBreak/>
-        <w:t>dan nilai resistansi LDR menurun. Sebaliknya, ketika intensitas cahaya rendah (gelap), nilai resistansi LDR akan meningkat.</w:t>
-      </w:r>
-    </w:p>
-    <w:p>
-      <w:pPr>
-        <w:pStyle w:val="ListParagraph"/>
-        <w:spacing w:line="480" w:lineRule="auto"/>
-        <w:ind w:left="1417" w:firstLine="568"/>
-        <w:jc w:val="both"/>
-      </w:pPr>
-      <w:r>
-        <w:t>Dalam pengembangan trainer kit ini, LDR yang digunakan adalah modul LDR yang telah dilengkapi dengan rangkaian pembagi tegangan dan komparator. Modul ini menyediakan dua jenis keluaran, yaitu digital dan analog.</w:t>
+        <w:t>pembagi tegangan dan komparator. Modul ini menyediakan dua jenis keluaran, yaitu digital dan analog.</w:t>
       </w:r>
     </w:p>
     <w:p>
@@ -5463,7 +5929,7 @@
           <w:noProof/>
         </w:rPr>
         <w:drawing>
-          <wp:inline distT="0" distB="0" distL="0" distR="0" wp14:anchorId="43A4CF97" wp14:editId="0241389F">
+          <wp:inline distT="0" distB="0" distL="0" distR="0" wp14:anchorId="43A4CF97" wp14:editId="5037D5CB">
             <wp:extent cx="2520000" cy="2416714"/>
             <wp:effectExtent l="0" t="0" r="0" b="0"/>
             <wp:docPr id="824963717" name="Picture 16" descr="LDR Sensor LM393 Module, 4-Pin Digital and Analog Output, : Amazon.in:  Industrial &amp; Scientific"/>
@@ -5550,11 +6016,11 @@
         <w:jc w:val="both"/>
       </w:pPr>
       <w:r>
-        <w:t xml:space="preserve">Sensor ultrasonik HC-SR04 adalah sensor yang bekerja berdasarkan prinsip pantulan gelombang suara. Sensor ini terdiri dari dua unit utama, yaitu transmitter (pemancar) dan receiver </w:t>
+        <w:t xml:space="preserve">Sensor ultrasonik HC-SR04 adalah sensor yang bekerja berdasarkan prinsip pantulan gelombang suara. Sensor ini terdiri dari dua unit utama, yaitu transmitter (pemancar) dan receiver (penerima). Transmitter memancarkan gelombang ultrasonik dengan frekuensi 40 kHz, kemudian gelombang tersebut memantul jika mengenai objek dan diterima kembali oleh receiver. Selisih </w:t>
       </w:r>
       <w:r>
         <w:lastRenderedPageBreak/>
-        <w:t>(penerima). Transmitter memancarkan gelombang ultrasonik dengan frekuensi 40 kHz, kemudian gelombang tersebut memantul jika mengenai objek dan diterima kembali oleh receiver. Selisih waktu antara pemancaran dan penerimaan gelombang digunakan untuk menghitung jarak antara sensor dan objek.</w:t>
+        <w:t>waktu antara pemancaran dan penerimaan gelombang digunakan untuk menghitung jarak antara sensor dan objek.</w:t>
       </w:r>
     </w:p>
     <w:p>
@@ -5925,9 +6391,8 @@
         <w:rPr>
           <w:noProof/>
         </w:rPr>
-        <w:lastRenderedPageBreak/>
         <w:drawing>
-          <wp:inline distT="0" distB="0" distL="0" distR="0" wp14:anchorId="4748DFD4" wp14:editId="6BC1BB74">
+          <wp:inline distT="0" distB="0" distL="0" distR="0" wp14:anchorId="4748DFD4" wp14:editId="1791D227">
             <wp:extent cx="2400300" cy="3023083"/>
             <wp:effectExtent l="0" t="0" r="0" b="0"/>
             <wp:docPr id="359248327" name="Picture 17" descr="ROBOWAY 1Pcs HC-SR04 Ultrasonic Sensor Module Distance Measuring Sensor 5V  for Robotics, Obstacle Detection, Smart Projects, Automation (2cm-400cm  Range) (Pack of 1) : Amazon.in: Industrial &amp; Scientific"/>
@@ -5988,6 +6453,7 @@
         <w:jc w:val="both"/>
       </w:pPr>
       <w:r>
+        <w:lastRenderedPageBreak/>
         <w:t>Sensor IR Obstacle</w:t>
       </w:r>
     </w:p>
@@ -6188,7 +6654,6 @@
         <w:ind w:left="1418"/>
       </w:pPr>
       <w:r>
-        <w:lastRenderedPageBreak/>
         <w:t>Gambar 3. Sensor Ultrasonik HC-SR04</w:t>
       </w:r>
     </w:p>
@@ -6227,7 +6692,7 @@
           <w:noProof/>
         </w:rPr>
         <w:drawing>
-          <wp:inline distT="0" distB="0" distL="0" distR="0" wp14:anchorId="47D51D9B" wp14:editId="0E8A53E9">
+          <wp:inline distT="0" distB="0" distL="0" distR="0" wp14:anchorId="47D51D9B" wp14:editId="6C125D4A">
             <wp:extent cx="2880000" cy="1235342"/>
             <wp:effectExtent l="0" t="0" r="0" b="0"/>
             <wp:docPr id="1605342463" name="Picture 18" descr="Infrared IR Obstacle Avoidance Sensor Board 3 Pin"/>
@@ -6307,7 +6772,11 @@
         <w:jc w:val="both"/>
       </w:pPr>
       <w:r>
-        <w:t>Sensor DHT22 adalah sensor digital yang berfungsi untuk mengukur suhu dan kelembapan udara. Sensor ini terdiri dari dua bagian utama, yaitu elemen pengukur kelembapan (kapasitif) dan elemen pengukur suhu (termistor NTC). Prinsip kerjanya didasarkan pada perubahan kapasitansi akibat perubahan kelembapan dan perubahan resistansi termistor akibat perubahan suhu. Data hasil pengukuran dikirimkan dalam bentuk sinyal digital melalui pin data.</w:t>
+        <w:t xml:space="preserve">Sensor DHT22 adalah sensor digital yang berfungsi untuk mengukur suhu dan kelembapan udara. Sensor ini terdiri dari dua bagian utama, yaitu elemen pengukur kelembapan (kapasitif) dan </w:t>
+      </w:r>
+      <w:r>
+        <w:lastRenderedPageBreak/>
+        <w:t>elemen pengukur suhu (termistor NTC). Prinsip kerjanya didasarkan pada perubahan kapasitansi akibat perubahan kelembapan dan perubahan resistansi termistor akibat perubahan suhu. Data hasil pengukuran dikirimkan dalam bentuk sinyal digital melalui pin data.</w:t>
       </w:r>
     </w:p>
     <w:p>
@@ -6541,7 +7010,6 @@
         <w:rPr>
           <w:noProof/>
         </w:rPr>
-        <w:lastRenderedPageBreak/>
         <w:drawing>
           <wp:inline distT="0" distB="0" distL="0" distR="0" wp14:anchorId="73FB99CE" wp14:editId="31CEC336">
             <wp:extent cx="2880000" cy="1220625"/>
@@ -6613,7 +7081,11 @@
         <w:jc w:val="both"/>
       </w:pPr>
       <w:r>
-        <w:t>Dalam pengembangan trainer kit ini, sensor DHT22 dipilih sebagai pengganti DHT11. Pemilihan ini didasarkan pada beberapa pertimbangan teknis. Pertama, DHT22 memiliki rentang pengukuran suhu yang lebih luas, yaitu -40°C hingga 80°C, sedangkan DHT11 hanya 0°C hingga 50°C. Kedua, akurasi pengukuran suhu DHT22 lebih tinggi, yaitu 0.5°C, dibandingkan DHT11 yang memiliki akurasi 2°C. Ketiga, rentang pengukuran kelembapan DHT22 mencapai 0-100%, sedangkan DHT11 hanya 20-80%. Keempat, akurasi pengukuran kelembapan DHT22 lebih baik, yaitu 2-5%, dibandingkan DHT11 yang mencapai 5%. Dengan pertimbangan tersebut, DHT22 dinilai lebih sesuai untuk digunakan dalam kegiatan praktikum yang membutuhkan data pengukuran yang lebih presisi. Perbandingan antara DHT11 dan DHT22 secara ringkas dapat dilihat pada Gambar 6.</w:t>
+        <w:t xml:space="preserve">Dalam pengembangan trainer kit ini, sensor DHT22 dipilih sebagai pengganti DHT11. Pemilihan ini didasarkan pada beberapa pertimbangan teknis. Pertama, DHT22 memiliki rentang pengukuran suhu yang lebih luas, yaitu -40°C hingga 80°C, sedangkan DHT11 hanya 0°C hingga 50°C. Kedua, akurasi pengukuran suhu DHT22 lebih tinggi, yaitu 0.5°C, dibandingkan DHT11 yang memiliki akurasi 2°C. Ketiga, rentang pengukuran kelembapan DHT22 mencapai 0-100%, sedangkan DHT11 hanya </w:t>
+      </w:r>
+      <w:r>
+        <w:lastRenderedPageBreak/>
+        <w:t>20-80%. Keempat, akurasi pengukuran kelembapan DHT22 lebih baik, yaitu 2-5%, dibandingkan DHT11 yang mencapai 5%. Dengan pertimbangan tersebut, DHT22 dinilai lebih sesuai untuk digunakan dalam kegiatan praktikum yang membutuhkan data pengukuran yang lebih presisi. Perbandingan antara DHT11 dan DHT22 secara ringkas dapat dilihat pada Gambar 6.</w:t>
       </w:r>
     </w:p>
     <w:p>
@@ -6663,9 +7135,8 @@
         <w:rPr>
           <w:noProof/>
         </w:rPr>
-        <w:lastRenderedPageBreak/>
         <w:drawing>
-          <wp:inline distT="0" distB="0" distL="0" distR="0" wp14:anchorId="0391923B" wp14:editId="6620AC99">
+          <wp:inline distT="0" distB="0" distL="0" distR="0" wp14:anchorId="0391923B" wp14:editId="5E187A22">
             <wp:extent cx="4320000" cy="2392165"/>
             <wp:effectExtent l="0" t="0" r="0" b="0"/>
             <wp:docPr id="592196616" name="Picture 20" descr="Perbedaan Antara Sensor DHT11 dengan DHT22 dan Cara Kerjanya"/>
@@ -6849,6 +7320,7 @@
           <w:rPr>
             <w:rFonts w:ascii="Cambria Math" w:hAnsi="Cambria Math"/>
           </w:rPr>
+          <w:lastRenderedPageBreak/>
           <m:t>t</m:t>
         </m:r>
       </m:oMath>
@@ -7025,7 +7497,6 @@
         <w:jc w:val="both"/>
       </w:pPr>
       <w:r>
-        <w:lastRenderedPageBreak/>
         <w:t>Sensor PIR (Passive Infrared) HC-SR501 adalah sensor yang berfungsi untuk mendeteksi gerakan. Sensor ini bekerja dengan mendeteksi perubahan radiasi inframerah yang dipancarkan oleh objek yang bergerak. Sensor PIR terdiri dari dua elemen piroelektrik yang mendeteksi perubahan suhu di sekitarnya. Ketika ada objek yang bergerak, terjadi perubahan distribusi panas di depan sensor, yang kemudian diubah menjadi sinyal digital.</w:t>
       </w:r>
     </w:p>
@@ -7266,6 +7737,7 @@
         <w:rPr>
           <w:noProof/>
         </w:rPr>
+        <w:lastRenderedPageBreak/>
         <w:drawing>
           <wp:inline distT="0" distB="0" distL="0" distR="0" wp14:anchorId="4A8B591D" wp14:editId="3142A677">
             <wp:extent cx="2880000" cy="1465068"/>
@@ -7350,22 +7822,22 @@
         <w:jc w:val="both"/>
       </w:pPr>
       <w:r>
-        <w:t xml:space="preserve">Sensor MQ-6 adalah sensor gas yang berfungsi untuk mendeteksi keberadaan gas LPG, propana, dan butana di udara. Sensor ini terbuat dari bahan semikonduktor timah dioksida (SnO2) yang memiliki sensitivitas terhadap gas-gas tersebut. Prinsip </w:t>
+        <w:t>Sensor MQ-6 adalah sensor gas yang berfungsi untuk mendeteksi keberadaan gas LPG, propana, dan butana di udara. Sensor ini terbuat dari bahan semikonduktor timah dioksida (SnO2) yang memiliki sensitivitas terhadap gas-gas tersebut. Prinsip kerjanya didasarkan pada perubahan resistansi bahan semikonduktor ketika terpapar gas. Semakin tinggi konsentrasi gas, semakin rendah nilai resistansi sensor. Perubahan resistansi ini kemudian dikonversi menjadi tegangan analog yang dapat dibaca oleh mikrokontroler.</w:t>
+      </w:r>
+    </w:p>
+    <w:p>
+      <w:pPr>
+        <w:pStyle w:val="ListParagraph"/>
+        <w:spacing w:line="480" w:lineRule="auto"/>
+        <w:ind w:left="1417" w:firstLine="568"/>
+        <w:jc w:val="both"/>
+      </w:pPr>
+      <w:r>
+        <w:t xml:space="preserve">Dalam pengembangan trainer kit ini, sensor MQ-6 dipilih karena dinilai paling relevan untuk mensimulasikan deteksi kebocoran gas yang sering terjadi di lingkungan industri. Pemilihan ini didasarkan pada karakteristik sensor yang secara spesifik mampu mendeteksi gas LPG, propana, dan butana. Ketiga jenis gas tersebut merupakan komponen utama yang terdapat pada korek api gas. Dengan demikian, sensor MQ-6 dapat digunakan sebagai media pembelajaran yang aplikatif untuk mendemonstrasikan </w:t>
       </w:r>
       <w:r>
         <w:lastRenderedPageBreak/>
-        <w:t>kerjanya didasarkan pada perubahan resistansi bahan semikonduktor ketika terpapar gas. Semakin tinggi konsentrasi gas, semakin rendah nilai resistansi sensor. Perubahan resistansi ini kemudian dikonversi menjadi tegangan analog yang dapat dibaca oleh mikrokontroler.</w:t>
-      </w:r>
-    </w:p>
-    <w:p>
-      <w:pPr>
-        <w:pStyle w:val="ListParagraph"/>
-        <w:spacing w:line="480" w:lineRule="auto"/>
-        <w:ind w:left="1417" w:firstLine="568"/>
-        <w:jc w:val="both"/>
-      </w:pPr>
-      <w:r>
-        <w:t>Dalam pengembangan trainer kit ini, sensor MQ-6 dipilih karena dinilai paling relevan untuk mensimulasikan deteksi kebocoran gas yang sering terjadi di lingkungan industri. Pemilihan ini didasarkan pada karakteristik sensor yang secara spesifik mampu mendeteksi gas LPG, propana, dan butana. Ketiga jenis gas tersebut merupakan komponen utama yang terdapat pada korek api gas. Dengan demikian, sensor MQ-6 dapat digunakan sebagai media pembelajaran yang aplikatif untuk mendemonstrasikan prinsip kerja sensor gas, tanpa harus menggunakan gas berbahaya dalam kegiatan praktikum.</w:t>
+        <w:t>prinsip kerja sensor gas, tanpa harus menggunakan gas berbahaya dalam kegiatan praktikum.</w:t>
       </w:r>
     </w:p>
     <w:p>
@@ -7630,7 +8102,6 @@
         <w:rPr>
           <w:noProof/>
         </w:rPr>
-        <w:lastRenderedPageBreak/>
         <w:drawing>
           <wp:inline distT="0" distB="0" distL="0" distR="0" wp14:anchorId="7A59975A" wp14:editId="24C2E720">
             <wp:extent cx="2880000" cy="2129290"/>
@@ -7709,7 +8180,11 @@
         <w:jc w:val="both"/>
       </w:pPr>
       <w:r>
-        <w:t>Sensor rain drop adalah sensor yang berfungsi untuk mendeteksi adanya air hujan. Sensor ini terdiri dari sebuah papan sirkuit yang dilapisi dengan bahan konduktif. Prinsip kerjanya didasarkan pada perubahan konduktivitas papan ketika terkena air. Ketika tidak ada air, papan memiliki resistansi yang tinggi. Sebaliknya, ketika ada air, resistansi papan menurun karena air bersifat konduktif. Perubahan resistansi ini kemudian diubah menjadi sinyal analog atau digital.</w:t>
+        <w:t xml:space="preserve">Sensor rain drop adalah sensor yang berfungsi untuk mendeteksi adanya air hujan. Sensor ini terdiri dari sebuah papan sirkuit yang dilapisi dengan bahan konduktif. Prinsip kerjanya didasarkan pada perubahan konduktivitas papan ketika terkena air. Ketika tidak ada air, papan memiliki resistansi yang tinggi. Sebaliknya, ketika ada air, resistansi papan menurun karena air </w:t>
+      </w:r>
+      <w:r>
+        <w:lastRenderedPageBreak/>
+        <w:t>bersifat konduktif. Perubahan resistansi ini kemudian diubah menjadi sinyal analog atau digital.</w:t>
       </w:r>
     </w:p>
     <w:p>
@@ -7964,9 +8439,8 @@
         <w:rPr>
           <w:noProof/>
         </w:rPr>
-        <w:lastRenderedPageBreak/>
         <w:drawing>
-          <wp:inline distT="0" distB="0" distL="0" distR="0" wp14:anchorId="0EF113B5" wp14:editId="4A52D0CA">
+          <wp:inline distT="0" distB="0" distL="0" distR="0" wp14:anchorId="0EF113B5" wp14:editId="632A0541">
             <wp:extent cx="2880000" cy="2480188"/>
             <wp:effectExtent l="0" t="0" r="0" b="0"/>
             <wp:docPr id="1612382797" name="Picture 23" descr="Raindrops Detection Sensor Module – Analog and Digital Output – Voltaat"/>
@@ -8052,6 +8526,7 @@
         <w:jc w:val="both"/>
       </w:pPr>
       <w:r>
+        <w:lastRenderedPageBreak/>
         <w:t xml:space="preserve">Tabel </w:t>
       </w:r>
       <w:r>
@@ -8307,9 +8782,8 @@
         <w:rPr>
           <w:noProof/>
         </w:rPr>
-        <w:lastRenderedPageBreak/>
         <w:drawing>
-          <wp:inline distT="0" distB="0" distL="0" distR="0" wp14:anchorId="4E29AFBC" wp14:editId="22D7C2A4">
+          <wp:inline distT="0" distB="0" distL="0" distR="0" wp14:anchorId="4E29AFBC" wp14:editId="78EACF92">
             <wp:extent cx="1800000" cy="1645273"/>
             <wp:effectExtent l="0" t="0" r="0" b="0"/>
             <wp:docPr id="1305764666" name="Picture 24" descr="Arduino Flame Sensor Module (KY-026 / HW-491) — Wiring &amp; Code"/>
@@ -8508,6 +8982,7 @@
               <w:jc w:val="center"/>
             </w:pPr>
             <w:r>
+              <w:lastRenderedPageBreak/>
               <w:t>RST</w:t>
             </w:r>
           </w:p>
@@ -8722,7 +9197,6 @@
         <w:rPr>
           <w:noProof/>
         </w:rPr>
-        <w:lastRenderedPageBreak/>
         <w:drawing>
           <wp:inline distT="0" distB="0" distL="0" distR="0" wp14:anchorId="746E0AC3" wp14:editId="7CE37707">
             <wp:extent cx="2066307" cy="1995055"/>
@@ -8819,6 +9293,7 @@
         <w:jc w:val="both"/>
       </w:pPr>
       <w:r>
+        <w:lastRenderedPageBreak/>
         <w:t xml:space="preserve">Tabel </w:t>
       </w:r>
       <w:r>
@@ -9005,7 +9480,6 @@
         <w:rPr>
           <w:noProof/>
         </w:rPr>
-        <w:lastRenderedPageBreak/>
         <w:drawing>
           <wp:inline distT="0" distB="0" distL="0" distR="0" wp14:anchorId="16C9E444" wp14:editId="764EE0C5">
             <wp:extent cx="2880000" cy="2204082"/>
@@ -9103,7 +9577,11 @@
         <w:jc w:val="both"/>
       </w:pPr>
       <w:r>
-        <w:t>Dalam pengembangan trainer kit ini, RGB LED yang digunakan adalah jenis modul dengan empat pin. Modul ini biasanya menggunakan konfigurasi common cathode, di mana satu pin berfungsi sebagai ground dan tiga pin lainnya berfungsi sebagai kontrol warna.</w:t>
+        <w:t xml:space="preserve">Dalam pengembangan trainer kit ini, RGB LED yang digunakan adalah jenis modul dengan empat pin. Modul ini biasanya menggunakan konfigurasi common cathode, di mana satu </w:t>
+      </w:r>
+      <w:r>
+        <w:lastRenderedPageBreak/>
+        <w:t>pin berfungsi sebagai ground dan tiga pin lainnya berfungsi sebagai kontrol warna.</w:t>
       </w:r>
     </w:p>
     <w:p>
@@ -9255,7 +9733,6 @@
               <w:jc w:val="center"/>
             </w:pPr>
             <w:r>
-              <w:lastRenderedPageBreak/>
               <w:t>B</w:t>
             </w:r>
           </w:p>
@@ -9439,7 +9916,11 @@
         <w:jc w:val="both"/>
       </w:pPr>
       <w:r>
-        <w:t>Buzzer adalah komponen elektronik yang berfungsi untuk mengubah sinyal listrik menjadi getaran suara. Buzzer passive adalah jenis buzzer yang membutuhkan sinyal osilasi dari luar untuk menghasilkan suara. Prinsip kerjanya didasarkan pada getaran diafragma yang disebabkan oleh medan elektromagnetik atau efek piezoelektrik. Buzzer passive sering digunakan untuk menghasilkan nada atau suara dengan frekuensi yang dapat diatur menggunakan sinyal PWM.</w:t>
+        <w:t xml:space="preserve">Buzzer adalah komponen elektronik yang berfungsi untuk mengubah sinyal listrik menjadi getaran suara. Buzzer passive adalah jenis buzzer yang membutuhkan sinyal osilasi dari luar untuk menghasilkan suara. Prinsip kerjanya didasarkan pada getaran diafragma yang disebabkan oleh medan elektromagnetik atau efek piezoelektrik. Buzzer passive sering digunakan untuk </w:t>
+      </w:r>
+      <w:r>
+        <w:lastRenderedPageBreak/>
+        <w:t>menghasilkan nada atau suara dengan frekuensi yang dapat diatur menggunakan sinyal PWM.</w:t>
       </w:r>
     </w:p>
     <w:p>
@@ -9450,11 +9931,7 @@
         <w:jc w:val="both"/>
       </w:pPr>
       <w:r>
-        <w:t xml:space="preserve">Dalam pengembangan trainer kit ini, buzzer yang digunakan adalah modul buzzer passive yang telah dilengkapi dengan </w:t>
-      </w:r>
-      <w:r>
-        <w:lastRenderedPageBreak/>
-        <w:t>transistor penguat. Modul ini memiliki tiga pin, yaitu VCC, GND, dan pin sinyal kontrol.</w:t>
+        <w:t>Dalam pengembangan trainer kit ini, buzzer yang digunakan adalah modul buzzer passive yang telah dilengkapi dengan transistor penguat. Modul ini memiliki tiga pin, yaitu VCC, GND, dan pin sinyal kontrol.</w:t>
       </w:r>
     </w:p>
     <w:p>
@@ -9794,11 +10271,11 @@
         <w:jc w:val="both"/>
       </w:pPr>
       <w:r>
-        <w:t xml:space="preserve">LCD (Liquid Crystal Display) adalah perangkat tampilan yang menggunakan teknologi kristal cair untuk menampilkan karakter, angka, atau grafik. LCD 16x2 berarti memiliki 16 kolom dan 2 baris karakter. Untuk mengurangi jumlah pin yang digunakan, LCD ini dilengkapi dengan modul I2C (Inter-Integrated Circuit) yang mengubah komunikasi paralel menjadi komunikasi </w:t>
+        <w:t xml:space="preserve">LCD (Liquid Crystal Display) adalah perangkat tampilan yang menggunakan teknologi kristal cair untuk menampilkan </w:t>
       </w:r>
       <w:r>
         <w:lastRenderedPageBreak/>
-        <w:t>serial dua kabel (SDA dan SCL). Prinsip kerjanya didasarkan pada perubahan orientasi molekul kristal cair ketika diberi tegangan listrik, sehingga memengaruhi polarisasi cahaya yang melewatinya.</w:t>
+        <w:t>karakter, angka, atau grafik. LCD 16x2 berarti memiliki 16 kolom dan 2 baris karakter. Untuk mengurangi jumlah pin yang digunakan, LCD ini dilengkapi dengan modul I2C (Inter-Integrated Circuit) yang mengubah komunikasi paralel menjadi komunikasi serial dua kabel (SDA dan SCL). Prinsip kerjanya didasarkan pada perubahan orientasi molekul kristal cair ketika diberi tegangan listrik, sehingga memengaruhi polarisasi cahaya yang melewatinya.</w:t>
       </w:r>
     </w:p>
     <w:p>
@@ -10130,11 +10607,17 @@
         <w:jc w:val="both"/>
       </w:pPr>
       <w:r>
-        <w:t xml:space="preserve">Servo MG90S adalah motor servo yang dirancang untuk aplikasi yang membutuhkan torsi tinggi dalam ukuran yang kecil. Motor servo bekerja dengan sistem kendali loop tertutup, di mana posisi poros motor terus dipantau dan dikoreksi agar sesuai dengan sinyal kendali yang diberikan. Prinsip kerjanya didasarkan pada </w:t>
-      </w:r>
-      <w:r>
         <w:lastRenderedPageBreak/>
-        <w:t>sinyal PWM (Pulse Width Modulation) yang dikirimkan melalui pin kontrol. Lebar pulsa sinyal PWM menentukan posisi sudut poros servo. Servo MG90S memiliki rentang putaran 0° hingga 180°.</w:t>
+        <w:t>Servo MG90S adalah motor servo yang dirancang untuk aplikasi yang membutuhkan torsi tinggi dalam ukuran yang kecil. Motor servo bekerja dengan sistem kendali loop tertutup, di mana posisi poros motor terus dipantau dan dikoreksi agar sesuai dengan sinyal kendali yang diberikan. Prinsip kerjanya didasarkan pada sinyal PWM (</w:t>
+      </w:r>
+      <w:r>
+        <w:rPr>
+          <w:i/>
+        </w:rPr>
+        <w:t>Pulse Width Modulation</w:t>
+      </w:r>
+      <w:r>
+        <w:t>) yang dikirimkan melalui pin kontrol. Lebar pulsa sinyal PWM menentukan posisi sudut poros servo. Servo MG90S memiliki rentang putaran 0° hingga 180°.</w:t>
       </w:r>
     </w:p>
     <w:p>
@@ -10297,7 +10780,16 @@
           </w:tcPr>
           <w:p>
             <w:r>
-              <w:t>Sinyal kontrol (Pulse Width Modulation)</w:t>
+              <w:t>Sinyal kontrol (</w:t>
+            </w:r>
+            <w:r>
+              <w:rPr>
+                <w:i/>
+              </w:rPr>
+              <w:t>Pulse Width Modulation</w:t>
+            </w:r>
+            <w:r>
+              <w:t>)</w:t>
             </w:r>
           </w:p>
         </w:tc>
@@ -10359,7 +10851,7 @@
           <w:noProof/>
         </w:rPr>
         <w:drawing>
-          <wp:inline distT="0" distB="0" distL="0" distR="0" wp14:anchorId="040CA5A2" wp14:editId="30B82106">
+          <wp:inline distT="0" distB="0" distL="0" distR="0" wp14:anchorId="040CA5A2" wp14:editId="60E2D3F9">
             <wp:extent cx="2880000" cy="2914510"/>
             <wp:effectExtent l="0" t="0" r="0" b="0"/>
             <wp:docPr id="1386449923" name="Picture 29" descr="MG90S Metal Gear Micro Servo"/>
@@ -10434,6 +10926,7 @@
         <w:jc w:val="both"/>
       </w:pPr>
       <w:r>
+        <w:lastRenderedPageBreak/>
         <w:t>Arduino IDE</w:t>
       </w:r>
     </w:p>
@@ -10445,11 +10938,16 @@
         <w:jc w:val="both"/>
       </w:pPr>
       <w:r>
-        <w:t xml:space="preserve">Arduino IDE merupakan lingkungan pengembangan terpadu yang digunakan untuk menulis, mengompilasi, dan mengunggah program ke papan Arduino. Perangkat lunak ini menyediakan antarmuka sederhana yang terdiri atas area editor, tombol verifikasi, </w:t>
-      </w:r>
-      <w:r>
-        <w:lastRenderedPageBreak/>
-        <w:t>tombol upload, serta monitor serial. Arduino IDE juga dilengkapi dengan kumpulan library yang dapat digunakan untuk mempermudah pengendalian berbagai komponen, seperti servo, LCD, dan sensor tertentu.</w:t>
+        <w:t xml:space="preserve">Arduino IDE merupakan lingkungan pengembangan terpadu yang digunakan untuk menulis, mengompilasi, dan mengunggah program ke papan Arduino. Perangkat lunak ini menyediakan antarmuka sederhana yang terdiri atas area editor, tombol verifikasi, tombol upload, serta monitor serial. Arduino IDE juga dilengkapi dengan kumpulan </w:t>
+      </w:r>
+      <w:r>
+        <w:rPr>
+          <w:i/>
+        </w:rPr>
+        <w:t>library</w:t>
+      </w:r>
+      <w:r>
+        <w:t xml:space="preserve"> yang dapat digunakan untuk mempermudah pengendalian berbagai komponen, seperti servo, LCD, dan sensor tertentu.</w:t>
       </w:r>
     </w:p>
     <w:p>
@@ -10464,7 +10962,16 @@
         <w:t xml:space="preserve">Gambar. </w:t>
       </w:r>
       <w:r>
-        <w:t>Icon Software Arduino IDE</w:t>
+        <w:t xml:space="preserve">Icon </w:t>
+      </w:r>
+      <w:r>
+        <w:rPr>
+          <w:i/>
+        </w:rPr>
+        <w:t>Software</w:t>
+      </w:r>
+      <w:r>
+        <w:t xml:space="preserve"> Arduino IDE</w:t>
       </w:r>
     </w:p>
     <w:p>
@@ -10576,7 +11083,11 @@
         <w:jc w:val="both"/>
       </w:pPr>
       <w:r>
-        <w:t>Struktur program Arduino Uno terdiri atas dua fungsi utama, yaitu setup() dan loop(). Fungsi setup() dijalankan satu kali saat program pertama kali dijalankan, sedangkan fungsi loop() dijalankan secara berulang selama Arduino Uno aktif. Adapun contoh struktur program Arduino Uno adalah sebagai berikut:</w:t>
+        <w:t xml:space="preserve">Struktur program Arduino Uno terdiri atas dua fungsi utama, yaitu setup() dan loop(). Fungsi setup() dijalankan satu kali saat program pertama kali dijalankan, sedangkan fungsi loop() </w:t>
+      </w:r>
+      <w:r>
+        <w:lastRenderedPageBreak/>
+        <w:t>dijalankan secara berulang selama Arduino Uno aktif. Adapun contoh struktur program Arduino Uno adalah sebagai berikut:</w:t>
       </w:r>
     </w:p>
     <w:p>
@@ -10788,7 +11299,6 @@
                 <w:szCs w:val="20"/>
                 <w14:ligatures w14:val="none"/>
               </w:rPr>
-              <w:lastRenderedPageBreak/>
               <w:t>}</w:t>
             </w:r>
           </w:p>
@@ -11256,7 +11766,11 @@
         <w:jc w:val="both"/>
       </w:pPr>
       <w:r>
-        <w:t>void loop(): Merupakan fungsi utama yang akan dijalankan secara terus-menerus (berulang) setelah fungsi setup() selesai dieksekusi. Fungsi ini berisi logika utama dari program yang kita buat. Pada contoh di atas, program akan menyalakan LED pada pin 13, menunggu selama 1 detik menggunakan fungsi delay(1000), mematikan LED, dan menunggu kembali selama 1 detik. Proses ini akan terus berulang tanpa henti selama Arduino Uno masih menyala.</w:t>
+        <w:t xml:space="preserve">void loop(): Merupakan fungsi utama yang akan dijalankan secara terus-menerus (berulang) setelah fungsi setup() selesai dieksekusi. Fungsi ini berisi logika utama dari program yang kita buat. Pada contoh di atas, program akan menyalakan LED </w:t>
+      </w:r>
+      <w:r>
+        <w:lastRenderedPageBreak/>
+        <w:t>pada pin 13, menunggu selama 1 detik menggunakan fungsi delay(1000), mematikan LED, dan menunggu kembali selama 1 detik. Proses ini akan terus berulang tanpa henti selama Arduino Uno masih menyala.</w:t>
       </w:r>
     </w:p>
     <w:p>
@@ -11266,7 +11780,6 @@
         <w:jc w:val="both"/>
       </w:pPr>
       <w:r>
-        <w:lastRenderedPageBreak/>
         <w:t>Dengan memahami struktur dasar ini, pengguna dapat mulai menulis program untuk mengendalikan berbagai komponen elektronika, seperti sensor dan aktuator, sesuai dengan kebutuhan sistem yang akan dirancang.</w:t>
       </w:r>
     </w:p>
@@ -11863,6 +12376,7 @@
         <w:jc w:val="both"/>
       </w:pPr>
       <w:r>
+        <w:lastRenderedPageBreak/>
         <w:t>Operator digunakan untuk memanipulasi nilai dalam program. Pada pemrograman Arduino Uno, terdapat beberapa jenis operator yang umum digunakan, yaitu:</w:t>
       </w:r>
     </w:p>
@@ -11889,7 +12403,6 @@
         <w:jc w:val="both"/>
       </w:pPr>
       <w:r>
-        <w:lastRenderedPageBreak/>
         <w:t>Operator aritmatika digunakan untuk melakukan operasi matematika dasar. Operator ini melibatkan dua operand atau lebih. Adapun jenis-jenis operator aritmatika disajikan pada Tabel 4 berikut.</w:t>
       </w:r>
     </w:p>
@@ -12762,7 +13275,11 @@
               <w:jc w:val="center"/>
             </w:pPr>
             <w:r>
-              <w:t>Lebih kecil atau sama dengan</w:t>
+              <w:t xml:space="preserve">Lebih kecil atau sama </w:t>
+            </w:r>
+            <w:r>
+              <w:lastRenderedPageBreak/>
+              <w:t>dengan</w:t>
             </w:r>
           </w:p>
         </w:tc>
@@ -12776,6 +13293,7 @@
               <w:jc w:val="center"/>
             </w:pPr>
             <w:r>
+              <w:lastRenderedPageBreak/>
               <w:t>a &lt;= b</w:t>
             </w:r>
           </w:p>
@@ -12952,7 +13470,6 @@
         <w:jc w:val="both"/>
       </w:pPr>
       <w:r>
-        <w:lastRenderedPageBreak/>
         <w:t>Operator logika digunakan untuk menggabungkan dua atau lebih kondisi. Operator ini sering digunakan dalam struktur pengaturan. Adapun jenis-jenis operator logika disajikan pada Tabel 6 berikut.</w:t>
       </w:r>
     </w:p>
@@ -13629,6 +14146,7 @@
               <w:jc w:val="center"/>
             </w:pPr>
             <w:r>
+              <w:lastRenderedPageBreak/>
               <w:t>4.</w:t>
             </w:r>
           </w:p>
@@ -13837,11 +14355,7 @@
         <w:jc w:val="both"/>
       </w:pPr>
       <w:r>
-        <w:t xml:space="preserve">Operator penugasan digunakan untuk memberikan nilai ke dalam variabel. Operator ini sering digunakan dalam program </w:t>
-      </w:r>
-      <w:r>
-        <w:lastRenderedPageBreak/>
-        <w:t>untuk menyimpan hasil perhitungan. Adapun jenis-jenis operator penugasan disajikan pada Tabel 8 berikut.</w:t>
+        <w:t>Operator penugasan digunakan untuk memberikan nilai ke dalam variabel. Operator ini sering digunakan dalam program untuk menyimpan hasil perhitungan. Adapun jenis-jenis operator penugasan disajikan pada Tabel 8 berikut.</w:t>
       </w:r>
     </w:p>
     <w:p>
@@ -14402,7 +14916,11 @@
         <w:t xml:space="preserve">Struktur if </w:t>
       </w:r>
       <w:r>
-        <w:t>digunakan untuk mengeksekusi blok program jika kondisi bernilai benar (true). Jika kondisi bernilai salah (false), maka blok program tersebut dilewati. Adapun bentuk umum struktur if adalah sebagai berikut:</w:t>
+        <w:t xml:space="preserve">digunakan untuk mengeksekusi blok program jika kondisi bernilai benar (true). Jika kondisi bernilai salah </w:t>
+      </w:r>
+      <w:r>
+        <w:lastRenderedPageBreak/>
+        <w:t>(false), maka blok program tersebut dilewati. Adapun bentuk umum struktur if adalah sebagai berikut:</w:t>
       </w:r>
     </w:p>
     <w:p>
@@ -14614,7 +15132,6 @@
         <w:jc w:val="both"/>
       </w:pPr>
       <w:r>
-        <w:lastRenderedPageBreak/>
         <w:t>Struktur if-else digunakan untuk mengeksekusi salah satu dari dua blok program, tergantung pada kondisi yang diberikan. Jika kondisi bernilai benar, maka blok if yang dijalankan. Jika kondisi bernilai salah, maka blok else yang dijalankan. Adapun bentuk umum struktur if-else adalah sebagai berikut:</w:t>
       </w:r>
     </w:p>
@@ -14977,6 +15494,7 @@
                 <w:szCs w:val="21"/>
                 <w14:ligatures w14:val="none"/>
               </w:rPr>
+              <w:lastRenderedPageBreak/>
               <w:t>    // blok program jika kondisi1 benar</w:t>
             </w:r>
           </w:p>
@@ -15273,11 +15791,7 @@
         <w:jc w:val="both"/>
       </w:pPr>
       <w:r>
-        <w:t xml:space="preserve">Struktur switch-case digunakan untuk mengeksekusi salah satu dari beberapa blok program berdasarkan nilai tertentu. </w:t>
-      </w:r>
-      <w:r>
-        <w:lastRenderedPageBreak/>
-        <w:t>Struktur ini sering digunakan sebagai alternatif dari if-else if-else jika kondisi yang dicek berupa nilai diskrit. Adapun bentuk umum struktur switch-case adalah sebagai berikut:</w:t>
+        <w:t>Struktur switch-case digunakan untuk mengeksekusi salah satu dari beberapa blok program berdasarkan nilai tertentu. Struktur ini sering digunakan sebagai alternatif dari if-else if-else jika kondisi yang dicek berupa nilai diskrit. Adapun bentuk umum struktur switch-case adalah sebagai berikut:</w:t>
       </w:r>
     </w:p>
     <w:p>
@@ -15780,6 +16294,7 @@
         <w:ind w:left="1701"/>
       </w:pPr>
       <w:r>
+        <w:lastRenderedPageBreak/>
         <w:t>Tabel.</w:t>
       </w:r>
       <w:r>
@@ -16021,11 +16536,7 @@
         <w:jc w:val="both"/>
       </w:pPr>
       <w:r>
-        <w:t xml:space="preserve">Struktur while digunakan untuk melakukan perulangan selama kondisi bernilai benar. Struktur ini digunakan jika </w:t>
-      </w:r>
-      <w:r>
-        <w:lastRenderedPageBreak/>
-        <w:t>jumlah perulangan belum diketahui. Adapun bentuk umum struktur while adalah sebagai berikut:</w:t>
+        <w:t>Struktur while digunakan untuk melakukan perulangan selama kondisi bernilai benar. Struktur ini digunakan jika jumlah perulangan belum diketahui. Adapun bentuk umum struktur while adalah sebagai berikut:</w:t>
       </w:r>
     </w:p>
     <w:p>
@@ -16450,6 +16961,7 @@
         <w:jc w:val="both"/>
       </w:pPr>
       <w:r>
+        <w:lastRenderedPageBreak/>
         <w:t>Arduino Uno menyediakan beberapa fungsi bawaan untuk mengakses pin digital dan analog. Adapun fungsi-fungsi tersebut disajikan pada Tabel 9 berikut.</w:t>
       </w:r>
     </w:p>
@@ -16644,7 +17156,6 @@
               <w:jc w:val="center"/>
             </w:pPr>
             <w:r>
-              <w:lastRenderedPageBreak/>
               <w:t>3.</w:t>
             </w:r>
           </w:p>
@@ -17070,11 +17581,17 @@
         <w:jc w:val="both"/>
       </w:pPr>
       <w:r>
-        <w:t xml:space="preserve">Proses upload program dari komputer ke Arduino Uno dilakukan melalui kabel USB. Sebelum program diunggah, pengguna perlu memilih board yang digunakan (Arduino Uno) dan port yang sesuai pada menu Tools di Arduino IDE. Setelah program berhasil diunggah, Arduino Uno akan menjalankan program tersebut secara otomatis. Proses upload ini juga menjadi </w:t>
-      </w:r>
-      <w:r>
         <w:lastRenderedPageBreak/>
-        <w:t>salah satu keunggulan Arduino Uno, karena tidak memerlukan perangkat tambahan seperti programmer eksternal.</w:t>
+        <w:t xml:space="preserve">Proses upload program dari komputer ke Arduino Uno dilakukan melalui kabel USB. Sebelum program diunggah, pengguna perlu memilih </w:t>
+      </w:r>
+      <w:r>
+        <w:rPr>
+          <w:i/>
+        </w:rPr>
+        <w:t>board</w:t>
+      </w:r>
+      <w:r>
+        <w:t xml:space="preserve"> yang digunakan (Arduino Uno) dan port yang sesuai pada menu Tools di Arduino IDE. Setelah program berhasil diunggah, Arduino Uno akan menjalankan program tersebut secara otomatis. Proses upload ini juga menjadi salah satu keunggulan Arduino Uno, karena tidak memerlukan perangkat tambahan seperti programmer eksternal.</w:t>
       </w:r>
     </w:p>
     <w:p>
@@ -17130,6 +17647,7 @@
         <w:rPr>
           <w:noProof/>
         </w:rPr>
+        <w:lastRenderedPageBreak/>
         <w:drawing>
           <wp:inline distT="114300" distB="114300" distL="114300" distR="114300" wp14:anchorId="4095C2A1" wp14:editId="24CD135F">
             <wp:extent cx="4114948" cy="2310283"/>
@@ -17175,22 +17693,49 @@
         <w:jc w:val="both"/>
       </w:pPr>
       <w:r>
-        <w:t xml:space="preserve">CV Global Solusi Edukasi (GSE) merupakan lembaga pelatihan teknologi yang bergerak di bidang pengembangan sumber daya manusia, khususnya di bidang robotika, Internet of Things (IoT), dan pemrograman. GSE beralamat di Jl. Gendeng Cantel UH </w:t>
+        <w:t xml:space="preserve">CV Global Solusi Edukasi (GSE) merupakan lembaga pelatihan teknologi yang bergerak di bidang pengembangan sumber daya manusia, khususnya di bidang robotika, </w:t>
+      </w:r>
+      <w:r>
+        <w:rPr>
+          <w:i/>
+        </w:rPr>
+        <w:t>Internet of Things</w:t>
+      </w:r>
+      <w:r>
+        <w:t xml:space="preserve"> (IoT), dan pemrograman. GSE beralamat di Jl. Gendeng Cantel UH 2 No.321, RT.001/RW.001, Baciro, Kec. Gondokusuman, Kota Yogyakarta, Daerah Istimewa Yogyakarta 55165. Lembaga ini menyediakan berbagai program pelatihan yang mencakup perangkat dan teknologi mutakhir, seperti robot edukasi uKit, Robot Inovasi, serta pembelajaran </w:t>
+      </w:r>
+      <w:r>
+        <w:rPr>
+          <w:i/>
+        </w:rPr>
+        <w:t>Coding</w:t>
+      </w:r>
+      <w:r>
+        <w:t xml:space="preserve"> Scratch dan </w:t>
+      </w:r>
+      <w:r>
+        <w:rPr>
+          <w:i/>
+        </w:rPr>
+        <w:t>Coding</w:t>
+      </w:r>
+      <w:r>
+        <w:t xml:space="preserve"> Python.</w:t>
+      </w:r>
+    </w:p>
+    <w:p>
+      <w:pPr>
+        <w:pStyle w:val="ListParagraph"/>
+        <w:spacing w:line="480" w:lineRule="auto"/>
+        <w:ind w:left="1417" w:firstLine="568"/>
+        <w:jc w:val="both"/>
+      </w:pPr>
+      <w:r>
+        <w:t xml:space="preserve">Dalam operasionalnya, GSE juga mengembangkan sistem informasi berbasis web untuk mendukung layanan pelatihan. GSE menargetkan peserta didik dari jenjang menengah (SMP-SMA) sebagai sasaran utama program pelatihannya. Setiap kelas dirancang untuk membekali peserta didik dengan keterampilan teknis yang aplikatif, terutama di bidang sensor dan sistem kendali. </w:t>
       </w:r>
       <w:r>
         <w:lastRenderedPageBreak/>
-        <w:t>2 No.321, RT.001/RW.001, Baciro, Kec. Gondokusuman, Kota Yogyakarta, Daerah Istimewa Yogyakarta 55165. Lembaga ini menyediakan berbagai program pelatihan yang mencakup perangkat dan teknologi mutakhir, seperti robot edukasi uKit, robot inovasi, serta pembelajaran coding Scratch dan Python.</w:t>
-      </w:r>
-    </w:p>
-    <w:p>
-      <w:pPr>
-        <w:pStyle w:val="ListParagraph"/>
-        <w:spacing w:line="480" w:lineRule="auto"/>
-        <w:ind w:left="1417" w:firstLine="568"/>
-        <w:jc w:val="both"/>
-      </w:pPr>
-      <w:r>
-        <w:t>Dalam operasionalnya, GSE juga mengembangkan sistem informasi berbasis web untuk mendukung layanan pelatihan. GSE menargetkan peserta didik dari jenjang menengah (SMP-SMA) sebagai sasaran utama program pelatihannya. Setiap kelas dirancang untuk membekali peserta didik dengan keterampilan teknis yang aplikatif, terutama di bidang sensor dan sistem kendali. Salah satu kelas yang menjadi fokus dalam penelitian ini adalah kelas Robot Inovasi.</w:t>
+        <w:t>Salah satu kelas yang menjadi fokus dalam penelitian ini adalah kelas Robot Inovasi.</w:t>
       </w:r>
     </w:p>
     <w:p>
@@ -17216,7 +17761,7 @@
         <w:jc w:val="both"/>
       </w:pPr>
       <w:r>
-        <w:t>Kelas Robot Inovasi merupakan salah satu program unggulan di GSE yang dirancang untuk memperkenalkan peserta didik pada dasar-dasar robotika. Kelas ini menjadi fondasi awal bagi peserta didik sebelum melanjutkan ke kelas yang lebih kompleks, seperti kelas IoT. Materi yang diajarkan di kelas Robot Inovasi meliputi pengenalan sensor-sensor dasar, seperti sensor cahaya (LDR), sensor jarak (ultrasonik), sensor suhu (DHT22), sensor gerak (PIR), serta aktuator seperti LED, buzzer, LCD, dan servo.</w:t>
+        <w:t>Kelas Robot Inovasi merupakan salah satu program unggulan di GSE yang dirancang untuk memperkenalkan peserta didik pada dasar-dasar robotika. Kelas ini menjadi fondasi awal bagi peserta didik sebelum melanjutkan ke kelas yang lebih kompleks, seperti kelas IoT. Materi yang diajarkan di kelas Robot Inovasi meliputi pengenalan beberapa sensor dasar, seperti sensor cahaya (LDR), sensor jarak (ultrasonik), sensor suhu (DHT22), sensor gerak (PIR), serta aktuator seperti LED, buzzer, LCD, dan servo.</w:t>
       </w:r>
     </w:p>
     <w:p>
@@ -17227,7 +17772,6 @@
         <w:jc w:val="both"/>
       </w:pPr>
       <w:r>
-        <w:lastRenderedPageBreak/>
         <w:t>Metode pembelajaran di kelas Robot Inovasi dilakukan melalui pendekatan praktik langsung. Peserta didik tidak hanya menerima teori di kelas, tetapi juga diajak untuk merangkai dan memprogram komponen elektronika secara langsung. Durasi setiap pertemuan berkisar antara 60 hingga 90 menit. Dalam setiap sesi, peserta didik didampingi oleh mentor yang bertugas membimbing dan mengarahkan selama kegiatan praktikum berlangsung.</w:t>
       </w:r>
     </w:p>
@@ -17254,7 +17798,23 @@
         <w:jc w:val="both"/>
       </w:pPr>
       <w:r>
-        <w:t>Berdasarkan pengamatan yang dilakukan selama kegiatan Praktik Industri, pelaksanaan praktikum di kelas Robot Inovasi masih menghadapi beberapa kendala. Kendala utama terletak pada keterbatasan media pembelajaran yang praktis dan siap pakai. Media yang tersedia masih berupa komponen terpisah, sehingga peserta didik harus merakit komponen satu per satu sebelum memulai praktikum.</w:t>
+        <w:t xml:space="preserve">Berdasarkan observasi yang dilakukan </w:t>
+      </w:r>
+      <w:r>
+        <w:t xml:space="preserve">oleh peneliti </w:t>
+      </w:r>
+      <w:r>
+        <w:t xml:space="preserve">selama kegiatan Praktik Industri, pelaksanaan praktikum di kelas Robot Inovasi masih menghadapi beberapa kendala. Kendala utama terletak pada keterbatasan media pembelajaran yang </w:t>
+      </w:r>
+      <w:r>
+        <w:t>efisien</w:t>
+      </w:r>
+      <w:r>
+        <w:t xml:space="preserve"> dan </w:t>
+      </w:r>
+      <w:r>
+        <w:lastRenderedPageBreak/>
+        <w:t>siap pakai. Media yang tersedia saat ini masih berupa komponen terpisah, sehingga peserta didik harus merakit komponen satu per satu sebelum memulai praktikum.</w:t>
       </w:r>
     </w:p>
     <w:p>
@@ -17265,7 +17825,7 @@
         <w:jc w:val="both"/>
       </w:pPr>
       <w:r>
-        <w:t>Proses perakitan komponen ini memakan waktu sekitar 15-20 menit dari total durasi kelas 60-90 menit. Akibatnya, waktu efektif untuk eksplorasi dan analisis menjadi berkurang. Selain itu, penyusunan komponen yang tidak rapi berpotensi menyebabkan kesalahan dalam merangkai rangkaian. Kesalahan dalam merangkai tidak hanya merugikan peserta didik secara individu, tetapi juga dapat merusak komponen yang digunakan.</w:t>
+        <w:t>Proses perakitan komponen tersebut memakan waktu sekitar 15-20 menit dari total durasi kelas yang berkisar 60-90 menit. Kondisi ini menyebabkan waktu efektif untuk eksplorasi dan analisis materi menjadi berkurang. Selain itu, penyusunan komponen yang tidak rapi juga berpotensi menyebabkan kesalahan dalam merangkai rangkaian, yang tidak hanya merugikan peserta didik secara individu tetapi juga berisiko merusak komponen yang digunakan.</w:t>
       </w:r>
     </w:p>
     <w:p>
@@ -17276,8 +17836,7 @@
         <w:jc w:val="both"/>
       </w:pPr>
       <w:r>
-        <w:lastRenderedPageBreak/>
-        <w:t>Kendala lain yang teridentifikasi adalah belum tersedianya modul dan labsheet yang terstruktur sebagai panduan praktikum. Hal ini menyebabkan kegiatan praktikum cenderung kurang terarah, dan peserta didik kesulitan untuk memahami urutan langkah kerja yang benar. Kondisi ini diperparah dengan minimnya variasi media pembelajaran yang digunakan di kelas Robot Inovasi.</w:t>
+        <w:t>Kendala lain yang teridentifikasi adalah belum tersedianya modul dan labsheet yang terstruktur sebagai panduan praktikum. Hal ini menyebabkan kegiatan praktikum cenderung kurang terarah, dan peserta didik kesulitan untuk memahami urutan langkah kerja yang benar. Kondisi tersebut diperparah dengan minimnya variasi media pembelajaran yang digunakan di kelas Robot Inovasi.</w:t>
       </w:r>
     </w:p>
     <w:p>
@@ -17303,18 +17862,38 @@
         <w:jc w:val="both"/>
       </w:pPr>
       <w:r>
-        <w:t>Berdasarkan kondisi pembelajaran yang telah diuraikan, diperlukan sebuah solusi berupa media pembelajaran yang dapat mengatasi kendala di lapangan. Solusi yang ditawarkan dalam penelitian ini adalah pengembangan trainer kit multi sensor berbasis Arduino Uno. Trainer kit ini dirancang dengan konsep plug-and-play, yaitu komponen sensor dan aktuator telah terpasang permanen pada board, sehingga peserta didik hanya perlu melakukan wiring rangkaian praktikum tanpa harus merakit komponen dari nol.</w:t>
-      </w:r>
-    </w:p>
-    <w:p>
-      <w:pPr>
-        <w:pStyle w:val="ListParagraph"/>
-        <w:spacing w:line="480" w:lineRule="auto"/>
-        <w:ind w:left="1417" w:firstLine="545"/>
-        <w:jc w:val="both"/>
-      </w:pPr>
-      <w:r>
-        <w:t>Dengan adanya trainer kit ini, diharapkan waktu persiapan praktikum dapat dipersingkat, risiko kerusakan komponen dapat diminimalisir, dan peserta didik dapat lebih fokus pada eksplorasi serta analisis. Selain itu, trainer kit ini dilengkapi dengan modul dan labsheet yang terstruktur, sehingga kegiatan praktikum menjadi lebih terarah dan sesuai dengan capaian pembelajaran yang telah ditetapkan.</w:t>
+        <w:t xml:space="preserve">Berdasarkan kondisi pembelajaran yang telah diuraikan, penelitian ini hadir untuk menawarkan solusi berupa pengembangan trainer kit multi sensor berbasis Arduino Uno. Trainer kit ini dirancang dengan konsep </w:t>
+      </w:r>
+      <w:r>
+        <w:rPr>
+          <w:i/>
+        </w:rPr>
+        <w:t>plug-and-play</w:t>
+      </w:r>
+      <w:r>
+        <w:t xml:space="preserve">, di mana </w:t>
+      </w:r>
+      <w:r>
+        <w:lastRenderedPageBreak/>
+        <w:t xml:space="preserve">komponen sensor dan aktuator telah terpasang permanen pada </w:t>
+      </w:r>
+      <w:r>
+        <w:rPr>
+          <w:i/>
+        </w:rPr>
+        <w:t>board</w:t>
+      </w:r>
+      <w:r>
+        <w:t xml:space="preserve">. Dengan demikian, peserta didik hanya perlu melakukan </w:t>
+      </w:r>
+      <w:r>
+        <w:rPr>
+          <w:i/>
+        </w:rPr>
+        <w:t>wiring</w:t>
+      </w:r>
+      <w:r>
+        <w:t xml:space="preserve"> rangkaian praktikum tanpa harus merakit komponen dari nol. Pengembangan media ini diharapkan dapat mengatasi kendala waktu persiapan, meminimalisir risiko kerusakan komponen, serta menjadikan kegiatan praktikum lebih terarah melalui modul dan labsheet yang terstruktur.</w:t>
       </w:r>
     </w:p>
     <w:p>
@@ -17322,7 +17901,6 @@
         <w:pStyle w:val="Heading2"/>
       </w:pPr>
       <w:r>
-        <w:lastRenderedPageBreak/>
         <w:t>Penelitian yang Relevan</w:t>
       </w:r>
     </w:p>
@@ -17330,6 +17908,7 @@
       <w:pPr>
         <w:spacing w:line="480" w:lineRule="auto"/>
         <w:ind w:left="567" w:firstLine="720"/>
+        <w:jc w:val="both"/>
       </w:pPr>
       <w:r>
         <w:t>Penelitian tentang pengembangan media pembelajaran trainer kit telah banyak dilakukan sebelumnya. Namun, penelitian yang secara khusus mengembangkan trainer kit multi sensor berbasis Arduino Uno untuk peserta didik jenjang menengah di lembaga pelatihan non-formal masih terbatas. Oleh karena itu, kajian terhadap penelitian terdahulu perlu dilakukan sebagai bahan perbandingan, pijakan teoretis, serta untuk menegaskan kebaruan dari produk</w:t>
@@ -17362,11 +17941,32 @@
         <w:jc w:val="both"/>
       </w:pPr>
       <w:r>
-        <w:t xml:space="preserve">Dalam literatur penelitian Wicaksono (2016) "Pengembangan Trainer Kit Sensor sebagai Media Pembelajaran Mata Pelajaran Sensor dan Aktuator di SMK Negeri 2 Pengasih" bertujuan mengembangkan media pembelajaran berupa trainer kit sensor yang dilengkapi modul panduan dan labsheet, mengetahui unjuk kerja komponen, serta menguji kelayakan produk pembelajaran pada mata pelajaran Sensor dan Aktuator. Penelitian yang diintegrasikan berbasis Research and Development (R&amp;D) mengacu pada kerangka ADDIE dari Robert Maribe Branch, dengan skema pengujian oleh pakar materi, pakar media, serta calon pengguna memanfaatkan instrumen angket skala Likert empat tingkatan. Temuan mengonfirmasi bahwa modul instruksional yang direalisasikan berkategori sangat layak, dengan </w:t>
+        <w:t xml:space="preserve">Dalam literatur penelitian Wicaksono (2016) "Pengembangan Trainer Kit Sensor sebagai Media Pembelajaran Mata Pelajaran Sensor dan Aktuator di SMK Negeri 2 Pengasih" bertujuan mengembangkan media pembelajaran berupa trainer kit sensor yang dilengkapi modul panduan dan labsheet, mengetahui unjuk kerja komponen, serta menguji </w:t>
       </w:r>
       <w:r>
         <w:lastRenderedPageBreak/>
-        <w:t>persentase validasi sebesar 87,50% dari penguji materi, 83,66% dari penguji media, serta 83,66% merujuk pada penilaian 32 siswa. Angka tersebut membuktikan bahwa alat peraga ini berdaya guna, mudah dioperasikan, dan efektif dalam meningkatkan antusiasme serta dorongan belajar siswa. Metode ini digunakan untuk menciptakan produk yang tidak hanya dibuat dan dikembangkan, tetapi diuji kelayakan, kepraktisan, dan fungsionalitasnya sebelum diimplementasikan pada proses pembelajaran. Sehingga, penelitian terdahulu memberikan landasan metodologis bagi pengembangan media pembelajaran pada bidang pendidikan kejuruan. Perbedaannya terletak pada media yang dikembangkan, yaitu penelitian ini berfokus pada pengembangan trainer kit multi sensor berbasis Arduino Uno sebagai media pembelajaran sensor dan aktuator yang disesuaikan dengan kebutuhan peserta didik jenjang menengah di CV Global Solusi Edukasi.</w:t>
+        <w:t xml:space="preserve">kelayakan produk pembelajaran pada mata pelajaran Sensor dan Aktuator. Penelitian yang diintegrasikan berbasis </w:t>
+      </w:r>
+      <w:r>
+        <w:rPr>
+          <w:i/>
+        </w:rPr>
+        <w:t xml:space="preserve">Research and </w:t>
+      </w:r>
+      <w:r>
+        <w:rPr>
+          <w:i/>
+        </w:rPr>
+        <w:t>Development</w:t>
+      </w:r>
+      <w:r>
+        <w:t xml:space="preserve"> (R&amp;D) mengacu pada kerangka ADDIE dari Robert Maribe Branch, dengan skema pengujian oleh pakar materi, pakar media, serta calon pengguna memanfaatkan instrumen angket skala Likert empat tingkatan. Temuan mengonfirmasi bahwa modul instruksional yang direalisasikan berkategori sangat layak, dengan persentase validasi sebesar 87,50% dari penguji materi, 83,66% dari penguji media, serta 83,66% merujuk pada penilaian 32 siswa. Angka tersebut membuktikan bahwa alat peraga ini berdaya guna, mudah dioperasikan, dan efektif dalam meningkatkan antusiasme serta dorongan belajar siswa. Metode ini digunakan untuk menciptakan produk yang tidak hanya dibuat dan dikembangkan, tetapi diuji kelayakan</w:t>
+      </w:r>
+      <w:r>
+        <w:t xml:space="preserve"> </w:t>
+      </w:r>
+      <w:r>
+        <w:t>dan fungsionalitasnya sebelum diimplementasikan pada proses pembelajaran. Sehingga, penelitian terdahulu memberikan landasan metodologis bagi pengembangan media pembelajaran pada bidang pendidikan kejuruan. Perbedaannya terletak pada media yang dikembangkan, yaitu penelitian ini berfokus pada pengembangan trainer kit multi sensor berbasis Arduino Uno sebagai media pembelajaran sensor dan aktuator yang disesuaikan dengan kebutuhan peserta didik jenjang menengah di CV Global Solusi Edukasi.</w:t>
       </w:r>
     </w:p>
     <w:p>
@@ -17400,6 +18000,7 @@
         <w:jc w:val="both"/>
       </w:pPr>
       <w:r>
+        <w:lastRenderedPageBreak/>
         <w:t>Kerangka berpikir merupakan alur logis yang menggambarkan bagaimana sebuah penelitian dilakukan untuk menjawab permasalahan yang telah diidentifikasi. Dalam penelitian ini, kerangka berpikir disusun berdasarkan kesenjangan antara kondisi ideal yang diharapkan dengan kondisi nyata yang terjadi di lapangan.</w:t>
       </w:r>
     </w:p>
@@ -17413,8 +18014,13 @@
         <w:jc w:val="both"/>
       </w:pPr>
       <w:r>
-        <w:lastRenderedPageBreak/>
-        <w:t>Kondisi ideal yang diharapkan dalam pembelajaran sensor dan aktuator di CV Global Solusi Edukasi adalah tersedianya media pembelajaran yang praktis, efisien, dan siap pakai. Media tersebut seharusnya mampu membantu peserta didik memahami konsep sensor dan aktuator secara lebih terstruktur, sehingga waktu praktikum dapat dimanfaatkan secara maksimal untuk eksplorasi dan analisis. Namun, kondisi nyata di lapangan menunjukkan bahwa media pembelajaran yang tersedia masih berupa komponen terpisah. Peserta didik diharuskan merakit komponen satu per satu sebelum melakukan praktikum. Proses perakitan ini memakan waktu yang cukup lama, yaitu sekitar 15-20 menit dari total durasi kelas 60-90 menit. Selain itu, risiko kesalahan perakitan dan kerusakan komponen juga cukup tinggi. Akibatnya, waktu efektif untuk praktikum menjadi berkurang, dan motivasi belajar peserta didik cenderung menurun.</w:t>
+        <w:t xml:space="preserve">Kondisi ideal yang diharapkan dalam pembelajaran sensor dan aktuator di CV Global Solusi Edukasi adalah tersedianya media pembelajaran yang </w:t>
+      </w:r>
+      <w:r>
+        <w:t>layak</w:t>
+      </w:r>
+      <w:r>
+        <w:t>, efisien, dan siap pakai. Media tersebut seharusnya mampu membantu peserta didik memahami konsep sensor dan aktuator secara lebih terstruktur, sehingga waktu praktikum dapat dimanfaatkan secara maksimal untuk eksplorasi dan analisis. Namun, kondisi nyata di lapangan menunjukkan bahwa media pembelajaran yang tersedia masih berupa komponen terpisah. Peserta didik diharuskan merakit komponen satu per satu sebelum melakukan praktikum. Proses perakitan ini memakan waktu yang cukup lama, yaitu sekitar 15-20 menit dari total durasi kelas 60-90 menit. Selain itu, risiko kesalahan perakitan dan kerusakan komponen juga cukup tinggi. Akibatnya, waktu efektif untuk praktikum menjadi berkurang, dan motivasi belajar peserta didik cenderung menurun.</w:t>
       </w:r>
     </w:p>
     <w:p>
@@ -17427,7 +18033,38 @@
         <w:jc w:val="both"/>
       </w:pPr>
       <w:r>
-        <w:t>Berdasarkan kesenjangan tersebut, diperlukan sebuah solusi berupa media pembelajaran yang dapat mengatasi permasalahan di lapangan. Solusi yang ditawarkan dalam penelitian ini adalah pengembangan trainer kit multi sensor berbasis Arduino Uno. Trainer kit ini dirancang dengan konsep plug-and-play, yaitu komponen sensor dan aktuator telah terpasang permanen pada board, sehingga peserta didik hanya perlu melakukan wiring rangkaian praktikum tanpa harus merakit komponen dari nol. Dengan demikian, waktu persiapan praktikum dapat dipersingkat, dan risiko kerusakan komponen dapat diminimalisir.</w:t>
+        <w:t xml:space="preserve">Berdasarkan kesenjangan tersebut, diperlukan sebuah solusi berupa media pembelajaran yang dapat mengatasi permasalahan di lapangan. Solusi yang ditawarkan dalam penelitian ini adalah pengembangan trainer kit multi sensor berbasis Arduino Uno. Trainer kit ini dirancang dengan </w:t>
+      </w:r>
+      <w:r>
+        <w:lastRenderedPageBreak/>
+        <w:t xml:space="preserve">konsep </w:t>
+      </w:r>
+      <w:r>
+        <w:rPr>
+          <w:i/>
+        </w:rPr>
+        <w:t>plug-and-play</w:t>
+      </w:r>
+      <w:r>
+        <w:t xml:space="preserve">, yaitu komponen sensor dan aktuator telah terpasang permanen pada </w:t>
+      </w:r>
+      <w:r>
+        <w:rPr>
+          <w:i/>
+        </w:rPr>
+        <w:t>board</w:t>
+      </w:r>
+      <w:r>
+        <w:t xml:space="preserve">, sehingga peserta didik hanya perlu melakukan </w:t>
+      </w:r>
+      <w:r>
+        <w:rPr>
+          <w:i/>
+        </w:rPr>
+        <w:t>wiring</w:t>
+      </w:r>
+      <w:r>
+        <w:t xml:space="preserve"> rangkaian praktikum tanpa harus merakit komponen dari nol. Dengan demikian, waktu persiapan praktikum dapat dipersingkat, dan risiko kerusakan komponen dapat diminimalisir.</w:t>
       </w:r>
     </w:p>
     <w:p>
@@ -17440,8 +18077,52 @@
         <w:jc w:val="both"/>
       </w:pPr>
       <w:r>
-        <w:lastRenderedPageBreak/>
-        <w:t>Proses pengembangan trainer kit ini mengacu pada model pengembangan ADDIE, yang terdiri atas lima tahapan, yaitu Analysis (Analisis), Design (Desain), Development (Pengembangan), Implementation (Implementasi), dan Evaluation (Evaluasi). Tahap analisis dilakukan untuk mengidentifikasi kebutuhan dan permasalahan di lapangan. Tahap desain dilakukan untuk merancang konsep produk, mulai dari tata letak komponen hingga penyusunan modul dan labsheet. Tahap pengembangan dilakukan untuk merealisasikan desain menjadi produk nyata, yang kemudian divalidasi oleh ahli media dan ahli materi. Tahap implementasi dilakukan dengan mengujicobakan produk kepada peserta didik di kelas Robot Inovasi CV Global Solusi Edukasi. Tahap evaluasi dilakukan untuk menganalisis data hasil validasi dan uji coba, guna menentukan tingkat kelayakan dan kepraktisan produk.</w:t>
+        <w:t xml:space="preserve">Proses pengembangan trainer kit ini mengacu pada model pengembangan ADDIE, yang terdiri atas lima tahapan, yaitu </w:t>
+      </w:r>
+      <w:r>
+        <w:rPr>
+          <w:i/>
+        </w:rPr>
+        <w:t>Analysis</w:t>
+      </w:r>
+      <w:r>
+        <w:t xml:space="preserve"> (Analisis), </w:t>
+      </w:r>
+      <w:r>
+        <w:rPr>
+          <w:i/>
+        </w:rPr>
+        <w:t>Design</w:t>
+      </w:r>
+      <w:r>
+        <w:t xml:space="preserve"> (Desain), </w:t>
+      </w:r>
+      <w:r>
+        <w:rPr>
+          <w:i/>
+        </w:rPr>
+        <w:t>Development</w:t>
+      </w:r>
+      <w:r>
+        <w:t xml:space="preserve"> (Pengembangan), </w:t>
+      </w:r>
+      <w:r>
+        <w:rPr>
+          <w:i/>
+        </w:rPr>
+        <w:t>Implementation</w:t>
+      </w:r>
+      <w:r>
+        <w:t xml:space="preserve"> (Implementasi), dan </w:t>
+      </w:r>
+      <w:r>
+        <w:rPr>
+          <w:i/>
+        </w:rPr>
+        <w:t>Evaluation</w:t>
+      </w:r>
+      <w:r>
+        <w:t xml:space="preserve"> (Evaluasi). Tahap analisis dilakukan untuk mengidentifikasi kebutuhan dan permasalahan di lapangan. Tahap desain dilakukan untuk merancang konsep produk, mulai dari tata letak komponen hingga penyusunan modul dan labsheet. Tahap pengembangan dilakukan untuk merealisasikan desain menjadi produk nyata, yang kemudian divalidasi oleh ahli media dan ahli materi. Tahap implementasi dilakukan dengan mengujicobakan produk kepada peserta didik di kelas Robot Inovasi CV Global Solusi Edukasi. Tahap evaluasi dilakukan untuk menganalisis data hasil validasi dan uji coba, guna menentukan tingkat kelayakan produk.</w:t>
       </w:r>
     </w:p>
     <w:p>
@@ -17454,7 +18135,17 @@
         <w:jc w:val="both"/>
       </w:pPr>
       <w:r>
-        <w:t xml:space="preserve">Hasil akhir dari penelitian ini adalah sebuah trainer kit multi sensor berbasis Arduino Uno yang layak dan praktis digunakan sebagai media pembelajaran sensor dan aktuator di kelas Robot Inovasi CV Global Solusi Edukasi. Produk ini diharapkan dapat menjadi solusi atas keterbatasan media pembelajaran yang praktis dan siap pakai, serta mampu meningkatkan kualitas pembelajaran sensor dan aktuator di lembaga tersebut. Alur kerangka berpikir dalam penelitian ini digambarkan pada Gambar </w:t>
+        <w:t xml:space="preserve">Hasil akhir dari penelitian ini adalah sebuah trainer kit multi sensor berbasis Arduino Uno yang layak digunakan sebagai media pembelajaran sensor dan aktuator di kelas Robot Inovasi CV Global Solusi Edukasi. Produk ini diharapkan dapat menjadi solusi atas keterbatasan media pembelajaran yang </w:t>
+      </w:r>
+      <w:r>
+        <w:t>efisien</w:t>
+      </w:r>
+      <w:r>
+        <w:t xml:space="preserve"> dan siap pakai, serta mampu meningkatkan </w:t>
+      </w:r>
+      <w:r>
+        <w:lastRenderedPageBreak/>
+        <w:t xml:space="preserve">kualitas pembelajaran sensor dan aktuator di lembaga tersebut. Alur kerangka berpikir dalam penelitian ini digambarkan pada Gambar </w:t>
       </w:r>
       <w:r>
         <w:t>0</w:t>
@@ -17466,22 +18157,9 @@
     <w:p>
       <w:pPr>
         <w:spacing w:after="160" w:line="259" w:lineRule="auto"/>
-      </w:pPr>
-      <w:r>
-        <w:br w:type="page"/>
-      </w:r>
-    </w:p>
-    <w:p>
-      <w:pPr>
-        <w:tabs>
-          <w:tab w:val="left" w:pos="624"/>
-        </w:tabs>
-        <w:spacing w:line="480" w:lineRule="auto"/>
-        <w:jc w:val="both"/>
-      </w:pPr>
-      <w:r>
-        <w:lastRenderedPageBreak/>
-        <w:tab/>
+        <w:ind w:firstLine="624"/>
+      </w:pPr>
+      <w:r>
         <w:t>Gambar. 0 Kerangka Berpikir</w:t>
       </w:r>
     </w:p>
@@ -17552,6 +18230,7 @@
         <w:jc w:val="both"/>
       </w:pPr>
       <w:r>
+        <w:lastRenderedPageBreak/>
         <w:t>Pertanyaan Penelitian</w:t>
       </w:r>
     </w:p>
@@ -17562,7 +18241,6 @@
         <w:jc w:val="both"/>
       </w:pPr>
       <w:r>
-        <w:lastRenderedPageBreak/>
         <w:t>Berdasarkan rumusan masalah yang telah diuraikan, pertanyaan penelitian dalam penelitian ini adalah sebagai berikut:</w:t>
       </w:r>
     </w:p>
@@ -17680,7 +18358,7 @@
           <w:ilvl w:val="0"/>
           <w:numId w:val="31"/>
         </w:numPr>
-        <w:ind w:left="567"/>
+        <w:ind w:left="587"/>
       </w:pPr>
       <w:r>
         <w:t>Jenis atau Desain Penelitian</w:t>
@@ -17688,6 +18366,63 @@
     </w:p>
     <w:p>
       <w:pPr>
+        <w:tabs>
+          <w:tab w:val="left" w:pos="720"/>
+        </w:tabs>
+        <w:spacing w:line="480" w:lineRule="auto"/>
+        <w:ind w:left="624" w:firstLine="567"/>
+        <w:jc w:val="both"/>
+      </w:pPr>
+      <w:r>
+        <w:t>Penelitian ini menggunakan metode Research and Development (R&amp;D). Metode ini dipilih karena penelitian diarahkan untuk menghasilkan suatu produk tertentu, yaitu media pembelajaran berupa trainer kit multi sensor berbasis Arduino Uno, yang kemudian diuji kelayakannya sebelum digunakan dalam proses pembelajaran. Hal ini sejalan dengan pendapat Sugiyono (2023) yang menyatakan bahwa metode penelitian dan pengembangan merupakan metode yang digunakan untuk menghasilkan produk tertentu dan menguji keefektifan produk tersebut. Dalam konteks penelitian ini, produk yang dikembangkan tidak hanya sebatas dibuat, tetapi juga melalui tahap validasi untuk memastikan bahwa produk tersebut layak digunakan sebagai media pembelajaran di kelas Robot Inovasi CV Global Solusi Edukasi.</w:t>
+      </w:r>
+    </w:p>
+    <w:p>
+      <w:pPr>
+        <w:tabs>
+          <w:tab w:val="left" w:pos="720"/>
+        </w:tabs>
+        <w:spacing w:line="480" w:lineRule="auto"/>
+        <w:ind w:left="624" w:firstLine="567"/>
+        <w:jc w:val="both"/>
+      </w:pPr>
+      <w:r>
+        <w:t xml:space="preserve">Model pengembangan yang digunakan dalam penelitian ini adalah model ADDIE. Model ini dipilih karena memiliki tahapan kerja yang sistematis dan terstruktur, serta dilengkapi dengan panduan praktis (checklist) pada setiap tahapannya. Menurut Branch (2009), ADDIE merupakan akronim dari Analysis, Design, Development, Implementation, dan Evaluation. Model ini bersifat iteratif, artinya setiap tahap saling berkaitan dan evaluasi dapat dilakukan di setiap tahap untuk memastikan produk yang dihasilkan benar-benar sesuai dengan kebutuhan pengguna. </w:t>
+      </w:r>
+      <w:r>
+        <w:lastRenderedPageBreak/>
+        <w:t>Pemilihan model ADDIE juga didasari oleh beberapa pertimbangan. Pertama, model ini menekankan pada analisis kebutuhan yang mendalam sebelum produk dirancang, sehingga produk yang dihasilkan tidak salah sasaran. Kedua, model ADDIE sangat relevan untuk pengembangan media pembelajaran berbasis teknologi, karena setiap tahapannya memungkinkan peneliti untuk melakukan uji coba dan revisi secara berulang hingga produk dinyatakan layak. Ketiga, model ini telah banyak digunakan oleh peneliti sebelumnya dalam mengembangkan media pembelajaran sejenis, sehingga keandalannya dalam menghasilkan produk yang berkualitas telah terbukti.</w:t>
+      </w:r>
+    </w:p>
+    <w:p>
+      <w:pPr>
+        <w:tabs>
+          <w:tab w:val="left" w:pos="720"/>
+        </w:tabs>
+        <w:spacing w:line="480" w:lineRule="auto"/>
+        <w:ind w:left="624" w:firstLine="567"/>
+        <w:jc w:val="both"/>
+      </w:pPr>
+      <w:r>
+        <w:t>Tahapan model ADDIE yang akan dilaksanakan dalam penelitian ini meliputi lima fase utama. Fase pertama adalah Analysis (Analisis), yang bertujuan untuk mengidentifikasi masalah dan kebutuhan pembelajaran di kelas Robot Inovasi CV Global Solusi Edukasi. Fase kedua adalah Design (Desain), yaitu merancang konsep produk, mulai dari spesifikasi hardware, modul, labsheet, hingga instrumen penilaian. Fase ketiga adalah Development (Pengembangan), yang merupakan proses realisasi desain menjadi produk nyata, yang kemudian diuji fungsionalitasnya dan divalidasi oleh ahli media dan ahli materi. Fase keempat adalah Implementation (Implementasi), yaitu uji coba produk kepada peserta didik di kelas Robot Inovasi untuk memperoleh data respons. Fase kelima adalah Evaluation (Evaluasi), yang dilakukan untuk menganalisis data hasil validasi dan uji coba, serta melakukan revisi akhir sebelum produk dinyatakan layak digunakan.</w:t>
+      </w:r>
+    </w:p>
+    <w:p>
+      <w:pPr>
+        <w:tabs>
+          <w:tab w:val="left" w:pos="720"/>
+        </w:tabs>
+        <w:spacing w:line="480" w:lineRule="auto"/>
+        <w:ind w:left="624" w:firstLine="567"/>
+        <w:jc w:val="both"/>
+      </w:pPr>
+      <w:r>
+        <w:lastRenderedPageBreak/>
+        <w:t>Dengan demikian, penelitian ini tidak hanya berfokus pada pembuatan produk semata, tetapi juga pada proses pengembangan yang sistematis dan terukur. Produk yang dihasilkan diharapkan tidak hanya layak secara teknis, tetapi juga mampu menjawab permasalahan nyata yang terjadi di lapangan, khususnya terkait keterbatasan media pembelajaran sensor dan aktuator di CV Global Solusi Edukasi.</w:t>
+      </w:r>
+    </w:p>
+    <w:p>
+      <w:pPr>
         <w:pStyle w:val="Heading2"/>
       </w:pPr>
       <w:r>
@@ -17696,6 +18431,110 @@
     </w:p>
     <w:p>
       <w:pPr>
+        <w:spacing w:line="480" w:lineRule="auto"/>
+        <w:ind w:left="624" w:firstLine="720"/>
+        <w:jc w:val="both"/>
+      </w:pPr>
+      <w:r>
+        <w:t>Penelitian ini dilaksanakan di CV Global Solusi Edukasi (GSE), yang beralamat di Jl. Gendeng Cantel UH 2 No.321, RT.001/RW.001, Baciro, Kec. Gondokusuman, Kota Yogyakarta, Daerah Istimewa Yogyakarta 55165. Lokasi ini dipilih karena GSE merupakan lembaga pelatihan teknologi yang secara aktif menyelenggarakan program kelas Robot Inovasi, di mana permasalahan terkait keterbatasan media pembelajaran sensor dan aktuator ditemukan. Selain itu, peneliti juga telah melaksanakan kegiatan Praktik Industri (PI) di lembaga tersebut, sehingga peneliti telah memahami kondisi lapangan, karakteristik peserta didik, serta alur pembelajaran yang berlangsung.</w:t>
+      </w:r>
+    </w:p>
+    <w:p>
+      <w:pPr>
+        <w:spacing w:line="480" w:lineRule="auto"/>
+        <w:ind w:left="624" w:firstLine="720"/>
+        <w:jc w:val="both"/>
+      </w:pPr>
+      <w:r>
+        <w:t xml:space="preserve">Penelitian ini dilaksanakan mulai bulan September 2026 hingga November 2026. Penentuan waktu tersebut didasarkan pada pertimbangan bahwa proses pengembangan media pembelajaran berbasis Research and Development (R&amp;D) dengan model ADDIE membutuhkan siklus yang tidak singkat, mulai dari analisis kebutuhan, perancangan produk, pengembangan, validasi oleh ahli, uji coba kepada peserta didik, hingga </w:t>
+      </w:r>
+      <w:r>
+        <w:lastRenderedPageBreak/>
+        <w:t>evaluasi dan penyusunan laporan akhir.</w:t>
+      </w:r>
+      <w:r>
+        <w:t xml:space="preserve"> </w:t>
+      </w:r>
+      <w:r>
+        <w:t>Secara lebih rinci, jadwal pelaksanaan penelitian dapat dijabarkan sebagai berikut:</w:t>
+      </w:r>
+    </w:p>
+    <w:p>
+      <w:pPr>
+        <w:pStyle w:val="ListParagraph"/>
+        <w:numPr>
+          <w:ilvl w:val="0"/>
+          <w:numId w:val="33"/>
+        </w:numPr>
+        <w:spacing w:line="480" w:lineRule="auto"/>
+        <w:ind w:left="984"/>
+        <w:jc w:val="both"/>
+      </w:pPr>
+      <w:r>
+        <w:t>Tahap Analisis (Analysis) dan Desain (Design): Dilaksanakan pada bulan September 2026. Pada tahap ini, peneliti melakukan observasi lanjutan, wawancara dengan pengelola GSE, analisis kurikulum kelas Robot Inovasi, serta merancang konsep hardware trainer kit, modul, labsheet, dan instrumen penelitian.</w:t>
+      </w:r>
+    </w:p>
+    <w:p>
+      <w:pPr>
+        <w:pStyle w:val="ListParagraph"/>
+        <w:numPr>
+          <w:ilvl w:val="0"/>
+          <w:numId w:val="33"/>
+        </w:numPr>
+        <w:spacing w:line="480" w:lineRule="auto"/>
+        <w:ind w:left="984"/>
+        <w:jc w:val="both"/>
+      </w:pPr>
+      <w:r>
+        <w:t>Tahap Pengembangan (Development): Dilaksanakan pada bulan Oktober 2026. Tahap ini meliputi pembuatan produk trainer kit multi sensor, pemrograman Arduino Uno, uji fungsionalitas komponen, serta validasi produk oleh ahli media dan ahli materi. Proses revisi produk juga dilakukan pada tahap ini berdasarkan masukan dari para validator.</w:t>
+      </w:r>
+    </w:p>
+    <w:p>
+      <w:pPr>
+        <w:pStyle w:val="ListParagraph"/>
+        <w:numPr>
+          <w:ilvl w:val="0"/>
+          <w:numId w:val="33"/>
+        </w:numPr>
+        <w:spacing w:line="480" w:lineRule="auto"/>
+        <w:ind w:left="984"/>
+        <w:jc w:val="both"/>
+      </w:pPr>
+      <w:r>
+        <w:t>Tahap Implementasi (Implementation): Dilaksanakan pada bulan November 2026. Tahap ini merupakan uji coba produk yang telah direvisi kepada peserta didik di kelas Robot Inovasi GSE. Peneliti memberikan penjelasan mengenai penggunaan trainer kit, kemudian peserta didik diminta untuk menggunakan media tersebut dalam kegiatan praktikum, dan diakhiri dengan pengisian angket respons peserta didik.</w:t>
+      </w:r>
+    </w:p>
+    <w:p>
+      <w:pPr>
+        <w:pStyle w:val="ListParagraph"/>
+        <w:numPr>
+          <w:ilvl w:val="0"/>
+          <w:numId w:val="33"/>
+        </w:numPr>
+        <w:spacing w:line="480" w:lineRule="auto"/>
+        <w:ind w:left="984"/>
+        <w:jc w:val="both"/>
+      </w:pPr>
+      <w:r>
+        <w:t xml:space="preserve">Tahap Evaluasi (Evaluation) dan Penyusunan Laporan: Dilaksanakan pada bulan November 2026 hingga penelitian dinyatakan selesai. Tahap ini meliputi analisis data hasil validasi ahli dan respons peserta didik, </w:t>
+      </w:r>
+      <w:r>
+        <w:lastRenderedPageBreak/>
+        <w:t>revisi akhir produk, penarikan kesimpulan, serta penyusunan laporan skripsi secara keseluruhan.</w:t>
+      </w:r>
+    </w:p>
+    <w:p>
+      <w:pPr>
+        <w:spacing w:line="480" w:lineRule="auto"/>
+        <w:ind w:left="624" w:firstLine="652"/>
+        <w:jc w:val="both"/>
+      </w:pPr>
+      <w:r>
+        <w:t>Dengan rentang waktu tersebut, diharapkan setiap tahapan penelitian dapat dilaksanakan secara maksimal dan menghasilkan produk media pembelajaran yang layak serta sesuai dengan kebutuhan peserta didik di CV Global Solusi Edukasi.</w:t>
+      </w:r>
+    </w:p>
+    <w:p>
+      <w:pPr>
         <w:pStyle w:val="Heading2"/>
       </w:pPr>
       <w:r>
@@ -17704,10 +18543,538 @@
     </w:p>
     <w:p>
       <w:pPr>
+        <w:pStyle w:val="ListParagraph"/>
+        <w:numPr>
+          <w:ilvl w:val="0"/>
+          <w:numId w:val="34"/>
+        </w:numPr>
+        <w:spacing w:line="480" w:lineRule="auto"/>
+        <w:jc w:val="both"/>
+      </w:pPr>
+      <w:r>
+        <w:t>Subjek Penelitian</w:t>
+      </w:r>
+    </w:p>
+    <w:p>
+      <w:pPr>
+        <w:pStyle w:val="ListParagraph"/>
+        <w:spacing w:line="480" w:lineRule="auto"/>
+        <w:ind w:left="964" w:firstLine="596"/>
+        <w:jc w:val="both"/>
+      </w:pPr>
+      <w:r>
+        <w:t>Subjek dalam penelitian ini terdiri atas dua kelompok, yaitu validator ahli dan peserta didik sebagai pengguna produk. Pertama, validator ahli yang berperan sebagai penilai kelayakan produk terdiri atas ahli media dan ahli materi. Ahli media merupakan dosen yang memiliki kompetensi di bidang pengembangan media pembelajaran, khususnya yang berkaitan dengan teknologi mikrokontroler dan media berbasis hardware. Sementara itu, ahli materi merupakan dosen atau praktisi yang memiliki kompetensi di bidang sensor dan aktuator, serta memahami kurikulum pembelajaran robotika di jenjang pendidikan menengah. Kedua, subjek uji coba adalah peserta didik jenjang menengah (SMP-SMA) yang sedang atau telah mengikuti program kelas Robot Inovasi di CV Global Solusi Edukasi. Peserta didik pada kelas ini dipilih karena mereka merupakan pengguna langsung dari media pembelajaran yang dikembangkan, sehingga respons dan penilaian yang diberikan relevan dengan kebutuhan di lapangan.</w:t>
+      </w:r>
+    </w:p>
+    <w:p>
+      <w:pPr>
+        <w:pStyle w:val="ListParagraph"/>
+        <w:numPr>
+          <w:ilvl w:val="0"/>
+          <w:numId w:val="34"/>
+        </w:numPr>
+        <w:spacing w:line="480" w:lineRule="auto"/>
+        <w:jc w:val="both"/>
+      </w:pPr>
+      <w:r>
+        <w:lastRenderedPageBreak/>
+        <w:t>Objek Penelitian</w:t>
+      </w:r>
+    </w:p>
+    <w:p>
+      <w:pPr>
+        <w:pStyle w:val="ListParagraph"/>
+        <w:spacing w:line="480" w:lineRule="auto"/>
+        <w:ind w:left="964" w:firstLine="613"/>
+        <w:jc w:val="both"/>
+      </w:pPr>
+      <w:r>
+        <w:t>Objek dalam penelitian ini adalah media pembelajaran berupa trainer kit multi sensor berbasis Arduino Uno beserta modul dan labsheet yang menyertainya. Produk ini dirancang dengan konsep plug-and-play, di mana komponen sensor dan aktuator telah terpasang permanen pada board. Dengan demikian, pengguna tidak perlu lagi merakit komponen dari nol, melainkan hanya melakukan wiring rangkaian praktikum sesuai panduan. Trainer kit ini mengintegrasikan 11 jenis sensor (LDR, Push Button, Ultrasonik HC-SR04, IR Obstacle, DHT22, PIR, MQ-6, Rain Drop, Flame Detector, dan RFID) serta 5 jenis output (LED, RGB LED, Buzzer, LCD I2C 16x2, dan Servo MG90S). Seluruh komponen tersebut dikemas dalam satu board yang dirancang untuk memudahkan kegiatan praktikum sensor dan aktuator. Kelayakan produk akan dinilai oleh ahli media dan ahli materi, sedangkan respons pengguna akan diuji coba kepada peserta didik jenjang menengah.</w:t>
+      </w:r>
+    </w:p>
+    <w:p>
+      <w:pPr>
         <w:pStyle w:val="Heading2"/>
       </w:pPr>
       <w:r>
         <w:t>Prosedur Pengembangan</w:t>
+      </w:r>
+    </w:p>
+    <w:p>
+      <w:pPr>
+        <w:spacing w:line="480" w:lineRule="auto"/>
+        <w:ind w:left="624" w:firstLine="556"/>
+        <w:jc w:val="both"/>
+      </w:pPr>
+      <w:r>
+        <w:t>Prosedur pengembangan dalam penelitian ini mengikuti model ADDIE (Analysis, Design, Development, Implementation, Evaluation) yang dikemukakan oleh Branch (2009). Model ini dipilih karena tahapannya sistematis dan iteratif, sehingga setiap tahap dapat dievaluasi dan direvisi sebelum melanjutkan ke tahap berikutnya. Adapun penjabaran dari kelima tahapan tersebut adalah sebagai berikut:</w:t>
+      </w:r>
+    </w:p>
+    <w:p>
+      <w:pPr>
+        <w:pStyle w:val="ListParagraph"/>
+        <w:numPr>
+          <w:ilvl w:val="0"/>
+          <w:numId w:val="35"/>
+        </w:numPr>
+        <w:spacing w:line="480" w:lineRule="auto"/>
+        <w:ind w:left="984"/>
+        <w:jc w:val="both"/>
+      </w:pPr>
+      <w:r>
+        <w:lastRenderedPageBreak/>
+        <w:t>Tahap Analisis (Analysis)</w:t>
+      </w:r>
+    </w:p>
+    <w:p>
+      <w:pPr>
+        <w:pStyle w:val="ListParagraph"/>
+        <w:spacing w:line="480" w:lineRule="auto"/>
+        <w:ind w:left="984" w:firstLine="576"/>
+        <w:jc w:val="both"/>
+      </w:pPr>
+      <w:r>
+        <w:t>Tahap analisis merupakan langkah awal untuk mengidentifikasi masalah dan kebutuhan yang ada di lapangan. Pada tahap ini, peneliti melakukan tiga kegiatan utama, yaitu analisis kebutuhan, analisis kurikulum, dan analisis karakteristik peserta didik.</w:t>
+      </w:r>
+    </w:p>
+    <w:p>
+      <w:pPr>
+        <w:pStyle w:val="ListParagraph"/>
+        <w:numPr>
+          <w:ilvl w:val="4"/>
+          <w:numId w:val="35"/>
+        </w:numPr>
+        <w:spacing w:line="480" w:lineRule="auto"/>
+        <w:ind w:left="1324"/>
+        <w:jc w:val="both"/>
+      </w:pPr>
+      <w:r>
+        <w:t>Analisis Kebutuhan</w:t>
+      </w:r>
+    </w:p>
+    <w:p>
+      <w:pPr>
+        <w:pStyle w:val="ListParagraph"/>
+        <w:spacing w:line="480" w:lineRule="auto"/>
+        <w:ind w:left="1304" w:firstLine="539"/>
+        <w:jc w:val="both"/>
+      </w:pPr>
+      <w:r>
+        <w:t>Analisis kebutuhan dilakukan melalui observasi langsung dan wawancara dengan pengelola serta mentor di CV Global Solusi Edukasi. Berdasarkan hasil observasi, ditemukan bahwa media pembelajaran yang tersedia di kelas Robot Inovasi masih berupa komponen terpisah. Peserta didik diharuskan merakit komponen satu per satu ke breadboard sebelum melakukan praktikum. Proses perakitan ini memakan waktu sekitar 15-20 menit dari total durasi kelas 60-90 menit. Selain itu, risiko kesalahan merangkai dan kerusakan komponen juga cukup tinggi. Dari analisis ini, peneliti menyimpulkan bahwa diperlukan media pembelajaran berupa trainer kit yang efisien, siap pakai, dan mampu mengurangi risiko kerusakan komponen. Kebutuhan ini kemudian menjadi dasar utama dalam pengembangan produk.</w:t>
+      </w:r>
+    </w:p>
+    <w:p>
+      <w:pPr>
+        <w:pStyle w:val="ListParagraph"/>
+        <w:numPr>
+          <w:ilvl w:val="4"/>
+          <w:numId w:val="35"/>
+        </w:numPr>
+        <w:spacing w:line="480" w:lineRule="auto"/>
+        <w:ind w:left="1324"/>
+        <w:jc w:val="both"/>
+      </w:pPr>
+      <w:r>
+        <w:t>Analisis Kurikulum</w:t>
+      </w:r>
+    </w:p>
+    <w:p>
+      <w:pPr>
+        <w:pStyle w:val="ListParagraph"/>
+        <w:spacing w:line="480" w:lineRule="auto"/>
+        <w:ind w:left="1304" w:firstLine="539"/>
+        <w:jc w:val="both"/>
+      </w:pPr>
+      <w:r>
+        <w:t xml:space="preserve">Analisis kurikulum dilakukan dengan meninjau silabus dan materi yang diajarkan di kelas Robot Inovasi GSE. Materi yang diajarkan meliputi pengenalan sensor dasar (LDR, Push Button, </w:t>
+      </w:r>
+      <w:r>
+        <w:lastRenderedPageBreak/>
+        <w:t>Ultrasonik, IR Obstacle, DHT22, PIR, MQ-6, Rain Drop, Flame Detector, dan RFID) serta aktuator (LED, RGB LED, Buzzer, LCD, dan Servo). Hasil analisis ini menjadi acuan dalam menentukan komponen apa saja yang harus ada di dalam trainer kit, sehingga produk yang dikembangkan benar-benar selaras dengan kebutuhan pembelajaran. Selain itu, peneliti juga memastikan bahwa produk yang dikembangkan tidak hanya sekadar alat peraga, tetapi juga mampu mendukung tercapainya kompetensi dasar yang telah ditetapkan dalam kurikulum kelas Robot Inovasi.</w:t>
+      </w:r>
+    </w:p>
+    <w:p>
+      <w:pPr>
+        <w:pStyle w:val="ListParagraph"/>
+        <w:numPr>
+          <w:ilvl w:val="4"/>
+          <w:numId w:val="35"/>
+        </w:numPr>
+        <w:spacing w:line="480" w:lineRule="auto"/>
+        <w:ind w:left="1324"/>
+        <w:jc w:val="both"/>
+      </w:pPr>
+      <w:r>
+        <w:t>Analisis Karakteristik Peserta Didik</w:t>
+      </w:r>
+    </w:p>
+    <w:p>
+      <w:pPr>
+        <w:pStyle w:val="ListParagraph"/>
+        <w:spacing w:line="480" w:lineRule="auto"/>
+        <w:ind w:left="1304" w:firstLine="539"/>
+        <w:jc w:val="both"/>
+      </w:pPr>
+      <w:r>
+        <w:t>Peserta didik yang menjadi sasaran pengguna trainer kit adalah siswa jenjang menengah (SMP-SMA) yang mengikuti kelas Robot Inovasi di GSE. Berdasarkan pengamatan, peserta didik pada jenjang ini memiliki rasa ingin tahu yang tinggi, lebih mudah memahami materi melalui praktik langsung, dan cenderung cepat bosan jika hanya mendapatkan teori. Oleh karena itu, trainer kit yang dikembangkan harus mampu menyajikan pembelajaran yang aplikatif, interaktif, dan tidak memakan waktu persiapan yang lama. Karakteristik ini menjadi pertimbangan penting dalam merancang antarmuka dan tata letak komponen agar mudah digunakan oleh peserta didik.</w:t>
+      </w:r>
+    </w:p>
+    <w:p>
+      <w:pPr>
+        <w:pStyle w:val="ListParagraph"/>
+        <w:numPr>
+          <w:ilvl w:val="0"/>
+          <w:numId w:val="35"/>
+        </w:numPr>
+        <w:spacing w:line="480" w:lineRule="auto"/>
+        <w:ind w:left="984"/>
+        <w:jc w:val="both"/>
+      </w:pPr>
+      <w:r>
+        <w:t>Tahap Perancangan (Design)</w:t>
+      </w:r>
+    </w:p>
+    <w:p>
+      <w:pPr>
+        <w:pStyle w:val="ListParagraph"/>
+        <w:spacing w:line="480" w:lineRule="auto"/>
+        <w:ind w:left="1020" w:firstLine="540"/>
+        <w:jc w:val="both"/>
+      </w:pPr>
+      <w:r>
+        <w:lastRenderedPageBreak/>
+        <w:t>Tahap perancangan merupakan kelanjutan dari tahap analisis. Pada tahap ini, peneliti merancang konsep produk berdasarkan hasil analisis yang telah dilakukan. Perancangan meliputi beberapa aspek, yaitu:</w:t>
+      </w:r>
+    </w:p>
+    <w:p>
+      <w:pPr>
+        <w:pStyle w:val="ListParagraph"/>
+        <w:numPr>
+          <w:ilvl w:val="4"/>
+          <w:numId w:val="35"/>
+        </w:numPr>
+        <w:spacing w:line="480" w:lineRule="auto"/>
+        <w:ind w:left="1324"/>
+        <w:jc w:val="both"/>
+      </w:pPr>
+      <w:r>
+        <w:t>Perancangan Hardware Trainer Kit</w:t>
+      </w:r>
+    </w:p>
+    <w:p>
+      <w:pPr>
+        <w:pStyle w:val="ListParagraph"/>
+        <w:spacing w:line="480" w:lineRule="auto"/>
+        <w:ind w:left="1361" w:firstLine="624"/>
+        <w:jc w:val="both"/>
+      </w:pPr>
+      <w:r>
+        <w:t>Perancangan hardware meliputi penentuan tata letak komponen pada board akrilik, pemilihan sensor dan aktuator, serta desain casing atau hardcase aluminium. Konsep plug-and-play diterapkan dengan cara memasang komponen sensor dan output secara permanen pada board, sehingga peserta didik hanya perlu melakukan wiring rangkaian praktikum. Desain tata letak dibuat sedemikian rupa agar komponen mudah diakses, aman, dan tidak memakan tempat. Peneliti juga merancang sistem pengkabelan yang rapi dan terorganisir, sehingga meminimalisir risiko kabel terlepas atau korsleting. Selain itu, pada tahap ini juga ditentukan spesifikasi teknis produk, seperti dimensi (29 cm x 20,5 cm x 9 cm), bahan casing (aluminium), dan sumber daya (USB 5V).</w:t>
+      </w:r>
+    </w:p>
+    <w:p>
+      <w:pPr>
+        <w:pStyle w:val="ListParagraph"/>
+        <w:numPr>
+          <w:ilvl w:val="4"/>
+          <w:numId w:val="35"/>
+        </w:numPr>
+        <w:spacing w:line="480" w:lineRule="auto"/>
+        <w:ind w:left="1324"/>
+        <w:jc w:val="both"/>
+      </w:pPr>
+      <w:r>
+        <w:t>Perancangan Modul dan Labsheet</w:t>
+      </w:r>
+    </w:p>
+    <w:p>
+      <w:pPr>
+        <w:pStyle w:val="ListParagraph"/>
+        <w:spacing w:line="480" w:lineRule="auto"/>
+        <w:ind w:left="1361" w:firstLine="624"/>
+        <w:jc w:val="both"/>
+      </w:pPr>
+      <w:r>
+        <w:t xml:space="preserve">Modul dan labsheet dirancang sebagai panduan praktikum bagi peserta didik. Modul berisi teori singkat mengenai sensor dan aktuator, sedangkan labsheet berisi langkah-langkah kerja, tabel pengamatan, dan pertanyaan diskusi. Perancangan ini bertujuan agar kegiatan praktikum menjadi lebih terstruktur dan terarah. </w:t>
+      </w:r>
+      <w:r>
+        <w:lastRenderedPageBreak/>
+        <w:t>Peneliti juga merancang sistematika penulisan modul dan labsheet agar mudah dipahami oleh peserta didik jenjang SMP-SMA, dengan menggunakan bahasa yang sederhana, gambar ilustrasi yang jelas, dan langkah kerja yang runtut.</w:t>
+      </w:r>
+    </w:p>
+    <w:p>
+      <w:pPr>
+        <w:pStyle w:val="ListParagraph"/>
+        <w:numPr>
+          <w:ilvl w:val="4"/>
+          <w:numId w:val="35"/>
+        </w:numPr>
+        <w:spacing w:line="480" w:lineRule="auto"/>
+        <w:ind w:left="1324"/>
+        <w:jc w:val="both"/>
+      </w:pPr>
+      <w:r>
+        <w:t>Perancangan Instrumen Penelitian</w:t>
+      </w:r>
+    </w:p>
+    <w:p>
+      <w:pPr>
+        <w:pStyle w:val="ListParagraph"/>
+        <w:tabs>
+          <w:tab w:val="left" w:pos="1361"/>
+        </w:tabs>
+        <w:spacing w:line="480" w:lineRule="auto"/>
+        <w:ind w:left="1361" w:firstLine="624"/>
+        <w:jc w:val="both"/>
+      </w:pPr>
+      <w:r>
+        <w:t>Instrumen penelitian dirancang untuk mengumpulkan data validasi ahli dan respons peserta didik. Instrumen yang dirancang meliputi kisi-kisi angket untuk ahli media, ahli materi, dan respons peserta didik. Masing-masing angket menggunakan skala Likert empat tingkat (Sangat Tidak Setuju, Tidak Setuju, Setuju, dan Sangat Setuju) dengan aspek penilaian yang disesuaikan dengan kebutuhan. Perancangan instrumen ini juga mempertimbangkan aspek kejelasan bahasa, kesesuaian butir dengan indikator, dan kemudahan pengisian bagi responden.</w:t>
+      </w:r>
+    </w:p>
+    <w:p>
+      <w:pPr>
+        <w:pStyle w:val="ListParagraph"/>
+        <w:numPr>
+          <w:ilvl w:val="0"/>
+          <w:numId w:val="35"/>
+        </w:numPr>
+        <w:spacing w:line="480" w:lineRule="auto"/>
+        <w:ind w:left="984"/>
+        <w:jc w:val="both"/>
+      </w:pPr>
+      <w:r>
+        <w:t>Tahap Pengembangan (Development)</w:t>
+      </w:r>
+    </w:p>
+    <w:p>
+      <w:pPr>
+        <w:pStyle w:val="ListParagraph"/>
+        <w:spacing w:line="480" w:lineRule="auto"/>
+        <w:ind w:left="1020" w:firstLine="576"/>
+        <w:jc w:val="both"/>
+      </w:pPr>
+      <w:r>
+        <w:t>Tahap pengembangan merupakan proses realisasi dari desain yang telah dirancang menjadi produk nyata. Pada tahap ini, peneliti melakukan beberapa kegiatan, yaitu:</w:t>
+      </w:r>
+    </w:p>
+    <w:p>
+      <w:pPr>
+        <w:pStyle w:val="ListParagraph"/>
+        <w:numPr>
+          <w:ilvl w:val="4"/>
+          <w:numId w:val="3"/>
+        </w:numPr>
+        <w:spacing w:line="480" w:lineRule="auto"/>
+        <w:ind w:left="1437" w:hanging="473"/>
+        <w:jc w:val="both"/>
+      </w:pPr>
+      <w:r>
+        <w:t>Pembuatan Produk</w:t>
+      </w:r>
+    </w:p>
+    <w:p>
+      <w:pPr>
+        <w:pStyle w:val="ListParagraph"/>
+        <w:spacing w:line="480" w:lineRule="auto"/>
+        <w:ind w:left="1361" w:firstLine="720"/>
+        <w:jc w:val="both"/>
+      </w:pPr>
+      <w:r>
+        <w:t xml:space="preserve">Pembuatan produk meliputi perakitan hardware trainer kit, pemasangan komponen sensor dan output pada board akrilik, serta pengkabelan sesuai dengan skema rangkaian. Selain itu, peneliti juga memprogram Arduino Uno menggunakan Arduino IDE agar </w:t>
+      </w:r>
+      <w:r>
+        <w:lastRenderedPageBreak/>
+        <w:t>setiap sensor dan output dapat berfungsi dengan baik. Modul dan labsheet juga disusun dan diformat sedemikian rupa agar mudah dipahami oleh peserta didik. Proses pembuatan produk dilakukan secara bertahap, mulai dari perakitan komponen dasar, pemasangan sensor, hingga pengujian awal untuk memastikan semua komponen terpasang dengan benar.</w:t>
+      </w:r>
+    </w:p>
+    <w:p>
+      <w:pPr>
+        <w:pStyle w:val="ListParagraph"/>
+        <w:numPr>
+          <w:ilvl w:val="4"/>
+          <w:numId w:val="3"/>
+        </w:numPr>
+        <w:spacing w:line="480" w:lineRule="auto"/>
+        <w:ind w:left="1437" w:hanging="473"/>
+        <w:jc w:val="both"/>
+      </w:pPr>
+      <w:r>
+        <w:t xml:space="preserve">Uji </w:t>
+      </w:r>
+      <w:r>
+        <w:t>Fungsionalitas</w:t>
+      </w:r>
+    </w:p>
+    <w:p>
+      <w:pPr>
+        <w:pStyle w:val="ListParagraph"/>
+        <w:spacing w:line="480" w:lineRule="auto"/>
+        <w:ind w:left="1361" w:firstLine="624"/>
+        <w:jc w:val="both"/>
+      </w:pPr>
+      <w:r>
+        <w:t>Setelah produk selesai dibuat, dilakukan uji fungsionalitas untuk memastikan bahwa seluruh komponen berfungsi dengan baik. Pengujian dilakukan dengan mencoba setiap sensor dan output satu per satu, kemudian mencatat hasilnya. Jika ada komponen yang tidak berfungsi atau terjadi kesalahan, maka dilakukan perbaikan sebelum produk divalidasi oleh ahli. Uji fungsionalitas ini juga bertujuan untuk memastikan bahwa konsep plug-and-play berjalan sesuai rencana, yaitu peserta didik dapat langsung menggunakan trainer kit tanpa harus merakit komponen dari nol.</w:t>
+      </w:r>
+    </w:p>
+    <w:p>
+      <w:pPr>
+        <w:pStyle w:val="ListParagraph"/>
+        <w:numPr>
+          <w:ilvl w:val="4"/>
+          <w:numId w:val="3"/>
+        </w:numPr>
+        <w:spacing w:line="480" w:lineRule="auto"/>
+        <w:ind w:left="1437" w:hanging="473"/>
+        <w:jc w:val="both"/>
+      </w:pPr>
+      <w:r>
+        <w:t>Validasi Ahli</w:t>
+      </w:r>
+    </w:p>
+    <w:p>
+      <w:pPr>
+        <w:pStyle w:val="ListParagraph"/>
+        <w:spacing w:line="480" w:lineRule="auto"/>
+        <w:ind w:left="1361" w:firstLine="624"/>
+        <w:jc w:val="both"/>
+      </w:pPr>
+      <w:r>
+        <w:t xml:space="preserve">Validasi ahli dilakukan untuk menilai kelayakan produk. Validasi melibatkan dua ahli, yaitu ahli media dan ahli materi. Ahli media menilai aspek tampilan, teknis, dan kemanfaatan media, sedangkan ahli materi menilai aspek isi, kebenaran konsep, dan kesesuaian dengan kurikulum. Masukan dari para ahli digunakan sebagai dasar untuk melakukan revisi produk sebelum diujicobakan </w:t>
+      </w:r>
+      <w:r>
+        <w:lastRenderedPageBreak/>
+        <w:t>kepada peserta didik. Proses validasi ini dilakukan secara iteratif, artinya jika masih ada kekurangan, produk akan direvisi dan divalidasi ulang hingga dinyatakan layak.</w:t>
+      </w:r>
+    </w:p>
+    <w:p>
+      <w:pPr>
+        <w:pStyle w:val="ListParagraph"/>
+        <w:numPr>
+          <w:ilvl w:val="0"/>
+          <w:numId w:val="35"/>
+        </w:numPr>
+        <w:spacing w:line="480" w:lineRule="auto"/>
+        <w:ind w:left="984"/>
+        <w:jc w:val="both"/>
+      </w:pPr>
+      <w:r>
+        <w:t>Tahap Implementasi (Implementation)</w:t>
+      </w:r>
+    </w:p>
+    <w:p>
+      <w:pPr>
+        <w:pStyle w:val="ListParagraph"/>
+        <w:spacing w:line="480" w:lineRule="auto"/>
+        <w:ind w:left="984" w:firstLine="576"/>
+        <w:jc w:val="both"/>
+      </w:pPr>
+      <w:r>
+        <w:t>Tahap implementasi merupakan tahap uji coba produk yang telah direvisi kepada peserta didik. Uji coba dilaksanakan di kelas Robot Inovasi CV Global Solusi Edukasi dengan melibatkan peserta didik jenjang menengah (SMP-SMA). Tahapan implementasi meliputi:</w:t>
+      </w:r>
+    </w:p>
+    <w:p>
+      <w:pPr>
+        <w:pStyle w:val="ListParagraph"/>
+        <w:numPr>
+          <w:ilvl w:val="4"/>
+          <w:numId w:val="3"/>
+        </w:numPr>
+        <w:spacing w:line="480" w:lineRule="auto"/>
+        <w:ind w:left="1324"/>
+        <w:jc w:val="both"/>
+      </w:pPr>
+      <w:r>
+        <w:t>Persiapan</w:t>
+      </w:r>
+    </w:p>
+    <w:p>
+      <w:pPr>
+        <w:pStyle w:val="ListParagraph"/>
+        <w:spacing w:line="480" w:lineRule="auto"/>
+        <w:ind w:left="1304" w:firstLine="539"/>
+        <w:jc w:val="both"/>
+      </w:pPr>
+      <w:r>
+        <w:t>Peneliti mempersiapkan trainer kit, modul, labsheet, dan angket respons peserta didik. Peneliti juga memberikan penjelasan singkat mengenai tujuan pembelajaran dan tata cara penggunaan trainer kit. Persiapan ini dilakukan untuk memastikan bahwa peserta didik memahami apa yang harus dilakukan selama kegiatan praktikum berlangsung.</w:t>
+      </w:r>
+    </w:p>
+    <w:p>
+      <w:pPr>
+        <w:pStyle w:val="ListParagraph"/>
+        <w:numPr>
+          <w:ilvl w:val="4"/>
+          <w:numId w:val="3"/>
+        </w:numPr>
+        <w:spacing w:line="480" w:lineRule="auto"/>
+        <w:ind w:left="1324"/>
+        <w:jc w:val="both"/>
+      </w:pPr>
+      <w:r>
+        <w:t>Pelaksanaan Uji Coba</w:t>
+      </w:r>
+    </w:p>
+    <w:p>
+      <w:pPr>
+        <w:pStyle w:val="ListParagraph"/>
+        <w:spacing w:line="480" w:lineRule="auto"/>
+        <w:ind w:left="1304" w:firstLine="539"/>
+        <w:jc w:val="both"/>
+      </w:pPr>
+      <w:r>
+        <w:t>Peserta didik menggunakan trainer kit untuk melakukan praktikum sesuai dengan panduan yang ada di labsheet. Selama kegiatan berlangsung, peneliti mengamati interaksi peserta didik dengan produk dan mencatat kendala yang muncul. Pengamatan ini bertujuan untuk melihat sejauh mana produk dapat digunakan secara mandiri oleh peserta didik, serta mengidentifikasi aspek-aspek yang mungkin perlu diperbaiki.</w:t>
+      </w:r>
+    </w:p>
+    <w:p>
+      <w:pPr>
+        <w:pStyle w:val="ListParagraph"/>
+        <w:numPr>
+          <w:ilvl w:val="4"/>
+          <w:numId w:val="3"/>
+        </w:numPr>
+        <w:spacing w:line="480" w:lineRule="auto"/>
+        <w:ind w:left="1324"/>
+        <w:jc w:val="both"/>
+      </w:pPr>
+      <w:r>
+        <w:lastRenderedPageBreak/>
+        <w:t>Pengambilan Data Respons</w:t>
+      </w:r>
+    </w:p>
+    <w:p>
+      <w:pPr>
+        <w:pStyle w:val="ListParagraph"/>
+        <w:spacing w:line="480" w:lineRule="auto"/>
+        <w:ind w:left="1304" w:firstLine="539"/>
+        <w:jc w:val="both"/>
+      </w:pPr>
+      <w:r>
+        <w:t>Setelah kegiatan praktikum selesai, peserta didik diminta untuk mengisi angket respons yang telah disediakan. Angket ini bertujuan untuk mengetahui pendapat peserta didik mengenai kemudahan penggunaan, kebermanfaatan, dan ketertarikan mereka terhadap trainer kit. Data respons ini menjadi salah satu indikator untuk menilai kelayakan produk dari sudut pandang pengguna.</w:t>
+      </w:r>
+    </w:p>
+    <w:p>
+      <w:pPr>
+        <w:pStyle w:val="ListParagraph"/>
+        <w:numPr>
+          <w:ilvl w:val="0"/>
+          <w:numId w:val="35"/>
+        </w:numPr>
+        <w:spacing w:line="480" w:lineRule="auto"/>
+        <w:ind w:left="984"/>
+        <w:jc w:val="both"/>
+      </w:pPr>
+      <w:r>
+        <w:t>Tahap Evaluasi (Evaluation)</w:t>
+      </w:r>
+    </w:p>
+    <w:p>
+      <w:pPr>
+        <w:pStyle w:val="ListParagraph"/>
+        <w:spacing w:line="480" w:lineRule="auto"/>
+        <w:ind w:left="984" w:firstLine="576"/>
+        <w:jc w:val="both"/>
+      </w:pPr>
+      <w:r>
+        <w:t>Tahap evaluasi merupakan tahap akhir dalam model ADDIE. Pada tahap ini, peneliti menganalisis data yang telah dikumpulkan dari validasi ahli dan uji coba peserta didik. Analisis data dilakukan untuk menentukan tingkat kelayakan produk dan menarik kesimpulan. Hasil evaluasi juga digunakan untuk melakukan revisi akhir sebelum produk dinyatakan layak digunakan. Evaluasi dilakukan secara menyeluruh, mencakup aspek media, materi, dan respons pengguna, sehingga produk yang dihasilkan benar-benar memenuhi standar kelayakan yang telah ditetapkan.</w:t>
       </w:r>
     </w:p>
     <w:p>
@@ -17771,6 +19138,7 @@
         <w:pStyle w:val="Heading2"/>
       </w:pPr>
       <w:r>
+        <w:lastRenderedPageBreak/>
         <w:t>Teknik Analisis Data</w:t>
       </w:r>
     </w:p>
@@ -17822,6 +19190,9 @@
         <w:t xml:space="preserve">Tahap </w:t>
       </w:r>
       <w:r>
+        <w:rPr>
+          <w:i/>
+        </w:rPr>
         <w:t>Analysis</w:t>
       </w:r>
     </w:p>
@@ -17835,7 +19206,16 @@
         <w:spacing w:line="480" w:lineRule="auto"/>
       </w:pPr>
       <w:r>
-        <w:t xml:space="preserve">Tahap Design </w:t>
+        <w:t xml:space="preserve">Tahap </w:t>
+      </w:r>
+      <w:r>
+        <w:rPr>
+          <w:i/>
+        </w:rPr>
+        <w:t>Design</w:t>
+      </w:r>
+      <w:r>
+        <w:t xml:space="preserve"> </w:t>
       </w:r>
     </w:p>
     <w:p>
@@ -17848,7 +19228,13 @@
         <w:spacing w:line="480" w:lineRule="auto"/>
       </w:pPr>
       <w:r>
-        <w:t>Tahap Development</w:t>
+        <w:t xml:space="preserve">Tahap </w:t>
+      </w:r>
+      <w:r>
+        <w:rPr>
+          <w:i/>
+        </w:rPr>
+        <w:t>Development</w:t>
       </w:r>
     </w:p>
     <w:p>
@@ -17861,7 +19247,13 @@
         <w:spacing w:line="480" w:lineRule="auto"/>
       </w:pPr>
       <w:r>
-        <w:t>Tahap Implementation</w:t>
+        <w:t xml:space="preserve">Tahap </w:t>
+      </w:r>
+      <w:r>
+        <w:rPr>
+          <w:i/>
+        </w:rPr>
+        <w:t>Implementation</w:t>
       </w:r>
     </w:p>
     <w:p>
@@ -17874,10 +19266,13 @@
         <w:spacing w:line="480" w:lineRule="auto"/>
       </w:pPr>
       <w:r>
-        <w:t>Tahap Evaluatio</w:t>
-      </w:r>
-      <w:r>
-        <w:t>n</w:t>
+        <w:t xml:space="preserve">Tahap </w:t>
+      </w:r>
+      <w:r>
+        <w:rPr>
+          <w:i/>
+        </w:rPr>
+        <w:t>Evaluation</w:t>
       </w:r>
     </w:p>
     <w:p>
@@ -18511,6 +19906,95 @@
     </w:lvl>
   </w:abstractNum>
   <w:abstractNum w:abstractNumId="3" w15:restartNumberingAfterBreak="0">
+    <w:nsid w:val="122E286E"/>
+    <w:multiLevelType w:val="hybridMultilevel"/>
+    <w:tmpl w:val="96583BA8"/>
+    <w:lvl w:ilvl="0" w:tplc="E45638E2">
+      <w:start w:val="1"/>
+      <w:numFmt w:val="decimal"/>
+      <w:lvlText w:val="%1."/>
+      <w:lvlJc w:val="left"/>
+      <w:pPr>
+        <w:ind w:left="947" w:hanging="360"/>
+      </w:pPr>
+      <w:rPr>
+        <w:rFonts w:hint="default"/>
+      </w:rPr>
+    </w:lvl>
+    <w:lvl w:ilvl="1" w:tplc="04210019" w:tentative="1">
+      <w:start w:val="1"/>
+      <w:numFmt w:val="lowerLetter"/>
+      <w:lvlText w:val="%2."/>
+      <w:lvlJc w:val="left"/>
+      <w:pPr>
+        <w:ind w:left="1667" w:hanging="360"/>
+      </w:pPr>
+    </w:lvl>
+    <w:lvl w:ilvl="2" w:tplc="0421001B" w:tentative="1">
+      <w:start w:val="1"/>
+      <w:numFmt w:val="lowerRoman"/>
+      <w:lvlText w:val="%3."/>
+      <w:lvlJc w:val="right"/>
+      <w:pPr>
+        <w:ind w:left="2387" w:hanging="180"/>
+      </w:pPr>
+    </w:lvl>
+    <w:lvl w:ilvl="3" w:tplc="0421000F" w:tentative="1">
+      <w:start w:val="1"/>
+      <w:numFmt w:val="decimal"/>
+      <w:lvlText w:val="%4."/>
+      <w:lvlJc w:val="left"/>
+      <w:pPr>
+        <w:ind w:left="3107" w:hanging="360"/>
+      </w:pPr>
+    </w:lvl>
+    <w:lvl w:ilvl="4" w:tplc="04210019" w:tentative="1">
+      <w:start w:val="1"/>
+      <w:numFmt w:val="lowerLetter"/>
+      <w:lvlText w:val="%5."/>
+      <w:lvlJc w:val="left"/>
+      <w:pPr>
+        <w:ind w:left="3827" w:hanging="360"/>
+      </w:pPr>
+    </w:lvl>
+    <w:lvl w:ilvl="5" w:tplc="0421001B" w:tentative="1">
+      <w:start w:val="1"/>
+      <w:numFmt w:val="lowerRoman"/>
+      <w:lvlText w:val="%6."/>
+      <w:lvlJc w:val="right"/>
+      <w:pPr>
+        <w:ind w:left="4547" w:hanging="180"/>
+      </w:pPr>
+    </w:lvl>
+    <w:lvl w:ilvl="6" w:tplc="0421000F" w:tentative="1">
+      <w:start w:val="1"/>
+      <w:numFmt w:val="decimal"/>
+      <w:lvlText w:val="%7."/>
+      <w:lvlJc w:val="left"/>
+      <w:pPr>
+        <w:ind w:left="5267" w:hanging="360"/>
+      </w:pPr>
+    </w:lvl>
+    <w:lvl w:ilvl="7" w:tplc="04210019" w:tentative="1">
+      <w:start w:val="1"/>
+      <w:numFmt w:val="lowerLetter"/>
+      <w:lvlText w:val="%8."/>
+      <w:lvlJc w:val="left"/>
+      <w:pPr>
+        <w:ind w:left="5987" w:hanging="360"/>
+      </w:pPr>
+    </w:lvl>
+    <w:lvl w:ilvl="8" w:tplc="0421001B" w:tentative="1">
+      <w:start w:val="1"/>
+      <w:numFmt w:val="lowerRoman"/>
+      <w:lvlText w:val="%9."/>
+      <w:lvlJc w:val="right"/>
+      <w:pPr>
+        <w:ind w:left="6707" w:hanging="180"/>
+      </w:pPr>
+    </w:lvl>
+  </w:abstractNum>
+  <w:abstractNum w:abstractNumId="4" w15:restartNumberingAfterBreak="0">
     <w:nsid w:val="1B0D658B"/>
     <w:multiLevelType w:val="hybridMultilevel"/>
     <w:tmpl w:val="7B640CA6"/>
@@ -18600,7 +20084,7 @@
       </w:pPr>
     </w:lvl>
   </w:abstractNum>
-  <w:abstractNum w:abstractNumId="4" w15:restartNumberingAfterBreak="0">
+  <w:abstractNum w:abstractNumId="5" w15:restartNumberingAfterBreak="0">
     <w:nsid w:val="1B710127"/>
     <w:multiLevelType w:val="hybridMultilevel"/>
     <w:tmpl w:val="99C23084"/>
@@ -18689,7 +20173,7 @@
       </w:pPr>
     </w:lvl>
   </w:abstractNum>
-  <w:abstractNum w:abstractNumId="5" w15:restartNumberingAfterBreak="0">
+  <w:abstractNum w:abstractNumId="6" w15:restartNumberingAfterBreak="0">
     <w:nsid w:val="20896B2F"/>
     <w:multiLevelType w:val="hybridMultilevel"/>
     <w:tmpl w:val="06FEC19C"/>
@@ -18778,7 +20262,7 @@
       </w:pPr>
     </w:lvl>
   </w:abstractNum>
-  <w:abstractNum w:abstractNumId="6" w15:restartNumberingAfterBreak="0">
+  <w:abstractNum w:abstractNumId="7" w15:restartNumberingAfterBreak="0">
     <w:nsid w:val="22845652"/>
     <w:multiLevelType w:val="hybridMultilevel"/>
     <w:tmpl w:val="88C46ADA"/>
@@ -18864,7 +20348,7 @@
       </w:pPr>
     </w:lvl>
   </w:abstractNum>
-  <w:abstractNum w:abstractNumId="7" w15:restartNumberingAfterBreak="0">
+  <w:abstractNum w:abstractNumId="8" w15:restartNumberingAfterBreak="0">
     <w:nsid w:val="25E03952"/>
     <w:multiLevelType w:val="hybridMultilevel"/>
     <w:tmpl w:val="0188F976"/>
@@ -18953,7 +20437,7 @@
       </w:pPr>
     </w:lvl>
   </w:abstractNum>
-  <w:abstractNum w:abstractNumId="8" w15:restartNumberingAfterBreak="0">
+  <w:abstractNum w:abstractNumId="9" w15:restartNumberingAfterBreak="0">
     <w:nsid w:val="2A7A53E1"/>
     <w:multiLevelType w:val="hybridMultilevel"/>
     <w:tmpl w:val="B12A0746"/>
@@ -19042,7 +20526,7 @@
       </w:pPr>
     </w:lvl>
   </w:abstractNum>
-  <w:abstractNum w:abstractNumId="9" w15:restartNumberingAfterBreak="0">
+  <w:abstractNum w:abstractNumId="10" w15:restartNumberingAfterBreak="0">
     <w:nsid w:val="2CFB6027"/>
     <w:multiLevelType w:val="hybridMultilevel"/>
     <w:tmpl w:val="3EDC006E"/>
@@ -19131,7 +20615,7 @@
       </w:pPr>
     </w:lvl>
   </w:abstractNum>
-  <w:abstractNum w:abstractNumId="10" w15:restartNumberingAfterBreak="0">
+  <w:abstractNum w:abstractNumId="11" w15:restartNumberingAfterBreak="0">
     <w:nsid w:val="2DE31381"/>
     <w:multiLevelType w:val="hybridMultilevel"/>
     <w:tmpl w:val="F148044C"/>
@@ -19217,7 +20701,7 @@
       </w:pPr>
     </w:lvl>
   </w:abstractNum>
-  <w:abstractNum w:abstractNumId="11" w15:restartNumberingAfterBreak="0">
+  <w:abstractNum w:abstractNumId="12" w15:restartNumberingAfterBreak="0">
     <w:nsid w:val="367D0644"/>
     <w:multiLevelType w:val="hybridMultilevel"/>
     <w:tmpl w:val="EB7EF2F2"/>
@@ -19306,7 +20790,7 @@
       </w:pPr>
     </w:lvl>
   </w:abstractNum>
-  <w:abstractNum w:abstractNumId="12" w15:restartNumberingAfterBreak="0">
+  <w:abstractNum w:abstractNumId="13" w15:restartNumberingAfterBreak="0">
     <w:nsid w:val="38C93393"/>
     <w:multiLevelType w:val="hybridMultilevel"/>
     <w:tmpl w:val="651A0B5C"/>
@@ -19405,7 +20889,7 @@
       </w:pPr>
     </w:lvl>
   </w:abstractNum>
-  <w:abstractNum w:abstractNumId="13" w15:restartNumberingAfterBreak="0">
+  <w:abstractNum w:abstractNumId="14" w15:restartNumberingAfterBreak="0">
     <w:nsid w:val="42C40896"/>
     <w:multiLevelType w:val="hybridMultilevel"/>
     <w:tmpl w:val="6D664C72"/>
@@ -19494,7 +20978,7 @@
       </w:pPr>
     </w:lvl>
   </w:abstractNum>
-  <w:abstractNum w:abstractNumId="14" w15:restartNumberingAfterBreak="0">
+  <w:abstractNum w:abstractNumId="15" w15:restartNumberingAfterBreak="0">
     <w:nsid w:val="43350838"/>
     <w:multiLevelType w:val="hybridMultilevel"/>
     <w:tmpl w:val="CB088636"/>
@@ -19583,7 +21067,7 @@
       </w:pPr>
     </w:lvl>
   </w:abstractNum>
-  <w:abstractNum w:abstractNumId="15" w15:restartNumberingAfterBreak="0">
+  <w:abstractNum w:abstractNumId="16" w15:restartNumberingAfterBreak="0">
     <w:nsid w:val="52D32840"/>
     <w:multiLevelType w:val="hybridMultilevel"/>
     <w:tmpl w:val="ACC825A0"/>
@@ -19672,7 +21156,7 @@
       </w:pPr>
     </w:lvl>
   </w:abstractNum>
-  <w:abstractNum w:abstractNumId="16" w15:restartNumberingAfterBreak="0">
+  <w:abstractNum w:abstractNumId="17" w15:restartNumberingAfterBreak="0">
     <w:nsid w:val="55916AD9"/>
     <w:multiLevelType w:val="hybridMultilevel"/>
     <w:tmpl w:val="F3D4A9FC"/>
@@ -19761,7 +21245,96 @@
       </w:pPr>
     </w:lvl>
   </w:abstractNum>
-  <w:abstractNum w:abstractNumId="17" w15:restartNumberingAfterBreak="0">
+  <w:abstractNum w:abstractNumId="18" w15:restartNumberingAfterBreak="0">
+    <w:nsid w:val="5EA82F71"/>
+    <w:multiLevelType w:val="hybridMultilevel"/>
+    <w:tmpl w:val="965E1C18"/>
+    <w:lvl w:ilvl="0" w:tplc="F8383200">
+      <w:start w:val="1"/>
+      <w:numFmt w:val="decimal"/>
+      <w:lvlText w:val="%1."/>
+      <w:lvlJc w:val="left"/>
+      <w:pPr>
+        <w:ind w:left="1080" w:hanging="360"/>
+      </w:pPr>
+      <w:rPr>
+        <w:rFonts w:hint="default"/>
+      </w:rPr>
+    </w:lvl>
+    <w:lvl w:ilvl="1" w:tplc="04210019" w:tentative="1">
+      <w:start w:val="1"/>
+      <w:numFmt w:val="lowerLetter"/>
+      <w:lvlText w:val="%2."/>
+      <w:lvlJc w:val="left"/>
+      <w:pPr>
+        <w:ind w:left="1800" w:hanging="360"/>
+      </w:pPr>
+    </w:lvl>
+    <w:lvl w:ilvl="2" w:tplc="0421001B" w:tentative="1">
+      <w:start w:val="1"/>
+      <w:numFmt w:val="lowerRoman"/>
+      <w:lvlText w:val="%3."/>
+      <w:lvlJc w:val="right"/>
+      <w:pPr>
+        <w:ind w:left="2520" w:hanging="180"/>
+      </w:pPr>
+    </w:lvl>
+    <w:lvl w:ilvl="3" w:tplc="0421000F" w:tentative="1">
+      <w:start w:val="1"/>
+      <w:numFmt w:val="decimal"/>
+      <w:lvlText w:val="%4."/>
+      <w:lvlJc w:val="left"/>
+      <w:pPr>
+        <w:ind w:left="3240" w:hanging="360"/>
+      </w:pPr>
+    </w:lvl>
+    <w:lvl w:ilvl="4" w:tplc="04210019">
+      <w:start w:val="1"/>
+      <w:numFmt w:val="lowerLetter"/>
+      <w:lvlText w:val="%5."/>
+      <w:lvlJc w:val="left"/>
+      <w:pPr>
+        <w:ind w:left="3960" w:hanging="360"/>
+      </w:pPr>
+    </w:lvl>
+    <w:lvl w:ilvl="5" w:tplc="0421001B" w:tentative="1">
+      <w:start w:val="1"/>
+      <w:numFmt w:val="lowerRoman"/>
+      <w:lvlText w:val="%6."/>
+      <w:lvlJc w:val="right"/>
+      <w:pPr>
+        <w:ind w:left="4680" w:hanging="180"/>
+      </w:pPr>
+    </w:lvl>
+    <w:lvl w:ilvl="6" w:tplc="0421000F" w:tentative="1">
+      <w:start w:val="1"/>
+      <w:numFmt w:val="decimal"/>
+      <w:lvlText w:val="%7."/>
+      <w:lvlJc w:val="left"/>
+      <w:pPr>
+        <w:ind w:left="5400" w:hanging="360"/>
+      </w:pPr>
+    </w:lvl>
+    <w:lvl w:ilvl="7" w:tplc="04210019" w:tentative="1">
+      <w:start w:val="1"/>
+      <w:numFmt w:val="lowerLetter"/>
+      <w:lvlText w:val="%8."/>
+      <w:lvlJc w:val="left"/>
+      <w:pPr>
+        <w:ind w:left="6120" w:hanging="360"/>
+      </w:pPr>
+    </w:lvl>
+    <w:lvl w:ilvl="8" w:tplc="0421001B" w:tentative="1">
+      <w:start w:val="1"/>
+      <w:numFmt w:val="lowerRoman"/>
+      <w:lvlText w:val="%9."/>
+      <w:lvlJc w:val="right"/>
+      <w:pPr>
+        <w:ind w:left="6840" w:hanging="180"/>
+      </w:pPr>
+    </w:lvl>
+  </w:abstractNum>
+  <w:abstractNum w:abstractNumId="19" w15:restartNumberingAfterBreak="0">
     <w:nsid w:val="5F8B1338"/>
     <w:multiLevelType w:val="hybridMultilevel"/>
     <w:tmpl w:val="BCEC38B2"/>
@@ -19850,7 +21423,96 @@
       </w:pPr>
     </w:lvl>
   </w:abstractNum>
-  <w:abstractNum w:abstractNumId="18" w15:restartNumberingAfterBreak="0">
+  <w:abstractNum w:abstractNumId="20" w15:restartNumberingAfterBreak="0">
+    <w:nsid w:val="62094C2E"/>
+    <w:multiLevelType w:val="hybridMultilevel"/>
+    <w:tmpl w:val="88244F64"/>
+    <w:lvl w:ilvl="0" w:tplc="F63E5056">
+      <w:start w:val="1"/>
+      <w:numFmt w:val="decimal"/>
+      <w:lvlText w:val="%1."/>
+      <w:lvlJc w:val="left"/>
+      <w:pPr>
+        <w:ind w:left="947" w:hanging="360"/>
+      </w:pPr>
+      <w:rPr>
+        <w:rFonts w:hint="default"/>
+      </w:rPr>
+    </w:lvl>
+    <w:lvl w:ilvl="1" w:tplc="04210019" w:tentative="1">
+      <w:start w:val="1"/>
+      <w:numFmt w:val="lowerLetter"/>
+      <w:lvlText w:val="%2."/>
+      <w:lvlJc w:val="left"/>
+      <w:pPr>
+        <w:ind w:left="1667" w:hanging="360"/>
+      </w:pPr>
+    </w:lvl>
+    <w:lvl w:ilvl="2" w:tplc="0421001B" w:tentative="1">
+      <w:start w:val="1"/>
+      <w:numFmt w:val="lowerRoman"/>
+      <w:lvlText w:val="%3."/>
+      <w:lvlJc w:val="right"/>
+      <w:pPr>
+        <w:ind w:left="2387" w:hanging="180"/>
+      </w:pPr>
+    </w:lvl>
+    <w:lvl w:ilvl="3" w:tplc="0421000F" w:tentative="1">
+      <w:start w:val="1"/>
+      <w:numFmt w:val="decimal"/>
+      <w:lvlText w:val="%4."/>
+      <w:lvlJc w:val="left"/>
+      <w:pPr>
+        <w:ind w:left="3107" w:hanging="360"/>
+      </w:pPr>
+    </w:lvl>
+    <w:lvl w:ilvl="4" w:tplc="04210019" w:tentative="1">
+      <w:start w:val="1"/>
+      <w:numFmt w:val="lowerLetter"/>
+      <w:lvlText w:val="%5."/>
+      <w:lvlJc w:val="left"/>
+      <w:pPr>
+        <w:ind w:left="3827" w:hanging="360"/>
+      </w:pPr>
+    </w:lvl>
+    <w:lvl w:ilvl="5" w:tplc="0421001B" w:tentative="1">
+      <w:start w:val="1"/>
+      <w:numFmt w:val="lowerRoman"/>
+      <w:lvlText w:val="%6."/>
+      <w:lvlJc w:val="right"/>
+      <w:pPr>
+        <w:ind w:left="4547" w:hanging="180"/>
+      </w:pPr>
+    </w:lvl>
+    <w:lvl w:ilvl="6" w:tplc="0421000F" w:tentative="1">
+      <w:start w:val="1"/>
+      <w:numFmt w:val="decimal"/>
+      <w:lvlText w:val="%7."/>
+      <w:lvlJc w:val="left"/>
+      <w:pPr>
+        <w:ind w:left="5267" w:hanging="360"/>
+      </w:pPr>
+    </w:lvl>
+    <w:lvl w:ilvl="7" w:tplc="04210019" w:tentative="1">
+      <w:start w:val="1"/>
+      <w:numFmt w:val="lowerLetter"/>
+      <w:lvlText w:val="%8."/>
+      <w:lvlJc w:val="left"/>
+      <w:pPr>
+        <w:ind w:left="5987" w:hanging="360"/>
+      </w:pPr>
+    </w:lvl>
+    <w:lvl w:ilvl="8" w:tplc="0421001B" w:tentative="1">
+      <w:start w:val="1"/>
+      <w:numFmt w:val="lowerRoman"/>
+      <w:lvlText w:val="%9."/>
+      <w:lvlJc w:val="right"/>
+      <w:pPr>
+        <w:ind w:left="6707" w:hanging="180"/>
+      </w:pPr>
+    </w:lvl>
+  </w:abstractNum>
+  <w:abstractNum w:abstractNumId="21" w15:restartNumberingAfterBreak="0">
     <w:nsid w:val="638C30D2"/>
     <w:multiLevelType w:val="hybridMultilevel"/>
     <w:tmpl w:val="2E980894"/>
@@ -19939,7 +21601,7 @@
       </w:pPr>
     </w:lvl>
   </w:abstractNum>
-  <w:abstractNum w:abstractNumId="19" w15:restartNumberingAfterBreak="0">
+  <w:abstractNum w:abstractNumId="22" w15:restartNumberingAfterBreak="0">
     <w:nsid w:val="678B1320"/>
     <w:multiLevelType w:val="hybridMultilevel"/>
     <w:tmpl w:val="27E61AAC"/>
@@ -20028,7 +21690,7 @@
       </w:pPr>
     </w:lvl>
   </w:abstractNum>
-  <w:abstractNum w:abstractNumId="20" w15:restartNumberingAfterBreak="0">
+  <w:abstractNum w:abstractNumId="23" w15:restartNumberingAfterBreak="0">
     <w:nsid w:val="6B805D93"/>
     <w:multiLevelType w:val="hybridMultilevel"/>
     <w:tmpl w:val="1F40294E"/>
@@ -20114,7 +21776,7 @@
       </w:pPr>
     </w:lvl>
   </w:abstractNum>
-  <w:abstractNum w:abstractNumId="21" w15:restartNumberingAfterBreak="0">
+  <w:abstractNum w:abstractNumId="24" w15:restartNumberingAfterBreak="0">
     <w:nsid w:val="71FF1E5C"/>
     <w:multiLevelType w:val="hybridMultilevel"/>
     <w:tmpl w:val="F04064A2"/>
@@ -20203,7 +21865,7 @@
       </w:pPr>
     </w:lvl>
   </w:abstractNum>
-  <w:abstractNum w:abstractNumId="22" w15:restartNumberingAfterBreak="0">
+  <w:abstractNum w:abstractNumId="25" w15:restartNumberingAfterBreak="0">
     <w:nsid w:val="729B74B9"/>
     <w:multiLevelType w:val="hybridMultilevel"/>
     <w:tmpl w:val="76842972"/>
@@ -20292,7 +21954,7 @@
       </w:pPr>
     </w:lvl>
   </w:abstractNum>
-  <w:abstractNum w:abstractNumId="23" w15:restartNumberingAfterBreak="0">
+  <w:abstractNum w:abstractNumId="26" w15:restartNumberingAfterBreak="0">
     <w:nsid w:val="752D099B"/>
     <w:multiLevelType w:val="hybridMultilevel"/>
     <w:tmpl w:val="79763336"/>
@@ -20378,7 +22040,7 @@
       </w:pPr>
     </w:lvl>
   </w:abstractNum>
-  <w:abstractNum w:abstractNumId="24" w15:restartNumberingAfterBreak="0">
+  <w:abstractNum w:abstractNumId="27" w15:restartNumberingAfterBreak="0">
     <w:nsid w:val="762D6D68"/>
     <w:multiLevelType w:val="hybridMultilevel"/>
     <w:tmpl w:val="BC94FD7A"/>
@@ -20468,7 +22130,7 @@
       </w:pPr>
     </w:lvl>
   </w:abstractNum>
-  <w:abstractNum w:abstractNumId="25" w15:restartNumberingAfterBreak="0">
+  <w:abstractNum w:abstractNumId="28" w15:restartNumberingAfterBreak="0">
     <w:nsid w:val="76BE26C6"/>
     <w:multiLevelType w:val="hybridMultilevel"/>
     <w:tmpl w:val="5A689A4E"/>
@@ -20555,118 +22217,127 @@
     </w:lvl>
   </w:abstractNum>
   <w:num w:numId="1" w16cid:durableId="117529985">
-    <w:abstractNumId w:val="3"/>
+    <w:abstractNumId w:val="4"/>
   </w:num>
   <w:num w:numId="2" w16cid:durableId="489054059">
-    <w:abstractNumId w:val="3"/>
+    <w:abstractNumId w:val="4"/>
     <w:lvlOverride w:ilvl="0">
       <w:startOverride w:val="1"/>
     </w:lvlOverride>
   </w:num>
   <w:num w:numId="3" w16cid:durableId="810833425">
-    <w:abstractNumId w:val="12"/>
+    <w:abstractNumId w:val="13"/>
   </w:num>
   <w:num w:numId="4" w16cid:durableId="1514610107">
-    <w:abstractNumId w:val="12"/>
+    <w:abstractNumId w:val="13"/>
     <w:lvlOverride w:ilvl="0">
       <w:startOverride w:val="1"/>
     </w:lvlOverride>
   </w:num>
   <w:num w:numId="5" w16cid:durableId="1509759572">
-    <w:abstractNumId w:val="12"/>
+    <w:abstractNumId w:val="13"/>
     <w:lvlOverride w:ilvl="0">
       <w:startOverride w:val="1"/>
     </w:lvlOverride>
   </w:num>
   <w:num w:numId="6" w16cid:durableId="484275023">
-    <w:abstractNumId w:val="3"/>
+    <w:abstractNumId w:val="4"/>
     <w:lvlOverride w:ilvl="0">
       <w:startOverride w:val="1"/>
     </w:lvlOverride>
   </w:num>
   <w:num w:numId="7" w16cid:durableId="1401058754">
-    <w:abstractNumId w:val="11"/>
+    <w:abstractNumId w:val="12"/>
   </w:num>
   <w:num w:numId="8" w16cid:durableId="987057199">
-    <w:abstractNumId w:val="21"/>
+    <w:abstractNumId w:val="24"/>
   </w:num>
   <w:num w:numId="9" w16cid:durableId="906959416">
-    <w:abstractNumId w:val="5"/>
+    <w:abstractNumId w:val="6"/>
   </w:num>
   <w:num w:numId="10" w16cid:durableId="751975993">
+    <w:abstractNumId w:val="25"/>
+  </w:num>
+  <w:num w:numId="11" w16cid:durableId="307712894">
     <w:abstractNumId w:val="22"/>
   </w:num>
-  <w:num w:numId="11" w16cid:durableId="307712894">
-    <w:abstractNumId w:val="19"/>
-  </w:num>
   <w:num w:numId="12" w16cid:durableId="1293831601">
-    <w:abstractNumId w:val="3"/>
+    <w:abstractNumId w:val="4"/>
     <w:lvlOverride w:ilvl="0">
       <w:startOverride w:val="1"/>
     </w:lvlOverride>
   </w:num>
   <w:num w:numId="13" w16cid:durableId="921720301">
-    <w:abstractNumId w:val="4"/>
+    <w:abstractNumId w:val="5"/>
   </w:num>
   <w:num w:numId="14" w16cid:durableId="205988421">
-    <w:abstractNumId w:val="14"/>
+    <w:abstractNumId w:val="15"/>
   </w:num>
   <w:num w:numId="15" w16cid:durableId="1498498755">
     <w:abstractNumId w:val="0"/>
   </w:num>
   <w:num w:numId="16" w16cid:durableId="1586956230">
-    <w:abstractNumId w:val="23"/>
+    <w:abstractNumId w:val="26"/>
   </w:num>
   <w:num w:numId="17" w16cid:durableId="1226524269">
-    <w:abstractNumId w:val="13"/>
+    <w:abstractNumId w:val="14"/>
   </w:num>
   <w:num w:numId="18" w16cid:durableId="1777671596">
-    <w:abstractNumId w:val="25"/>
+    <w:abstractNumId w:val="28"/>
   </w:num>
   <w:num w:numId="19" w16cid:durableId="935406345">
-    <w:abstractNumId w:val="10"/>
+    <w:abstractNumId w:val="11"/>
   </w:num>
   <w:num w:numId="20" w16cid:durableId="667025482">
-    <w:abstractNumId w:val="9"/>
+    <w:abstractNumId w:val="10"/>
   </w:num>
   <w:num w:numId="21" w16cid:durableId="1255556967">
     <w:abstractNumId w:val="2"/>
   </w:num>
   <w:num w:numId="22" w16cid:durableId="74867961">
-    <w:abstractNumId w:val="20"/>
+    <w:abstractNumId w:val="23"/>
   </w:num>
   <w:num w:numId="23" w16cid:durableId="315229427">
     <w:abstractNumId w:val="1"/>
   </w:num>
   <w:num w:numId="24" w16cid:durableId="1529874175">
-    <w:abstractNumId w:val="6"/>
+    <w:abstractNumId w:val="7"/>
   </w:num>
   <w:num w:numId="25" w16cid:durableId="576138740">
-    <w:abstractNumId w:val="18"/>
+    <w:abstractNumId w:val="21"/>
   </w:num>
   <w:num w:numId="26" w16cid:durableId="1678380739">
+    <w:abstractNumId w:val="17"/>
+  </w:num>
+  <w:num w:numId="27" w16cid:durableId="16319741">
     <w:abstractNumId w:val="16"/>
   </w:num>
-  <w:num w:numId="27" w16cid:durableId="16319741">
-    <w:abstractNumId w:val="15"/>
-  </w:num>
   <w:num w:numId="28" w16cid:durableId="2021394462">
-    <w:abstractNumId w:val="17"/>
+    <w:abstractNumId w:val="19"/>
   </w:num>
   <w:num w:numId="29" w16cid:durableId="1802923464">
+    <w:abstractNumId w:val="9"/>
+  </w:num>
+  <w:num w:numId="30" w16cid:durableId="1741712334">
     <w:abstractNumId w:val="8"/>
   </w:num>
-  <w:num w:numId="30" w16cid:durableId="1741712334">
-    <w:abstractNumId w:val="7"/>
-  </w:num>
   <w:num w:numId="31" w16cid:durableId="560485978">
-    <w:abstractNumId w:val="3"/>
+    <w:abstractNumId w:val="4"/>
     <w:lvlOverride w:ilvl="0">
       <w:startOverride w:val="1"/>
     </w:lvlOverride>
   </w:num>
   <w:num w:numId="32" w16cid:durableId="1323774007">
-    <w:abstractNumId w:val="24"/>
+    <w:abstractNumId w:val="27"/>
+  </w:num>
+  <w:num w:numId="33" w16cid:durableId="2040087682">
+    <w:abstractNumId w:val="3"/>
+  </w:num>
+  <w:num w:numId="34" w16cid:durableId="430514497">
+    <w:abstractNumId w:val="20"/>
+  </w:num>
+  <w:num w:numId="35" w16cid:durableId="1114205090">
+    <w:abstractNumId w:val="18"/>
   </w:num>
   <w:numIdMacAtCleanup w:val="29"/>
 </w:numbering>

</xml_diff>